<commit_message>
Update report commit reference
</commit_message>
<xml_diff>
--- a/report/231A010297_TranThiHaVy_DeTai20_TieuLuan_CuoiKy.docx
+++ b/report/231A010297_TranThiHaVy_DeTai20_TieuLuan_CuoiKy.docx
@@ -644,7 +644,7 @@
         </w:rPr>
       </w:pPr>
       <w:bookmarkStart w:id="0" w:name="_Toc235715864"/>
-      <w:bookmarkStart w:id="1" w:name="_Toc236067670"/>
+      <w:bookmarkStart w:id="1" w:name="_Toc236069936"/>
       <w:r>
         <w:rPr>
           <w:rFonts w:ascii="Times New Roman" w:hAnsi="Times New Roman" w:cs="Times New Roman"/>
@@ -653,43 +653,7 @@
           <w:szCs w:val="26"/>
         </w:rPr>
         <w:lastRenderedPageBreak/>
-        <w:t>THÔNG TIN VÀ CAM K</w:t>
-      </w:r>
-      <w:r>
-        <w:rPr>
-          <w:rFonts w:ascii="Times New Roman" w:hAnsi="Times New Roman" w:cs="Times New Roman"/>
-          <w:color w:val="000000" w:themeColor="text1"/>
-          <w:sz w:val="26"/>
-          <w:szCs w:val="26"/>
-        </w:rPr>
-        <w:t>Ế</w:t>
-      </w:r>
-      <w:r>
-        <w:rPr>
-          <w:rFonts w:ascii="Times New Roman" w:hAnsi="Times New Roman" w:cs="Times New Roman"/>
-          <w:color w:val="000000" w:themeColor="text1"/>
-          <w:sz w:val="26"/>
-          <w:szCs w:val="26"/>
-        </w:rPr>
-        <w:t>T N</w:t>
-      </w:r>
-      <w:r>
-        <w:rPr>
-          <w:rFonts w:ascii="Times New Roman" w:hAnsi="Times New Roman" w:cs="Times New Roman"/>
-          <w:color w:val="000000" w:themeColor="text1"/>
-          <w:sz w:val="26"/>
-          <w:szCs w:val="26"/>
-        </w:rPr>
-        <w:t>Ộ</w:t>
-      </w:r>
-      <w:r>
-        <w:rPr>
-          <w:rFonts w:ascii="Times New Roman" w:hAnsi="Times New Roman" w:cs="Times New Roman"/>
-          <w:color w:val="000000" w:themeColor="text1"/>
-          <w:sz w:val="26"/>
-          <w:szCs w:val="26"/>
-        </w:rPr>
-        <w:t>P BÀI</w:t>
+        <w:t>THÔNG TIN VÀ CAM KẾT NỘP BÀI</w:t>
       </w:r>
       <w:bookmarkEnd w:id="0"/>
       <w:bookmarkEnd w:id="1"/>
@@ -1179,55 +1143,13 @@
         </w:rPr>
       </w:pPr>
       <w:bookmarkStart w:id="2" w:name="_Toc235715865"/>
-      <w:bookmarkStart w:id="3" w:name="_Toc236067671"/>
+      <w:bookmarkStart w:id="3" w:name="_Toc236069937"/>
       <w:r>
         <w:rPr>
           <w:rFonts w:ascii="Times New Roman" w:hAnsi="Times New Roman" w:cs="Times New Roman"/>
           <w:color w:val="000000" w:themeColor="text1"/>
         </w:rPr>
-        <w:t>Cam k</w:t>
-      </w:r>
-      <w:r>
-        <w:rPr>
-          <w:rFonts w:ascii="Times New Roman" w:hAnsi="Times New Roman" w:cs="Times New Roman"/>
-          <w:color w:val="000000" w:themeColor="text1"/>
-        </w:rPr>
-        <w:t>ế</w:t>
-      </w:r>
-      <w:r>
-        <w:rPr>
-          <w:rFonts w:ascii="Times New Roman" w:hAnsi="Times New Roman" w:cs="Times New Roman"/>
-          <w:color w:val="000000" w:themeColor="text1"/>
-        </w:rPr>
-        <w:t>t an toàn và h</w:t>
-      </w:r>
-      <w:r>
-        <w:rPr>
-          <w:rFonts w:ascii="Times New Roman" w:hAnsi="Times New Roman" w:cs="Times New Roman"/>
-          <w:color w:val="000000" w:themeColor="text1"/>
-        </w:rPr>
-        <w:t>ọ</w:t>
-      </w:r>
-      <w:r>
-        <w:rPr>
-          <w:rFonts w:ascii="Times New Roman" w:hAnsi="Times New Roman" w:cs="Times New Roman"/>
-          <w:color w:val="000000" w:themeColor="text1"/>
-        </w:rPr>
-        <w:t>c thu</w:t>
-      </w:r>
-      <w:r>
-        <w:rPr>
-          <w:rFonts w:ascii="Times New Roman" w:hAnsi="Times New Roman" w:cs="Times New Roman"/>
-          <w:color w:val="000000" w:themeColor="text1"/>
-        </w:rPr>
-        <w:t>ậ</w:t>
-      </w:r>
-      <w:r>
-        <w:rPr>
-          <w:rFonts w:ascii="Times New Roman" w:hAnsi="Times New Roman" w:cs="Times New Roman"/>
-          <w:color w:val="000000" w:themeColor="text1"/>
-        </w:rPr>
-        <w:t>t</w:t>
+        <w:t>Cam kết an toàn và học thuật</w:t>
       </w:r>
       <w:bookmarkEnd w:id="2"/>
       <w:bookmarkEnd w:id="3"/>
@@ -1441,7 +1363,7 @@
           <w:szCs w:val="26"/>
         </w:rPr>
       </w:pPr>
-      <w:bookmarkStart w:id="4" w:name="_Toc236067672"/>
+      <w:bookmarkStart w:id="4" w:name="_Toc236069938"/>
       <w:r>
         <w:rPr>
           <w:rFonts w:ascii="Times New Roman" w:hAnsi="Times New Roman" w:cs="Times New Roman"/>
@@ -1450,43 +1372,7 @@
           <w:szCs w:val="26"/>
         </w:rPr>
         <w:lastRenderedPageBreak/>
-        <w:t>M</w:t>
-      </w:r>
-      <w:r>
-        <w:rPr>
-          <w:rFonts w:ascii="Times New Roman" w:hAnsi="Times New Roman" w:cs="Times New Roman"/>
-          <w:color w:val="000000" w:themeColor="text1"/>
-          <w:sz w:val="26"/>
-          <w:szCs w:val="26"/>
-        </w:rPr>
-        <w:t>Ụ</w:t>
-      </w:r>
-      <w:r>
-        <w:rPr>
-          <w:rFonts w:ascii="Times New Roman" w:hAnsi="Times New Roman" w:cs="Times New Roman"/>
-          <w:color w:val="000000" w:themeColor="text1"/>
-          <w:sz w:val="26"/>
-          <w:szCs w:val="26"/>
-        </w:rPr>
-        <w:t>C L</w:t>
-      </w:r>
-      <w:r>
-        <w:rPr>
-          <w:rFonts w:ascii="Times New Roman" w:hAnsi="Times New Roman" w:cs="Times New Roman"/>
-          <w:color w:val="000000" w:themeColor="text1"/>
-          <w:sz w:val="26"/>
-          <w:szCs w:val="26"/>
-        </w:rPr>
-        <w:t>Ụ</w:t>
-      </w:r>
-      <w:r>
-        <w:rPr>
-          <w:rFonts w:ascii="Times New Roman" w:hAnsi="Times New Roman" w:cs="Times New Roman"/>
-          <w:color w:val="000000" w:themeColor="text1"/>
-          <w:sz w:val="26"/>
-          <w:szCs w:val="26"/>
-        </w:rPr>
-        <w:t>C</w:t>
+        <w:t>MỤC LỤC</w:t>
       </w:r>
       <w:bookmarkEnd w:id="4"/>
     </w:p>
@@ -1534,7 +1420,7 @@
         </w:rPr>
         <w:fldChar w:fldCharType="separate"/>
       </w:r>
-      <w:hyperlink w:anchor="_Toc236067670" w:history="1">
+      <w:hyperlink w:anchor="_Toc236069936" w:history="1">
         <w:r>
           <w:rPr>
             <w:rStyle w:val="Siuktni"/>
@@ -1562,7 +1448,7 @@
             <w:noProof/>
             <w:webHidden/>
           </w:rPr>
-          <w:instrText xml:space="preserve"> PAGEREF _Toc236067670 \h </w:instrText>
+          <w:instrText xml:space="preserve"> PAGEREF _Toc236069936 \h </w:instrText>
         </w:r>
         <w:r>
           <w:rPr>
@@ -1610,7 +1496,7 @@
           <w14:ligatures w14:val="standardContextual"/>
         </w:rPr>
       </w:pPr>
-      <w:hyperlink w:anchor="_Toc236067671" w:history="1">
+      <w:hyperlink w:anchor="_Toc236069937" w:history="1">
         <w:r>
           <w:rPr>
             <w:rStyle w:val="Siuktni"/>
@@ -1638,7 +1524,7 @@
             <w:noProof/>
             <w:webHidden/>
           </w:rPr>
-          <w:instrText xml:space="preserve"> PAGEREF _Toc236067671 \h </w:instrText>
+          <w:instrText xml:space="preserve"> PAGEREF _Toc236069937 \h </w:instrText>
         </w:r>
         <w:r>
           <w:rPr>
@@ -1686,7 +1572,7 @@
           <w14:ligatures w14:val="standardContextual"/>
         </w:rPr>
       </w:pPr>
-      <w:hyperlink w:anchor="_Toc236067672" w:history="1">
+      <w:hyperlink w:anchor="_Toc236069938" w:history="1">
         <w:r>
           <w:rPr>
             <w:rStyle w:val="Siuktni"/>
@@ -1714,7 +1600,7 @@
             <w:noProof/>
             <w:webHidden/>
           </w:rPr>
-          <w:instrText xml:space="preserve"> PAGEREF _Toc236067672 \h </w:instrText>
+          <w:instrText xml:space="preserve"> PAGEREF _Toc236069938 \h </w:instrText>
         </w:r>
         <w:r>
           <w:rPr>
@@ -1762,7 +1648,7 @@
           <w14:ligatures w14:val="standardContextual"/>
         </w:rPr>
       </w:pPr>
-      <w:hyperlink w:anchor="_Toc236067673" w:history="1">
+      <w:hyperlink w:anchor="_Toc236069939" w:history="1">
         <w:r>
           <w:rPr>
             <w:rStyle w:val="Siuktni"/>
@@ -1790,7 +1676,7 @@
             <w:noProof/>
             <w:webHidden/>
           </w:rPr>
-          <w:instrText xml:space="preserve"> PAGEREF _Toc236067673 \h </w:instrText>
+          <w:instrText xml:space="preserve"> PAGEREF _Toc236069939 \h </w:instrText>
         </w:r>
         <w:r>
           <w:rPr>
@@ -1838,7 +1724,7 @@
           <w14:ligatures w14:val="standardContextual"/>
         </w:rPr>
       </w:pPr>
-      <w:hyperlink w:anchor="_Toc236067674" w:history="1">
+      <w:hyperlink w:anchor="_Toc236069940" w:history="1">
         <w:r>
           <w:rPr>
             <w:rStyle w:val="Siuktni"/>
@@ -1866,7 +1752,7 @@
             <w:noProof/>
             <w:webHidden/>
           </w:rPr>
-          <w:instrText xml:space="preserve"> PAGEREF _Toc236067674 \h </w:instrText>
+          <w:instrText xml:space="preserve"> PAGEREF _Toc236069940 \h </w:instrText>
         </w:r>
         <w:r>
           <w:rPr>
@@ -1914,7 +1800,7 @@
           <w14:ligatures w14:val="standardContextual"/>
         </w:rPr>
       </w:pPr>
-      <w:hyperlink w:anchor="_Toc236067675" w:history="1">
+      <w:hyperlink w:anchor="_Toc236069941" w:history="1">
         <w:r>
           <w:rPr>
             <w:rStyle w:val="Siuktni"/>
@@ -1942,7 +1828,7 @@
             <w:noProof/>
             <w:webHidden/>
           </w:rPr>
-          <w:instrText xml:space="preserve"> PAGEREF _Toc236067675 \h </w:instrText>
+          <w:instrText xml:space="preserve"> PAGEREF _Toc236069941 \h </w:instrText>
         </w:r>
         <w:r>
           <w:rPr>
@@ -1990,7 +1876,7 @@
           <w14:ligatures w14:val="standardContextual"/>
         </w:rPr>
       </w:pPr>
-      <w:hyperlink w:anchor="_Toc236067676" w:history="1">
+      <w:hyperlink w:anchor="_Toc236069942" w:history="1">
         <w:r>
           <w:rPr>
             <w:rStyle w:val="Siuktni"/>
@@ -2018,7 +1904,7 @@
             <w:noProof/>
             <w:webHidden/>
           </w:rPr>
-          <w:instrText xml:space="preserve"> PAGEREF _Toc236067676 \h </w:instrText>
+          <w:instrText xml:space="preserve"> PAGEREF _Toc236069942 \h </w:instrText>
         </w:r>
         <w:r>
           <w:rPr>
@@ -2066,7 +1952,7 @@
           <w14:ligatures w14:val="standardContextual"/>
         </w:rPr>
       </w:pPr>
-      <w:hyperlink w:anchor="_Toc236067677" w:history="1">
+      <w:hyperlink w:anchor="_Toc236069943" w:history="1">
         <w:r>
           <w:rPr>
             <w:rStyle w:val="Siuktni"/>
@@ -2094,7 +1980,7 @@
             <w:noProof/>
             <w:webHidden/>
           </w:rPr>
-          <w:instrText xml:space="preserve"> PAGEREF _Toc236067677 \h </w:instrText>
+          <w:instrText xml:space="preserve"> PAGEREF _Toc236069943 \h </w:instrText>
         </w:r>
         <w:r>
           <w:rPr>
@@ -2142,7 +2028,7 @@
           <w14:ligatures w14:val="standardContextual"/>
         </w:rPr>
       </w:pPr>
-      <w:hyperlink w:anchor="_Toc236067678" w:history="1">
+      <w:hyperlink w:anchor="_Toc236069944" w:history="1">
         <w:r>
           <w:rPr>
             <w:rStyle w:val="Siuktni"/>
@@ -2170,7 +2056,7 @@
             <w:noProof/>
             <w:webHidden/>
           </w:rPr>
-          <w:instrText xml:space="preserve"> PAGEREF _Toc236067678 \h </w:instrText>
+          <w:instrText xml:space="preserve"> PAGEREF _Toc236069944 \h </w:instrText>
         </w:r>
         <w:r>
           <w:rPr>
@@ -2218,7 +2104,7 @@
           <w14:ligatures w14:val="standardContextual"/>
         </w:rPr>
       </w:pPr>
-      <w:hyperlink w:anchor="_Toc236067679" w:history="1">
+      <w:hyperlink w:anchor="_Toc236069945" w:history="1">
         <w:r>
           <w:rPr>
             <w:rStyle w:val="Siuktni"/>
@@ -2246,7 +2132,7 @@
             <w:noProof/>
             <w:webHidden/>
           </w:rPr>
-          <w:instrText xml:space="preserve"> PAGEREF _Toc236067679 \h </w:instrText>
+          <w:instrText xml:space="preserve"> PAGEREF _Toc236069945 \h </w:instrText>
         </w:r>
         <w:r>
           <w:rPr>
@@ -2294,7 +2180,7 @@
           <w14:ligatures w14:val="standardContextual"/>
         </w:rPr>
       </w:pPr>
-      <w:hyperlink w:anchor="_Toc236067680" w:history="1">
+      <w:hyperlink w:anchor="_Toc236069946" w:history="1">
         <w:r>
           <w:rPr>
             <w:rStyle w:val="Siuktni"/>
@@ -2322,7 +2208,7 @@
             <w:noProof/>
             <w:webHidden/>
           </w:rPr>
-          <w:instrText xml:space="preserve"> PAGEREF _Toc236067680 \h </w:instrText>
+          <w:instrText xml:space="preserve"> PAGEREF _Toc236069946 \h </w:instrText>
         </w:r>
         <w:r>
           <w:rPr>
@@ -2370,7 +2256,7 @@
           <w14:ligatures w14:val="standardContextual"/>
         </w:rPr>
       </w:pPr>
-      <w:hyperlink w:anchor="_Toc236067681" w:history="1">
+      <w:hyperlink w:anchor="_Toc236069947" w:history="1">
         <w:r>
           <w:rPr>
             <w:rStyle w:val="Siuktni"/>
@@ -2398,7 +2284,7 @@
             <w:noProof/>
             <w:webHidden/>
           </w:rPr>
-          <w:instrText xml:space="preserve"> PAGEREF _Toc236067681 \h </w:instrText>
+          <w:instrText xml:space="preserve"> PAGEREF _Toc236069947 \h </w:instrText>
         </w:r>
         <w:r>
           <w:rPr>
@@ -2446,7 +2332,7 @@
           <w14:ligatures w14:val="standardContextual"/>
         </w:rPr>
       </w:pPr>
-      <w:hyperlink w:anchor="_Toc236067682" w:history="1">
+      <w:hyperlink w:anchor="_Toc236069948" w:history="1">
         <w:r>
           <w:rPr>
             <w:rStyle w:val="Siuktni"/>
@@ -2474,7 +2360,7 @@
             <w:noProof/>
             <w:webHidden/>
           </w:rPr>
-          <w:instrText xml:space="preserve"> PAGEREF _Toc236067682 \h </w:instrText>
+          <w:instrText xml:space="preserve"> PAGEREF _Toc236069948 \h </w:instrText>
         </w:r>
         <w:r>
           <w:rPr>
@@ -2522,7 +2408,7 @@
           <w14:ligatures w14:val="standardContextual"/>
         </w:rPr>
       </w:pPr>
-      <w:hyperlink w:anchor="_Toc236067683" w:history="1">
+      <w:hyperlink w:anchor="_Toc236069949" w:history="1">
         <w:r>
           <w:rPr>
             <w:rStyle w:val="Siuktni"/>
@@ -2550,7 +2436,7 @@
             <w:noProof/>
             <w:webHidden/>
           </w:rPr>
-          <w:instrText xml:space="preserve"> PAGEREF _Toc236067683 \h </w:instrText>
+          <w:instrText xml:space="preserve"> PAGEREF _Toc236069949 \h </w:instrText>
         </w:r>
         <w:r>
           <w:rPr>
@@ -2598,7 +2484,7 @@
           <w14:ligatures w14:val="standardContextual"/>
         </w:rPr>
       </w:pPr>
-      <w:hyperlink w:anchor="_Toc236067684" w:history="1">
+      <w:hyperlink w:anchor="_Toc236069950" w:history="1">
         <w:r>
           <w:rPr>
             <w:rStyle w:val="Siuktni"/>
@@ -2626,7 +2512,7 @@
             <w:noProof/>
             <w:webHidden/>
           </w:rPr>
-          <w:instrText xml:space="preserve"> PAGEREF _Toc236067684 \h </w:instrText>
+          <w:instrText xml:space="preserve"> PAGEREF _Toc236069950 \h </w:instrText>
         </w:r>
         <w:r>
           <w:rPr>
@@ -2674,7 +2560,7 @@
           <w14:ligatures w14:val="standardContextual"/>
         </w:rPr>
       </w:pPr>
-      <w:hyperlink w:anchor="_Toc236067685" w:history="1">
+      <w:hyperlink w:anchor="_Toc236069951" w:history="1">
         <w:r>
           <w:rPr>
             <w:rStyle w:val="Siuktni"/>
@@ -2702,7 +2588,7 @@
             <w:noProof/>
             <w:webHidden/>
           </w:rPr>
-          <w:instrText xml:space="preserve"> PAGEREF _Toc236067685 \h </w:instrText>
+          <w:instrText xml:space="preserve"> PAGEREF _Toc236069951 \h </w:instrText>
         </w:r>
         <w:r>
           <w:rPr>
@@ -2750,7 +2636,7 @@
           <w14:ligatures w14:val="standardContextual"/>
         </w:rPr>
       </w:pPr>
-      <w:hyperlink w:anchor="_Toc236067686" w:history="1">
+      <w:hyperlink w:anchor="_Toc236069952" w:history="1">
         <w:r>
           <w:rPr>
             <w:rStyle w:val="Siuktni"/>
@@ -2778,7 +2664,7 @@
             <w:noProof/>
             <w:webHidden/>
           </w:rPr>
-          <w:instrText xml:space="preserve"> PAGEREF _Toc236067686 \h </w:instrText>
+          <w:instrText xml:space="preserve"> PAGEREF _Toc236069952 \h </w:instrText>
         </w:r>
         <w:r>
           <w:rPr>
@@ -2826,7 +2712,7 @@
           <w14:ligatures w14:val="standardContextual"/>
         </w:rPr>
       </w:pPr>
-      <w:hyperlink w:anchor="_Toc236067687" w:history="1">
+      <w:hyperlink w:anchor="_Toc236069953" w:history="1">
         <w:r>
           <w:rPr>
             <w:rStyle w:val="Siuktni"/>
@@ -2854,7 +2740,7 @@
             <w:noProof/>
             <w:webHidden/>
           </w:rPr>
-          <w:instrText xml:space="preserve"> PAGEREF _Toc236067687 \h </w:instrText>
+          <w:instrText xml:space="preserve"> PAGEREF _Toc236069953 \h </w:instrText>
         </w:r>
         <w:r>
           <w:rPr>
@@ -2902,7 +2788,7 @@
           <w14:ligatures w14:val="standardContextual"/>
         </w:rPr>
       </w:pPr>
-      <w:hyperlink w:anchor="_Toc236067688" w:history="1">
+      <w:hyperlink w:anchor="_Toc236069954" w:history="1">
         <w:r>
           <w:rPr>
             <w:rStyle w:val="Siuktni"/>
@@ -2930,7 +2816,7 @@
             <w:noProof/>
             <w:webHidden/>
           </w:rPr>
-          <w:instrText xml:space="preserve"> PAGEREF _Toc236067688 \h </w:instrText>
+          <w:instrText xml:space="preserve"> PAGEREF _Toc236069954 \h </w:instrText>
         </w:r>
         <w:r>
           <w:rPr>
@@ -2978,7 +2864,7 @@
           <w14:ligatures w14:val="standardContextual"/>
         </w:rPr>
       </w:pPr>
-      <w:hyperlink w:anchor="_Toc236067689" w:history="1">
+      <w:hyperlink w:anchor="_Toc236069955" w:history="1">
         <w:r>
           <w:rPr>
             <w:rStyle w:val="Siuktni"/>
@@ -3006,7 +2892,7 @@
             <w:noProof/>
             <w:webHidden/>
           </w:rPr>
-          <w:instrText xml:space="preserve"> PAGEREF _Toc236067689 \h </w:instrText>
+          <w:instrText xml:space="preserve"> PAGEREF _Toc236069955 \h </w:instrText>
         </w:r>
         <w:r>
           <w:rPr>
@@ -3054,7 +2940,7 @@
           <w14:ligatures w14:val="standardContextual"/>
         </w:rPr>
       </w:pPr>
-      <w:hyperlink w:anchor="_Toc236067690" w:history="1">
+      <w:hyperlink w:anchor="_Toc236069956" w:history="1">
         <w:r>
           <w:rPr>
             <w:rStyle w:val="Siuktni"/>
@@ -3082,7 +2968,7 @@
             <w:noProof/>
             <w:webHidden/>
           </w:rPr>
-          <w:instrText xml:space="preserve"> PAGEREF _Toc236067690 \h </w:instrText>
+          <w:instrText xml:space="preserve"> PAGEREF _Toc236069956 \h </w:instrText>
         </w:r>
         <w:r>
           <w:rPr>
@@ -3130,7 +3016,7 @@
           <w14:ligatures w14:val="standardContextual"/>
         </w:rPr>
       </w:pPr>
-      <w:hyperlink w:anchor="_Toc236067691" w:history="1">
+      <w:hyperlink w:anchor="_Toc236069957" w:history="1">
         <w:r>
           <w:rPr>
             <w:rStyle w:val="Siuktni"/>
@@ -3158,7 +3044,7 @@
             <w:noProof/>
             <w:webHidden/>
           </w:rPr>
-          <w:instrText xml:space="preserve"> PAGEREF _Toc236067691 \h </w:instrText>
+          <w:instrText xml:space="preserve"> PAGEREF _Toc236069957 \h </w:instrText>
         </w:r>
         <w:r>
           <w:rPr>
@@ -3206,7 +3092,7 @@
           <w14:ligatures w14:val="standardContextual"/>
         </w:rPr>
       </w:pPr>
-      <w:hyperlink w:anchor="_Toc236067692" w:history="1">
+      <w:hyperlink w:anchor="_Toc236069958" w:history="1">
         <w:r>
           <w:rPr>
             <w:rStyle w:val="Siuktni"/>
@@ -3234,7 +3120,7 @@
             <w:noProof/>
             <w:webHidden/>
           </w:rPr>
-          <w:instrText xml:space="preserve"> PAGEREF _Toc236067692 \h </w:instrText>
+          <w:instrText xml:space="preserve"> PAGEREF _Toc236069958 \h </w:instrText>
         </w:r>
         <w:r>
           <w:rPr>
@@ -3282,7 +3168,7 @@
           <w14:ligatures w14:val="standardContextual"/>
         </w:rPr>
       </w:pPr>
-      <w:hyperlink w:anchor="_Toc236067693" w:history="1">
+      <w:hyperlink w:anchor="_Toc236069959" w:history="1">
         <w:r>
           <w:rPr>
             <w:rStyle w:val="Siuktni"/>
@@ -3310,7 +3196,7 @@
             <w:noProof/>
             <w:webHidden/>
           </w:rPr>
-          <w:instrText xml:space="preserve"> PAGEREF _Toc236067693 \h </w:instrText>
+          <w:instrText xml:space="preserve"> PAGEREF _Toc236069959 \h </w:instrText>
         </w:r>
         <w:r>
           <w:rPr>
@@ -3358,7 +3244,7 @@
           <w14:ligatures w14:val="standardContextual"/>
         </w:rPr>
       </w:pPr>
-      <w:hyperlink w:anchor="_Toc236067694" w:history="1">
+      <w:hyperlink w:anchor="_Toc236069960" w:history="1">
         <w:r>
           <w:rPr>
             <w:rStyle w:val="Siuktni"/>
@@ -3386,7 +3272,7 @@
             <w:noProof/>
             <w:webHidden/>
           </w:rPr>
-          <w:instrText xml:space="preserve"> PAGEREF _Toc236067694 \h </w:instrText>
+          <w:instrText xml:space="preserve"> PAGEREF _Toc236069960 \h </w:instrText>
         </w:r>
         <w:r>
           <w:rPr>
@@ -3434,7 +3320,7 @@
           <w14:ligatures w14:val="standardContextual"/>
         </w:rPr>
       </w:pPr>
-      <w:hyperlink w:anchor="_Toc236067695" w:history="1">
+      <w:hyperlink w:anchor="_Toc236069961" w:history="1">
         <w:r>
           <w:rPr>
             <w:rStyle w:val="Siuktni"/>
@@ -3462,7 +3348,7 @@
             <w:noProof/>
             <w:webHidden/>
           </w:rPr>
-          <w:instrText xml:space="preserve"> PAGEREF _Toc236067695 \h </w:instrText>
+          <w:instrText xml:space="preserve"> PAGEREF _Toc236069961 \h </w:instrText>
         </w:r>
         <w:r>
           <w:rPr>
@@ -3510,7 +3396,7 @@
           <w14:ligatures w14:val="standardContextual"/>
         </w:rPr>
       </w:pPr>
-      <w:hyperlink w:anchor="_Toc236067696" w:history="1">
+      <w:hyperlink w:anchor="_Toc236069962" w:history="1">
         <w:r>
           <w:rPr>
             <w:rStyle w:val="Siuktni"/>
@@ -3538,7 +3424,7 @@
             <w:noProof/>
             <w:webHidden/>
           </w:rPr>
-          <w:instrText xml:space="preserve"> PAGEREF _Toc236067696 \h </w:instrText>
+          <w:instrText xml:space="preserve"> PAGEREF _Toc236069962 \h </w:instrText>
         </w:r>
         <w:r>
           <w:rPr>
@@ -3586,7 +3472,7 @@
           <w14:ligatures w14:val="standardContextual"/>
         </w:rPr>
       </w:pPr>
-      <w:hyperlink w:anchor="_Toc236067697" w:history="1">
+      <w:hyperlink w:anchor="_Toc236069963" w:history="1">
         <w:r>
           <w:rPr>
             <w:rStyle w:val="Siuktni"/>
@@ -3614,7 +3500,7 @@
             <w:noProof/>
             <w:webHidden/>
           </w:rPr>
-          <w:instrText xml:space="preserve"> PAGEREF _Toc236067697 \h </w:instrText>
+          <w:instrText xml:space="preserve"> PAGEREF _Toc236069963 \h </w:instrText>
         </w:r>
         <w:r>
           <w:rPr>
@@ -3662,7 +3548,7 @@
           <w14:ligatures w14:val="standardContextual"/>
         </w:rPr>
       </w:pPr>
-      <w:hyperlink w:anchor="_Toc236067698" w:history="1">
+      <w:hyperlink w:anchor="_Toc236069964" w:history="1">
         <w:r>
           <w:rPr>
             <w:rStyle w:val="Siuktni"/>
@@ -3690,7 +3576,7 @@
             <w:noProof/>
             <w:webHidden/>
           </w:rPr>
-          <w:instrText xml:space="preserve"> PAGEREF _Toc236067698 \h </w:instrText>
+          <w:instrText xml:space="preserve"> PAGEREF _Toc236069964 \h </w:instrText>
         </w:r>
         <w:r>
           <w:rPr>
@@ -3738,7 +3624,7 @@
           <w14:ligatures w14:val="standardContextual"/>
         </w:rPr>
       </w:pPr>
-      <w:hyperlink w:anchor="_Toc236067699" w:history="1">
+      <w:hyperlink w:anchor="_Toc236069965" w:history="1">
         <w:r>
           <w:rPr>
             <w:rStyle w:val="Siuktni"/>
@@ -3766,7 +3652,7 @@
             <w:noProof/>
             <w:webHidden/>
           </w:rPr>
-          <w:instrText xml:space="preserve"> PAGEREF _Toc236067699 \h </w:instrText>
+          <w:instrText xml:space="preserve"> PAGEREF _Toc236069965 \h </w:instrText>
         </w:r>
         <w:r>
           <w:rPr>
@@ -3814,7 +3700,7 @@
           <w14:ligatures w14:val="standardContextual"/>
         </w:rPr>
       </w:pPr>
-      <w:hyperlink w:anchor="_Toc236067700" w:history="1">
+      <w:hyperlink w:anchor="_Toc236069966" w:history="1">
         <w:r>
           <w:rPr>
             <w:rStyle w:val="Siuktni"/>
@@ -3842,7 +3728,7 @@
             <w:noProof/>
             <w:webHidden/>
           </w:rPr>
-          <w:instrText xml:space="preserve"> PAGEREF _Toc236067700 \h </w:instrText>
+          <w:instrText xml:space="preserve"> PAGEREF _Toc236069966 \h </w:instrText>
         </w:r>
         <w:r>
           <w:rPr>
@@ -3890,7 +3776,7 @@
           <w14:ligatures w14:val="standardContextual"/>
         </w:rPr>
       </w:pPr>
-      <w:hyperlink w:anchor="_Toc236067701" w:history="1">
+      <w:hyperlink w:anchor="_Toc236069967" w:history="1">
         <w:r>
           <w:rPr>
             <w:rStyle w:val="Siuktni"/>
@@ -3918,7 +3804,7 @@
             <w:noProof/>
             <w:webHidden/>
           </w:rPr>
-          <w:instrText xml:space="preserve"> PAGEREF _Toc236067701 \h </w:instrText>
+          <w:instrText xml:space="preserve"> PAGEREF _Toc236069967 \h </w:instrText>
         </w:r>
         <w:r>
           <w:rPr>
@@ -3966,7 +3852,7 @@
           <w14:ligatures w14:val="standardContextual"/>
         </w:rPr>
       </w:pPr>
-      <w:hyperlink w:anchor="_Toc236067702" w:history="1">
+      <w:hyperlink w:anchor="_Toc236069968" w:history="1">
         <w:r>
           <w:rPr>
             <w:rStyle w:val="Siuktni"/>
@@ -3994,7 +3880,7 @@
             <w:noProof/>
             <w:webHidden/>
           </w:rPr>
-          <w:instrText xml:space="preserve"> PAGEREF _Toc236067702 \h </w:instrText>
+          <w:instrText xml:space="preserve"> PAGEREF _Toc236069968 \h </w:instrText>
         </w:r>
         <w:r>
           <w:rPr>
@@ -4042,7 +3928,7 @@
           <w14:ligatures w14:val="standardContextual"/>
         </w:rPr>
       </w:pPr>
-      <w:hyperlink w:anchor="_Toc236067703" w:history="1">
+      <w:hyperlink w:anchor="_Toc236069969" w:history="1">
         <w:r>
           <w:rPr>
             <w:rStyle w:val="Siuktni"/>
@@ -4070,7 +3956,7 @@
             <w:noProof/>
             <w:webHidden/>
           </w:rPr>
-          <w:instrText xml:space="preserve"> PAGEREF _Toc236067703 \h </w:instrText>
+          <w:instrText xml:space="preserve"> PAGEREF _Toc236069969 \h </w:instrText>
         </w:r>
         <w:r>
           <w:rPr>
@@ -4118,7 +4004,7 @@
           <w14:ligatures w14:val="standardContextual"/>
         </w:rPr>
       </w:pPr>
-      <w:hyperlink w:anchor="_Toc236067704" w:history="1">
+      <w:hyperlink w:anchor="_Toc236069970" w:history="1">
         <w:r>
           <w:rPr>
             <w:rStyle w:val="Siuktni"/>
@@ -4146,7 +4032,7 @@
             <w:noProof/>
             <w:webHidden/>
           </w:rPr>
-          <w:instrText xml:space="preserve"> PAGEREF _Toc236067704 \h </w:instrText>
+          <w:instrText xml:space="preserve"> PAGEREF _Toc236069970 \h </w:instrText>
         </w:r>
         <w:r>
           <w:rPr>
@@ -4194,7 +4080,7 @@
           <w14:ligatures w14:val="standardContextual"/>
         </w:rPr>
       </w:pPr>
-      <w:hyperlink w:anchor="_Toc236067705" w:history="1">
+      <w:hyperlink w:anchor="_Toc236069971" w:history="1">
         <w:r>
           <w:rPr>
             <w:rStyle w:val="Siuktni"/>
@@ -4222,7 +4108,7 @@
             <w:noProof/>
             <w:webHidden/>
           </w:rPr>
-          <w:instrText xml:space="preserve"> PAGEREF _Toc236067705 \h </w:instrText>
+          <w:instrText xml:space="preserve"> PAGEREF _Toc236069971 \h </w:instrText>
         </w:r>
         <w:r>
           <w:rPr>
@@ -4270,7 +4156,7 @@
           <w14:ligatures w14:val="standardContextual"/>
         </w:rPr>
       </w:pPr>
-      <w:hyperlink w:anchor="_Toc236067706" w:history="1">
+      <w:hyperlink w:anchor="_Toc236069972" w:history="1">
         <w:r>
           <w:rPr>
             <w:rStyle w:val="Siuktni"/>
@@ -4298,7 +4184,7 @@
             <w:noProof/>
             <w:webHidden/>
           </w:rPr>
-          <w:instrText xml:space="preserve"> PAGEREF _Toc236067706 \h </w:instrText>
+          <w:instrText xml:space="preserve"> PAGEREF _Toc236069972 \h </w:instrText>
         </w:r>
         <w:r>
           <w:rPr>
@@ -4346,7 +4232,7 @@
           <w14:ligatures w14:val="standardContextual"/>
         </w:rPr>
       </w:pPr>
-      <w:hyperlink w:anchor="_Toc236067707" w:history="1">
+      <w:hyperlink w:anchor="_Toc236069973" w:history="1">
         <w:r>
           <w:rPr>
             <w:rStyle w:val="Siuktni"/>
@@ -4374,7 +4260,7 @@
             <w:noProof/>
             <w:webHidden/>
           </w:rPr>
-          <w:instrText xml:space="preserve"> PAGEREF _Toc236067707 \h </w:instrText>
+          <w:instrText xml:space="preserve"> PAGEREF _Toc236069973 \h </w:instrText>
         </w:r>
         <w:r>
           <w:rPr>
@@ -4422,7 +4308,7 @@
           <w14:ligatures w14:val="standardContextual"/>
         </w:rPr>
       </w:pPr>
-      <w:hyperlink w:anchor="_Toc236067708" w:history="1">
+      <w:hyperlink w:anchor="_Toc236069974" w:history="1">
         <w:r>
           <w:rPr>
             <w:rStyle w:val="Siuktni"/>
@@ -4450,7 +4336,7 @@
             <w:noProof/>
             <w:webHidden/>
           </w:rPr>
-          <w:instrText xml:space="preserve"> PAGEREF _Toc236067708 \h </w:instrText>
+          <w:instrText xml:space="preserve"> PAGEREF _Toc236069974 \h </w:instrText>
         </w:r>
         <w:r>
           <w:rPr>
@@ -4498,7 +4384,7 @@
           <w14:ligatures w14:val="standardContextual"/>
         </w:rPr>
       </w:pPr>
-      <w:hyperlink w:anchor="_Toc236067709" w:history="1">
+      <w:hyperlink w:anchor="_Toc236069975" w:history="1">
         <w:r>
           <w:rPr>
             <w:rStyle w:val="Siuktni"/>
@@ -4526,7 +4412,7 @@
             <w:noProof/>
             <w:webHidden/>
           </w:rPr>
-          <w:instrText xml:space="preserve"> PAGEREF _Toc236067709 \h </w:instrText>
+          <w:instrText xml:space="preserve"> PAGEREF _Toc236069975 \h </w:instrText>
         </w:r>
         <w:r>
           <w:rPr>
@@ -4574,7 +4460,7 @@
           <w14:ligatures w14:val="standardContextual"/>
         </w:rPr>
       </w:pPr>
-      <w:hyperlink w:anchor="_Toc236067710" w:history="1">
+      <w:hyperlink w:anchor="_Toc236069976" w:history="1">
         <w:r>
           <w:rPr>
             <w:rStyle w:val="Siuktni"/>
@@ -4602,7 +4488,7 @@
             <w:noProof/>
             <w:webHidden/>
           </w:rPr>
-          <w:instrText xml:space="preserve"> PAGEREF _Toc236067710 \h </w:instrText>
+          <w:instrText xml:space="preserve"> PAGEREF _Toc236069976 \h </w:instrText>
         </w:r>
         <w:r>
           <w:rPr>
@@ -4650,7 +4536,7 @@
           <w14:ligatures w14:val="standardContextual"/>
         </w:rPr>
       </w:pPr>
-      <w:hyperlink w:anchor="_Toc236067711" w:history="1">
+      <w:hyperlink w:anchor="_Toc236069977" w:history="1">
         <w:r>
           <w:rPr>
             <w:rStyle w:val="Siuktni"/>
@@ -4678,7 +4564,7 @@
             <w:noProof/>
             <w:webHidden/>
           </w:rPr>
-          <w:instrText xml:space="preserve"> PAGEREF _Toc236067711 \h </w:instrText>
+          <w:instrText xml:space="preserve"> PAGEREF _Toc236069977 \h </w:instrText>
         </w:r>
         <w:r>
           <w:rPr>
@@ -4726,7 +4612,7 @@
           <w14:ligatures w14:val="standardContextual"/>
         </w:rPr>
       </w:pPr>
-      <w:hyperlink w:anchor="_Toc236067712" w:history="1">
+      <w:hyperlink w:anchor="_Toc236069978" w:history="1">
         <w:r>
           <w:rPr>
             <w:rStyle w:val="Siuktni"/>
@@ -4754,7 +4640,7 @@
             <w:noProof/>
             <w:webHidden/>
           </w:rPr>
-          <w:instrText xml:space="preserve"> PAGEREF _Toc236067712 \h </w:instrText>
+          <w:instrText xml:space="preserve"> PAGEREF _Toc236069978 \h </w:instrText>
         </w:r>
         <w:r>
           <w:rPr>
@@ -4802,7 +4688,7 @@
           <w14:ligatures w14:val="standardContextual"/>
         </w:rPr>
       </w:pPr>
-      <w:hyperlink w:anchor="_Toc236067713" w:history="1">
+      <w:hyperlink w:anchor="_Toc236069979" w:history="1">
         <w:r>
           <w:rPr>
             <w:rStyle w:val="Siuktni"/>
@@ -4830,7 +4716,7 @@
             <w:noProof/>
             <w:webHidden/>
           </w:rPr>
-          <w:instrText xml:space="preserve"> PAGEREF _Toc236067713 \h </w:instrText>
+          <w:instrText xml:space="preserve"> PAGEREF _Toc236069979 \h </w:instrText>
         </w:r>
         <w:r>
           <w:rPr>
@@ -4878,7 +4764,7 @@
           <w14:ligatures w14:val="standardContextual"/>
         </w:rPr>
       </w:pPr>
-      <w:hyperlink w:anchor="_Toc236067714" w:history="1">
+      <w:hyperlink w:anchor="_Toc236069980" w:history="1">
         <w:r>
           <w:rPr>
             <w:rStyle w:val="Siuktni"/>
@@ -4906,7 +4792,7 @@
             <w:noProof/>
             <w:webHidden/>
           </w:rPr>
-          <w:instrText xml:space="preserve"> PAGEREF _Toc236067714 \h </w:instrText>
+          <w:instrText xml:space="preserve"> PAGEREF _Toc236069980 \h </w:instrText>
         </w:r>
         <w:r>
           <w:rPr>
@@ -4954,7 +4840,7 @@
           <w14:ligatures w14:val="standardContextual"/>
         </w:rPr>
       </w:pPr>
-      <w:hyperlink w:anchor="_Toc236067715" w:history="1">
+      <w:hyperlink w:anchor="_Toc236069981" w:history="1">
         <w:r>
           <w:rPr>
             <w:rStyle w:val="Siuktni"/>
@@ -4982,7 +4868,7 @@
             <w:noProof/>
             <w:webHidden/>
           </w:rPr>
-          <w:instrText xml:space="preserve"> PAGEREF _Toc236067715 \h </w:instrText>
+          <w:instrText xml:space="preserve"> PAGEREF _Toc236069981 \h </w:instrText>
         </w:r>
         <w:r>
           <w:rPr>
@@ -5030,7 +4916,7 @@
           <w14:ligatures w14:val="standardContextual"/>
         </w:rPr>
       </w:pPr>
-      <w:hyperlink w:anchor="_Toc236067716" w:history="1">
+      <w:hyperlink w:anchor="_Toc236069982" w:history="1">
         <w:r>
           <w:rPr>
             <w:rStyle w:val="Siuktni"/>
@@ -5058,7 +4944,7 @@
             <w:noProof/>
             <w:webHidden/>
           </w:rPr>
-          <w:instrText xml:space="preserve"> PAGEREF _Toc236067716 \h </w:instrText>
+          <w:instrText xml:space="preserve"> PAGEREF _Toc236069982 \h </w:instrText>
         </w:r>
         <w:r>
           <w:rPr>
@@ -5106,7 +4992,7 @@
           <w14:ligatures w14:val="standardContextual"/>
         </w:rPr>
       </w:pPr>
-      <w:hyperlink w:anchor="_Toc236067717" w:history="1">
+      <w:hyperlink w:anchor="_Toc236069983" w:history="1">
         <w:r>
           <w:rPr>
             <w:rStyle w:val="Siuktni"/>
@@ -5134,7 +5020,7 @@
             <w:noProof/>
             <w:webHidden/>
           </w:rPr>
-          <w:instrText xml:space="preserve"> PAGEREF _Toc236067717 \h </w:instrText>
+          <w:instrText xml:space="preserve"> PAGEREF _Toc236069983 \h </w:instrText>
         </w:r>
         <w:r>
           <w:rPr>
@@ -5182,7 +5068,7 @@
           <w14:ligatures w14:val="standardContextual"/>
         </w:rPr>
       </w:pPr>
-      <w:hyperlink w:anchor="_Toc236067718" w:history="1">
+      <w:hyperlink w:anchor="_Toc236069984" w:history="1">
         <w:r>
           <w:rPr>
             <w:rStyle w:val="Siuktni"/>
@@ -5210,7 +5096,7 @@
             <w:noProof/>
             <w:webHidden/>
           </w:rPr>
-          <w:instrText xml:space="preserve"> PAGEREF _Toc236067718 \h </w:instrText>
+          <w:instrText xml:space="preserve"> PAGEREF _Toc236069984 \h </w:instrText>
         </w:r>
         <w:r>
           <w:rPr>
@@ -5258,7 +5144,7 @@
           <w14:ligatures w14:val="standardContextual"/>
         </w:rPr>
       </w:pPr>
-      <w:hyperlink w:anchor="_Toc236067719" w:history="1">
+      <w:hyperlink w:anchor="_Toc236069985" w:history="1">
         <w:r>
           <w:rPr>
             <w:rStyle w:val="Siuktni"/>
@@ -5286,7 +5172,7 @@
             <w:noProof/>
             <w:webHidden/>
           </w:rPr>
-          <w:instrText xml:space="preserve"> PAGEREF _Toc236067719 \h </w:instrText>
+          <w:instrText xml:space="preserve"> PAGEREF _Toc236069985 \h </w:instrText>
         </w:r>
         <w:r>
           <w:rPr>
@@ -5334,7 +5220,7 @@
           <w14:ligatures w14:val="standardContextual"/>
         </w:rPr>
       </w:pPr>
-      <w:hyperlink w:anchor="_Toc236067720" w:history="1">
+      <w:hyperlink w:anchor="_Toc236069986" w:history="1">
         <w:r>
           <w:rPr>
             <w:rStyle w:val="Siuktni"/>
@@ -5362,7 +5248,7 @@
             <w:noProof/>
             <w:webHidden/>
           </w:rPr>
-          <w:instrText xml:space="preserve"> PAGEREF _Toc236067720 \h </w:instrText>
+          <w:instrText xml:space="preserve"> PAGEREF _Toc236069986 \h </w:instrText>
         </w:r>
         <w:r>
           <w:rPr>
@@ -5410,7 +5296,7 @@
           <w14:ligatures w14:val="standardContextual"/>
         </w:rPr>
       </w:pPr>
-      <w:hyperlink w:anchor="_Toc236067721" w:history="1">
+      <w:hyperlink w:anchor="_Toc236069987" w:history="1">
         <w:r>
           <w:rPr>
             <w:rStyle w:val="Siuktni"/>
@@ -5438,7 +5324,7 @@
             <w:noProof/>
             <w:webHidden/>
           </w:rPr>
-          <w:instrText xml:space="preserve"> PAGEREF _Toc236067721 \h </w:instrText>
+          <w:instrText xml:space="preserve"> PAGEREF _Toc236069987 \h </w:instrText>
         </w:r>
         <w:r>
           <w:rPr>
@@ -5486,7 +5372,7 @@
           <w14:ligatures w14:val="standardContextual"/>
         </w:rPr>
       </w:pPr>
-      <w:hyperlink w:anchor="_Toc236067722" w:history="1">
+      <w:hyperlink w:anchor="_Toc236069988" w:history="1">
         <w:r>
           <w:rPr>
             <w:rStyle w:val="Siuktni"/>
@@ -5514,7 +5400,7 @@
             <w:noProof/>
             <w:webHidden/>
           </w:rPr>
-          <w:instrText xml:space="preserve"> PAGEREF _Toc236067722 \h </w:instrText>
+          <w:instrText xml:space="preserve"> PAGEREF _Toc236069988 \h </w:instrText>
         </w:r>
         <w:r>
           <w:rPr>
@@ -5562,7 +5448,7 @@
           <w14:ligatures w14:val="standardContextual"/>
         </w:rPr>
       </w:pPr>
-      <w:hyperlink w:anchor="_Toc236067723" w:history="1">
+      <w:hyperlink w:anchor="_Toc236069989" w:history="1">
         <w:r>
           <w:rPr>
             <w:rStyle w:val="Siuktni"/>
@@ -5590,7 +5476,7 @@
             <w:noProof/>
             <w:webHidden/>
           </w:rPr>
-          <w:instrText xml:space="preserve"> PAGEREF _Toc236067723 \h </w:instrText>
+          <w:instrText xml:space="preserve"> PAGEREF _Toc236069989 \h </w:instrText>
         </w:r>
         <w:r>
           <w:rPr>
@@ -5638,7 +5524,7 @@
           <w14:ligatures w14:val="standardContextual"/>
         </w:rPr>
       </w:pPr>
-      <w:hyperlink w:anchor="_Toc236067724" w:history="1">
+      <w:hyperlink w:anchor="_Toc236069990" w:history="1">
         <w:r>
           <w:rPr>
             <w:rStyle w:val="Siuktni"/>
@@ -5666,7 +5552,7 @@
             <w:noProof/>
             <w:webHidden/>
           </w:rPr>
-          <w:instrText xml:space="preserve"> PAGEREF _Toc236067724 \h </w:instrText>
+          <w:instrText xml:space="preserve"> PAGEREF _Toc236069990 \h </w:instrText>
         </w:r>
         <w:r>
           <w:rPr>
@@ -5748,7 +5634,7 @@
           <w:szCs w:val="26"/>
         </w:rPr>
       </w:pPr>
-      <w:bookmarkStart w:id="5" w:name="_Toc236067673"/>
+      <w:bookmarkStart w:id="5" w:name="_Toc236069939"/>
       <w:r>
         <w:rPr>
           <w:rFonts w:ascii="Times New Roman" w:hAnsi="Times New Roman" w:cs="Times New Roman"/>
@@ -5757,79 +5643,7 @@
           <w:szCs w:val="26"/>
         </w:rPr>
         <w:lastRenderedPageBreak/>
-        <w:t>DANH M</w:t>
-      </w:r>
-      <w:r>
-        <w:rPr>
-          <w:rFonts w:ascii="Times New Roman" w:hAnsi="Times New Roman" w:cs="Times New Roman"/>
-          <w:color w:val="000000" w:themeColor="text1"/>
-          <w:sz w:val="26"/>
-          <w:szCs w:val="26"/>
-        </w:rPr>
-        <w:t>Ụ</w:t>
-      </w:r>
-      <w:r>
-        <w:rPr>
-          <w:rFonts w:ascii="Times New Roman" w:hAnsi="Times New Roman" w:cs="Times New Roman"/>
-          <w:color w:val="000000" w:themeColor="text1"/>
-          <w:sz w:val="26"/>
-          <w:szCs w:val="26"/>
-        </w:rPr>
-        <w:t>C T</w:t>
-      </w:r>
-      <w:r>
-        <w:rPr>
-          <w:rFonts w:ascii="Times New Roman" w:hAnsi="Times New Roman" w:cs="Times New Roman"/>
-          <w:color w:val="000000" w:themeColor="text1"/>
-          <w:sz w:val="26"/>
-          <w:szCs w:val="26"/>
-        </w:rPr>
-        <w:t>Ừ</w:t>
-      </w:r>
-      <w:r>
-        <w:rPr>
-          <w:rFonts w:ascii="Times New Roman" w:hAnsi="Times New Roman" w:cs="Times New Roman"/>
-          <w:color w:val="000000" w:themeColor="text1"/>
-          <w:sz w:val="26"/>
-          <w:szCs w:val="26"/>
-        </w:rPr>
-        <w:t xml:space="preserve"> VI</w:t>
-      </w:r>
-      <w:r>
-        <w:rPr>
-          <w:rFonts w:ascii="Times New Roman" w:hAnsi="Times New Roman" w:cs="Times New Roman"/>
-          <w:color w:val="000000" w:themeColor="text1"/>
-          <w:sz w:val="26"/>
-          <w:szCs w:val="26"/>
-        </w:rPr>
-        <w:t>Ế</w:t>
-      </w:r>
-      <w:r>
-        <w:rPr>
-          <w:rFonts w:ascii="Times New Roman" w:hAnsi="Times New Roman" w:cs="Times New Roman"/>
-          <w:color w:val="000000" w:themeColor="text1"/>
-          <w:sz w:val="26"/>
-          <w:szCs w:val="26"/>
-        </w:rPr>
-        <w:t>T T</w:t>
-      </w:r>
-      <w:r>
-        <w:rPr>
-          <w:rFonts w:ascii="Times New Roman" w:hAnsi="Times New Roman" w:cs="Times New Roman"/>
-          <w:color w:val="000000" w:themeColor="text1"/>
-          <w:sz w:val="26"/>
-          <w:szCs w:val="26"/>
-        </w:rPr>
-        <w:t>Ắ</w:t>
-      </w:r>
-      <w:r>
-        <w:rPr>
-          <w:rFonts w:ascii="Times New Roman" w:hAnsi="Times New Roman" w:cs="Times New Roman"/>
-          <w:color w:val="000000" w:themeColor="text1"/>
-          <w:sz w:val="26"/>
-          <w:szCs w:val="26"/>
-        </w:rPr>
-        <w:t>T</w:t>
+        <w:t>DANH MỤC TỪ VIẾT TẮT</w:t>
       </w:r>
       <w:bookmarkEnd w:id="5"/>
     </w:p>
@@ -6742,7 +6556,7 @@
           <w:szCs w:val="26"/>
         </w:rPr>
       </w:pPr>
-      <w:bookmarkStart w:id="6" w:name="_Toc236067674"/>
+      <w:bookmarkStart w:id="6" w:name="_Toc236069940"/>
       <w:r>
         <w:rPr>
           <w:rFonts w:ascii="Times New Roman" w:hAnsi="Times New Roman" w:cs="Times New Roman"/>
@@ -6751,43 +6565,7 @@
           <w:szCs w:val="26"/>
         </w:rPr>
         <w:lastRenderedPageBreak/>
-        <w:t>CHƯƠNG 1. T</w:t>
-      </w:r>
-      <w:r>
-        <w:rPr>
-          <w:rFonts w:ascii="Times New Roman" w:hAnsi="Times New Roman" w:cs="Times New Roman"/>
-          <w:color w:val="000000" w:themeColor="text1"/>
-          <w:sz w:val="26"/>
-          <w:szCs w:val="26"/>
-        </w:rPr>
-        <w:t>Ổ</w:t>
-      </w:r>
-      <w:r>
-        <w:rPr>
-          <w:rFonts w:ascii="Times New Roman" w:hAnsi="Times New Roman" w:cs="Times New Roman"/>
-          <w:color w:val="000000" w:themeColor="text1"/>
-          <w:sz w:val="26"/>
-          <w:szCs w:val="26"/>
-        </w:rPr>
-        <w:t>NG QUAN Đ</w:t>
-      </w:r>
-      <w:r>
-        <w:rPr>
-          <w:rFonts w:ascii="Times New Roman" w:hAnsi="Times New Roman" w:cs="Times New Roman"/>
-          <w:color w:val="000000" w:themeColor="text1"/>
-          <w:sz w:val="26"/>
-          <w:szCs w:val="26"/>
-        </w:rPr>
-        <w:t>Ề</w:t>
-      </w:r>
-      <w:r>
-        <w:rPr>
-          <w:rFonts w:ascii="Times New Roman" w:hAnsi="Times New Roman" w:cs="Times New Roman"/>
-          <w:color w:val="000000" w:themeColor="text1"/>
-          <w:sz w:val="26"/>
-          <w:szCs w:val="26"/>
-        </w:rPr>
-        <w:t xml:space="preserve"> TÀI</w:t>
+        <w:t>CHƯƠNG 1. TỔNG QUAN ĐỀ TÀI</w:t>
       </w:r>
       <w:bookmarkEnd w:id="6"/>
     </w:p>
@@ -6800,69 +6578,13 @@
           <w:color w:val="000000" w:themeColor="text1"/>
         </w:rPr>
       </w:pPr>
-      <w:bookmarkStart w:id="7" w:name="_Toc236067675"/>
+      <w:bookmarkStart w:id="7" w:name="_Toc236069941"/>
       <w:r>
         <w:rPr>
           <w:rFonts w:ascii="Times New Roman" w:hAnsi="Times New Roman" w:cs="Times New Roman"/>
           <w:color w:val="000000" w:themeColor="text1"/>
         </w:rPr>
-        <w:t>1.1. B</w:t>
-      </w:r>
-      <w:r>
-        <w:rPr>
-          <w:rFonts w:ascii="Times New Roman" w:hAnsi="Times New Roman" w:cs="Times New Roman"/>
-          <w:color w:val="000000" w:themeColor="text1"/>
-        </w:rPr>
-        <w:t>ố</w:t>
-      </w:r>
-      <w:r>
-        <w:rPr>
-          <w:rFonts w:ascii="Times New Roman" w:hAnsi="Times New Roman" w:cs="Times New Roman"/>
-          <w:color w:val="000000" w:themeColor="text1"/>
-        </w:rPr>
-        <w:t>i c</w:t>
-      </w:r>
-      <w:r>
-        <w:rPr>
-          <w:rFonts w:ascii="Times New Roman" w:hAnsi="Times New Roman" w:cs="Times New Roman"/>
-          <w:color w:val="000000" w:themeColor="text1"/>
-        </w:rPr>
-        <w:t>ả</w:t>
-      </w:r>
-      <w:r>
-        <w:rPr>
-          <w:rFonts w:ascii="Times New Roman" w:hAnsi="Times New Roman" w:cs="Times New Roman"/>
-          <w:color w:val="000000" w:themeColor="text1"/>
-        </w:rPr>
-        <w:t>nh và lý do ch</w:t>
-      </w:r>
-      <w:r>
-        <w:rPr>
-          <w:rFonts w:ascii="Times New Roman" w:hAnsi="Times New Roman" w:cs="Times New Roman"/>
-          <w:color w:val="000000" w:themeColor="text1"/>
-        </w:rPr>
-        <w:t>ọ</w:t>
-      </w:r>
-      <w:r>
-        <w:rPr>
-          <w:rFonts w:ascii="Times New Roman" w:hAnsi="Times New Roman" w:cs="Times New Roman"/>
-          <w:color w:val="000000" w:themeColor="text1"/>
-        </w:rPr>
-        <w:t>n đ</w:t>
-      </w:r>
-      <w:r>
-        <w:rPr>
-          <w:rFonts w:ascii="Times New Roman" w:hAnsi="Times New Roman" w:cs="Times New Roman"/>
-          <w:color w:val="000000" w:themeColor="text1"/>
-        </w:rPr>
-        <w:t>ề</w:t>
-      </w:r>
-      <w:r>
-        <w:rPr>
-          <w:rFonts w:ascii="Times New Roman" w:hAnsi="Times New Roman" w:cs="Times New Roman"/>
-          <w:color w:val="000000" w:themeColor="text1"/>
-        </w:rPr>
-        <w:t xml:space="preserve"> tài</w:t>
+        <w:t>1.1. Bối cảnh và lý do chọn đề tài</w:t>
       </w:r>
       <w:bookmarkEnd w:id="7"/>
     </w:p>
@@ -6919,111 +6641,13 @@
           <w:color w:val="000000" w:themeColor="text1"/>
         </w:rPr>
       </w:pPr>
-      <w:bookmarkStart w:id="8" w:name="_Toc236067676"/>
+      <w:bookmarkStart w:id="8" w:name="_Toc236069942"/>
       <w:r>
         <w:rPr>
           <w:rFonts w:ascii="Times New Roman" w:hAnsi="Times New Roman" w:cs="Times New Roman"/>
           <w:color w:val="000000" w:themeColor="text1"/>
         </w:rPr>
-        <w:t>1.2. V</w:t>
-      </w:r>
-      <w:r>
-        <w:rPr>
-          <w:rFonts w:ascii="Times New Roman" w:hAnsi="Times New Roman" w:cs="Times New Roman"/>
-          <w:color w:val="000000" w:themeColor="text1"/>
-        </w:rPr>
-        <w:t>ấ</w:t>
-      </w:r>
-      <w:r>
-        <w:rPr>
-          <w:rFonts w:ascii="Times New Roman" w:hAnsi="Times New Roman" w:cs="Times New Roman"/>
-          <w:color w:val="000000" w:themeColor="text1"/>
-        </w:rPr>
-        <w:t>n đ</w:t>
-      </w:r>
-      <w:r>
-        <w:rPr>
-          <w:rFonts w:ascii="Times New Roman" w:hAnsi="Times New Roman" w:cs="Times New Roman"/>
-          <w:color w:val="000000" w:themeColor="text1"/>
-        </w:rPr>
-        <w:t>ề</w:t>
-      </w:r>
-      <w:r>
-        <w:rPr>
-          <w:rFonts w:ascii="Times New Roman" w:hAnsi="Times New Roman" w:cs="Times New Roman"/>
-          <w:color w:val="000000" w:themeColor="text1"/>
-        </w:rPr>
-        <w:t xml:space="preserve"> b</w:t>
-      </w:r>
-      <w:r>
-        <w:rPr>
-          <w:rFonts w:ascii="Times New Roman" w:hAnsi="Times New Roman" w:cs="Times New Roman"/>
-          <w:color w:val="000000" w:themeColor="text1"/>
-        </w:rPr>
-        <w:t>ả</w:t>
-      </w:r>
-      <w:r>
-        <w:rPr>
-          <w:rFonts w:ascii="Times New Roman" w:hAnsi="Times New Roman" w:cs="Times New Roman"/>
-          <w:color w:val="000000" w:themeColor="text1"/>
-        </w:rPr>
-        <w:t>o m</w:t>
-      </w:r>
-      <w:r>
-        <w:rPr>
-          <w:rFonts w:ascii="Times New Roman" w:hAnsi="Times New Roman" w:cs="Times New Roman"/>
-          <w:color w:val="000000" w:themeColor="text1"/>
-        </w:rPr>
-        <w:t>ậ</w:t>
-      </w:r>
-      <w:r>
-        <w:rPr>
-          <w:rFonts w:ascii="Times New Roman" w:hAnsi="Times New Roman" w:cs="Times New Roman"/>
-          <w:color w:val="000000" w:themeColor="text1"/>
-        </w:rPr>
-        <w:t>t và k</w:t>
-      </w:r>
-      <w:r>
-        <w:rPr>
-          <w:rFonts w:ascii="Times New Roman" w:hAnsi="Times New Roman" w:cs="Times New Roman"/>
-          <w:color w:val="000000" w:themeColor="text1"/>
-        </w:rPr>
-        <w:t>ị</w:t>
-      </w:r>
-      <w:r>
-        <w:rPr>
-          <w:rFonts w:ascii="Times New Roman" w:hAnsi="Times New Roman" w:cs="Times New Roman"/>
-          <w:color w:val="000000" w:themeColor="text1"/>
-        </w:rPr>
-        <w:t>ch b</w:t>
-      </w:r>
-      <w:r>
-        <w:rPr>
-          <w:rFonts w:ascii="Times New Roman" w:hAnsi="Times New Roman" w:cs="Times New Roman"/>
-          <w:color w:val="000000" w:themeColor="text1"/>
-        </w:rPr>
-        <w:t>ả</w:t>
-      </w:r>
-      <w:r>
-        <w:rPr>
-          <w:rFonts w:ascii="Times New Roman" w:hAnsi="Times New Roman" w:cs="Times New Roman"/>
-          <w:color w:val="000000" w:themeColor="text1"/>
-        </w:rPr>
-        <w:t>n t</w:t>
-      </w:r>
-      <w:r>
-        <w:rPr>
-          <w:rFonts w:ascii="Times New Roman" w:hAnsi="Times New Roman" w:cs="Times New Roman"/>
-          <w:color w:val="000000" w:themeColor="text1"/>
-        </w:rPr>
-        <w:t>ấ</w:t>
-      </w:r>
-      <w:r>
-        <w:rPr>
-          <w:rFonts w:ascii="Times New Roman" w:hAnsi="Times New Roman" w:cs="Times New Roman"/>
-          <w:color w:val="000000" w:themeColor="text1"/>
-        </w:rPr>
-        <w:t>n công</w:t>
+        <w:t>1.2. Vấn đề bảo mật và kịch bản tấn công</w:t>
       </w:r>
       <w:bookmarkEnd w:id="8"/>
     </w:p>
@@ -7080,41 +6704,13 @@
           <w:color w:val="000000" w:themeColor="text1"/>
         </w:rPr>
       </w:pPr>
-      <w:bookmarkStart w:id="9" w:name="_Toc236067677"/>
+      <w:bookmarkStart w:id="9" w:name="_Toc236069943"/>
       <w:r>
         <w:rPr>
           <w:rFonts w:ascii="Times New Roman" w:hAnsi="Times New Roman" w:cs="Times New Roman"/>
           <w:color w:val="000000" w:themeColor="text1"/>
         </w:rPr>
-        <w:t>1.3. M</w:t>
-      </w:r>
-      <w:r>
-        <w:rPr>
-          <w:rFonts w:ascii="Times New Roman" w:hAnsi="Times New Roman" w:cs="Times New Roman"/>
-          <w:color w:val="000000" w:themeColor="text1"/>
-        </w:rPr>
-        <w:t>ụ</w:t>
-      </w:r>
-      <w:r>
-        <w:rPr>
-          <w:rFonts w:ascii="Times New Roman" w:hAnsi="Times New Roman" w:cs="Times New Roman"/>
-          <w:color w:val="000000" w:themeColor="text1"/>
-        </w:rPr>
-        <w:t>c tiêu đo đư</w:t>
-      </w:r>
-      <w:r>
-        <w:rPr>
-          <w:rFonts w:ascii="Times New Roman" w:hAnsi="Times New Roman" w:cs="Times New Roman"/>
-          <w:color w:val="000000" w:themeColor="text1"/>
-        </w:rPr>
-        <w:t>ợ</w:t>
-      </w:r>
-      <w:r>
-        <w:rPr>
-          <w:rFonts w:ascii="Times New Roman" w:hAnsi="Times New Roman" w:cs="Times New Roman"/>
-          <w:color w:val="000000" w:themeColor="text1"/>
-        </w:rPr>
-        <w:t>c</w:t>
+        <w:t>1.3. Mục tiêu đo được</w:t>
       </w:r>
       <w:bookmarkEnd w:id="9"/>
     </w:p>
@@ -7783,84 +7379,14 @@
           <w:color w:val="000000" w:themeColor="text1"/>
         </w:rPr>
       </w:pPr>
-      <w:bookmarkStart w:id="10" w:name="_Toc236067678"/>
+      <w:bookmarkStart w:id="10" w:name="_Toc236069944"/>
       <w:r>
         <w:rPr>
           <w:rFonts w:ascii="Times New Roman" w:hAnsi="Times New Roman" w:cs="Times New Roman"/>
           <w:color w:val="000000" w:themeColor="text1"/>
         </w:rPr>
         <w:lastRenderedPageBreak/>
-        <w:t>1.4. Đ</w:t>
-      </w:r>
-      <w:r>
-        <w:rPr>
-          <w:rFonts w:ascii="Times New Roman" w:hAnsi="Times New Roman" w:cs="Times New Roman"/>
-          <w:color w:val="000000" w:themeColor="text1"/>
-        </w:rPr>
-        <w:t>ố</w:t>
-      </w:r>
-      <w:r>
-        <w:rPr>
-          <w:rFonts w:ascii="Times New Roman" w:hAnsi="Times New Roman" w:cs="Times New Roman"/>
-          <w:color w:val="000000" w:themeColor="text1"/>
-        </w:rPr>
-        <w:t>i tư</w:t>
-      </w:r>
-      <w:r>
-        <w:rPr>
-          <w:rFonts w:ascii="Times New Roman" w:hAnsi="Times New Roman" w:cs="Times New Roman"/>
-          <w:color w:val="000000" w:themeColor="text1"/>
-        </w:rPr>
-        <w:t>ợ</w:t>
-      </w:r>
-      <w:r>
-        <w:rPr>
-          <w:rFonts w:ascii="Times New Roman" w:hAnsi="Times New Roman" w:cs="Times New Roman"/>
-          <w:color w:val="000000" w:themeColor="text1"/>
-        </w:rPr>
-        <w:t>ng, ph</w:t>
-      </w:r>
-      <w:r>
-        <w:rPr>
-          <w:rFonts w:ascii="Times New Roman" w:hAnsi="Times New Roman" w:cs="Times New Roman"/>
-          <w:color w:val="000000" w:themeColor="text1"/>
-        </w:rPr>
-        <w:t>ạ</w:t>
-      </w:r>
-      <w:r>
-        <w:rPr>
-          <w:rFonts w:ascii="Times New Roman" w:hAnsi="Times New Roman" w:cs="Times New Roman"/>
-          <w:color w:val="000000" w:themeColor="text1"/>
-        </w:rPr>
-        <w:t>m vi và gi</w:t>
-      </w:r>
-      <w:r>
-        <w:rPr>
-          <w:rFonts w:ascii="Times New Roman" w:hAnsi="Times New Roman" w:cs="Times New Roman"/>
-          <w:color w:val="000000" w:themeColor="text1"/>
-        </w:rPr>
-        <w:t>ớ</w:t>
-      </w:r>
-      <w:r>
-        <w:rPr>
-          <w:rFonts w:ascii="Times New Roman" w:hAnsi="Times New Roman" w:cs="Times New Roman"/>
-          <w:color w:val="000000" w:themeColor="text1"/>
-        </w:rPr>
-        <w:t>i h</w:t>
-      </w:r>
-      <w:r>
-        <w:rPr>
-          <w:rFonts w:ascii="Times New Roman" w:hAnsi="Times New Roman" w:cs="Times New Roman"/>
-          <w:color w:val="000000" w:themeColor="text1"/>
-        </w:rPr>
-        <w:t>ạ</w:t>
-      </w:r>
-      <w:r>
-        <w:rPr>
-          <w:rFonts w:ascii="Times New Roman" w:hAnsi="Times New Roman" w:cs="Times New Roman"/>
-          <w:color w:val="000000" w:themeColor="text1"/>
-        </w:rPr>
-        <w:t>n an toàn</w:t>
+        <w:t>1.4. Đối tượng, phạm vi và giới hạn an toàn</w:t>
       </w:r>
       <w:bookmarkEnd w:id="10"/>
     </w:p>
@@ -7917,41 +7443,13 @@
           <w:color w:val="000000" w:themeColor="text1"/>
         </w:rPr>
       </w:pPr>
-      <w:bookmarkStart w:id="11" w:name="_Toc236067679"/>
+      <w:bookmarkStart w:id="11" w:name="_Toc236069945"/>
       <w:r>
         <w:rPr>
           <w:rFonts w:ascii="Times New Roman" w:hAnsi="Times New Roman" w:cs="Times New Roman"/>
           <w:color w:val="000000" w:themeColor="text1"/>
         </w:rPr>
-        <w:t>1.5. S</w:t>
-      </w:r>
-      <w:r>
-        <w:rPr>
-          <w:rFonts w:ascii="Times New Roman" w:hAnsi="Times New Roman" w:cs="Times New Roman"/>
-          <w:color w:val="000000" w:themeColor="text1"/>
-        </w:rPr>
-        <w:t>ả</w:t>
-      </w:r>
-      <w:r>
-        <w:rPr>
-          <w:rFonts w:ascii="Times New Roman" w:hAnsi="Times New Roman" w:cs="Times New Roman"/>
-          <w:color w:val="000000" w:themeColor="text1"/>
-        </w:rPr>
-        <w:t>n ph</w:t>
-      </w:r>
-      <w:r>
-        <w:rPr>
-          <w:rFonts w:ascii="Times New Roman" w:hAnsi="Times New Roman" w:cs="Times New Roman"/>
-          <w:color w:val="000000" w:themeColor="text1"/>
-        </w:rPr>
-        <w:t>ẩ</w:t>
-      </w:r>
-      <w:r>
-        <w:rPr>
-          <w:rFonts w:ascii="Times New Roman" w:hAnsi="Times New Roman" w:cs="Times New Roman"/>
-          <w:color w:val="000000" w:themeColor="text1"/>
-        </w:rPr>
-        <w:t>m và đóng góp</w:t>
+        <w:t>1.5. Sản phẩm và đóng góp</w:t>
       </w:r>
       <w:bookmarkEnd w:id="11"/>
     </w:p>
@@ -8072,7 +7570,7 @@
           <w:sz w:val="26"/>
           <w:szCs w:val="26"/>
         </w:rPr>
-        <w:t>Repository công khai https://github.com/hv6z/n20-secure-firmware-update-iot, mốc đối chiếu `eda9be5fd821368b54bcffa67e2507124a7f123b`.</w:t>
+        <w:t>Repository công khai https://github.com/hv6z/n20-secure-firmware-update-iot, mốc đối chiếu `a8febb243aca96388c1981e141e823b8f397af8b`.</w:t>
       </w:r>
     </w:p>
     <w:p>
@@ -8084,27 +7582,13 @@
           <w:color w:val="000000" w:themeColor="text1"/>
         </w:rPr>
       </w:pPr>
-      <w:bookmarkStart w:id="12" w:name="_Toc236067680"/>
+      <w:bookmarkStart w:id="12" w:name="_Toc236069946"/>
       <w:r>
         <w:rPr>
           <w:rFonts w:ascii="Times New Roman" w:hAnsi="Times New Roman" w:cs="Times New Roman"/>
           <w:color w:val="000000" w:themeColor="text1"/>
         </w:rPr>
-        <w:t>1.6. C</w:t>
-      </w:r>
-      <w:r>
-        <w:rPr>
-          <w:rFonts w:ascii="Times New Roman" w:hAnsi="Times New Roman" w:cs="Times New Roman"/>
-          <w:color w:val="000000" w:themeColor="text1"/>
-        </w:rPr>
-        <w:t>ấ</w:t>
-      </w:r>
-      <w:r>
-        <w:rPr>
-          <w:rFonts w:ascii="Times New Roman" w:hAnsi="Times New Roman" w:cs="Times New Roman"/>
-          <w:color w:val="000000" w:themeColor="text1"/>
-        </w:rPr>
-        <w:t>u trúc báo cáo</w:t>
+        <w:t>1.6. Cấu trúc báo cáo</w:t>
       </w:r>
       <w:bookmarkEnd w:id="12"/>
     </w:p>
@@ -8161,7 +7645,7 @@
           <w:szCs w:val="26"/>
         </w:rPr>
       </w:pPr>
-      <w:bookmarkStart w:id="13" w:name="_Toc236067681"/>
+      <w:bookmarkStart w:id="13" w:name="_Toc236069947"/>
       <w:r>
         <w:rPr>
           <w:rFonts w:ascii="Times New Roman" w:hAnsi="Times New Roman" w:cs="Times New Roman"/>
@@ -8170,61 +7654,7 @@
           <w:szCs w:val="26"/>
         </w:rPr>
         <w:lastRenderedPageBreak/>
-        <w:t>CHƯƠNG 2. CƠ S</w:t>
-      </w:r>
-      <w:r>
-        <w:rPr>
-          <w:rFonts w:ascii="Times New Roman" w:hAnsi="Times New Roman" w:cs="Times New Roman"/>
-          <w:color w:val="000000" w:themeColor="text1"/>
-          <w:sz w:val="26"/>
-          <w:szCs w:val="26"/>
-        </w:rPr>
-        <w:t>Ở</w:t>
-      </w:r>
-      <w:r>
-        <w:rPr>
-          <w:rFonts w:ascii="Times New Roman" w:hAnsi="Times New Roman" w:cs="Times New Roman"/>
-          <w:color w:val="000000" w:themeColor="text1"/>
-          <w:sz w:val="26"/>
-          <w:szCs w:val="26"/>
-        </w:rPr>
-        <w:t xml:space="preserve"> LÝ THUY</w:t>
-      </w:r>
-      <w:r>
-        <w:rPr>
-          <w:rFonts w:ascii="Times New Roman" w:hAnsi="Times New Roman" w:cs="Times New Roman"/>
-          <w:color w:val="000000" w:themeColor="text1"/>
-          <w:sz w:val="26"/>
-          <w:szCs w:val="26"/>
-        </w:rPr>
-        <w:t>Ế</w:t>
-      </w:r>
-      <w:r>
-        <w:rPr>
-          <w:rFonts w:ascii="Times New Roman" w:hAnsi="Times New Roman" w:cs="Times New Roman"/>
-          <w:color w:val="000000" w:themeColor="text1"/>
-          <w:sz w:val="26"/>
-          <w:szCs w:val="26"/>
-        </w:rPr>
-        <w:t>T VÀ TÀI LI</w:t>
-      </w:r>
-      <w:r>
-        <w:rPr>
-          <w:rFonts w:ascii="Times New Roman" w:hAnsi="Times New Roman" w:cs="Times New Roman"/>
-          <w:color w:val="000000" w:themeColor="text1"/>
-          <w:sz w:val="26"/>
-          <w:szCs w:val="26"/>
-        </w:rPr>
-        <w:t>Ệ</w:t>
-      </w:r>
-      <w:r>
-        <w:rPr>
-          <w:rFonts w:ascii="Times New Roman" w:hAnsi="Times New Roman" w:cs="Times New Roman"/>
-          <w:color w:val="000000" w:themeColor="text1"/>
-          <w:sz w:val="26"/>
-          <w:szCs w:val="26"/>
-        </w:rPr>
-        <w:t>U LIÊN QUAN</w:t>
+        <w:t>CHƯƠNG 2. CƠ SỞ LÝ THUYẾT VÀ TÀI LIỆU LIÊN QUAN</w:t>
       </w:r>
       <w:bookmarkEnd w:id="13"/>
     </w:p>
@@ -8237,97 +7667,13 @@
           <w:color w:val="000000" w:themeColor="text1"/>
         </w:rPr>
       </w:pPr>
-      <w:bookmarkStart w:id="14" w:name="_Toc236067682"/>
+      <w:bookmarkStart w:id="14" w:name="_Toc236069948"/>
       <w:r>
         <w:rPr>
           <w:rFonts w:ascii="Times New Roman" w:hAnsi="Times New Roman" w:cs="Times New Roman"/>
           <w:color w:val="000000" w:themeColor="text1"/>
         </w:rPr>
-        <w:t>2.1. Ki</w:t>
-      </w:r>
-      <w:r>
-        <w:rPr>
-          <w:rFonts w:ascii="Times New Roman" w:hAnsi="Times New Roman" w:cs="Times New Roman"/>
-          <w:color w:val="000000" w:themeColor="text1"/>
-        </w:rPr>
-        <w:t>ế</w:t>
-      </w:r>
-      <w:r>
-        <w:rPr>
-          <w:rFonts w:ascii="Times New Roman" w:hAnsi="Times New Roman" w:cs="Times New Roman"/>
-          <w:color w:val="000000" w:themeColor="text1"/>
-        </w:rPr>
-        <w:t>n trúc và biên tin c</w:t>
-      </w:r>
-      <w:r>
-        <w:rPr>
-          <w:rFonts w:ascii="Times New Roman" w:hAnsi="Times New Roman" w:cs="Times New Roman"/>
-          <w:color w:val="000000" w:themeColor="text1"/>
-        </w:rPr>
-        <w:t>ậ</w:t>
-      </w:r>
-      <w:r>
-        <w:rPr>
-          <w:rFonts w:ascii="Times New Roman" w:hAnsi="Times New Roman" w:cs="Times New Roman"/>
-          <w:color w:val="000000" w:themeColor="text1"/>
-        </w:rPr>
-        <w:t>y c</w:t>
-      </w:r>
-      <w:r>
-        <w:rPr>
-          <w:rFonts w:ascii="Times New Roman" w:hAnsi="Times New Roman" w:cs="Times New Roman"/>
-          <w:color w:val="000000" w:themeColor="text1"/>
-        </w:rPr>
-        <w:t>ủ</w:t>
-      </w:r>
-      <w:r>
-        <w:rPr>
-          <w:rFonts w:ascii="Times New Roman" w:hAnsi="Times New Roman" w:cs="Times New Roman"/>
-          <w:color w:val="000000" w:themeColor="text1"/>
-        </w:rPr>
-        <w:t>a chu</w:t>
-      </w:r>
-      <w:r>
-        <w:rPr>
-          <w:rFonts w:ascii="Times New Roman" w:hAnsi="Times New Roman" w:cs="Times New Roman"/>
-          <w:color w:val="000000" w:themeColor="text1"/>
-        </w:rPr>
-        <w:t>ỗ</w:t>
-      </w:r>
-      <w:r>
-        <w:rPr>
-          <w:rFonts w:ascii="Times New Roman" w:hAnsi="Times New Roman" w:cs="Times New Roman"/>
-          <w:color w:val="000000" w:themeColor="text1"/>
-        </w:rPr>
-        <w:t>i c</w:t>
-      </w:r>
-      <w:r>
-        <w:rPr>
-          <w:rFonts w:ascii="Times New Roman" w:hAnsi="Times New Roman" w:cs="Times New Roman"/>
-          <w:color w:val="000000" w:themeColor="text1"/>
-        </w:rPr>
-        <w:t>ậ</w:t>
-      </w:r>
-      <w:r>
-        <w:rPr>
-          <w:rFonts w:ascii="Times New Roman" w:hAnsi="Times New Roman" w:cs="Times New Roman"/>
-          <w:color w:val="000000" w:themeColor="text1"/>
-        </w:rPr>
-        <w:t>p nh</w:t>
-      </w:r>
-      <w:r>
-        <w:rPr>
-          <w:rFonts w:ascii="Times New Roman" w:hAnsi="Times New Roman" w:cs="Times New Roman"/>
-          <w:color w:val="000000" w:themeColor="text1"/>
-        </w:rPr>
-        <w:t>ậ</w:t>
-      </w:r>
-      <w:r>
-        <w:rPr>
-          <w:rFonts w:ascii="Times New Roman" w:hAnsi="Times New Roman" w:cs="Times New Roman"/>
-          <w:color w:val="000000" w:themeColor="text1"/>
-        </w:rPr>
-        <w:t>t</w:t>
+        <w:t>2.1. Kiến trúc và biên tin cậy của chuỗi cập nhật</w:t>
       </w:r>
       <w:bookmarkEnd w:id="14"/>
     </w:p>
@@ -8465,97 +7811,13 @@
           <w:color w:val="000000" w:themeColor="text1"/>
         </w:rPr>
       </w:pPr>
-      <w:bookmarkStart w:id="15" w:name="_Toc236067683"/>
+      <w:bookmarkStart w:id="15" w:name="_Toc236069949"/>
       <w:r>
         <w:rPr>
           <w:rFonts w:ascii="Times New Roman" w:hAnsi="Times New Roman" w:cs="Times New Roman"/>
           <w:color w:val="000000" w:themeColor="text1"/>
         </w:rPr>
-        <w:t>2.2. Các khái ni</w:t>
-      </w:r>
-      <w:r>
-        <w:rPr>
-          <w:rFonts w:ascii="Times New Roman" w:hAnsi="Times New Roman" w:cs="Times New Roman"/>
-          <w:color w:val="000000" w:themeColor="text1"/>
-        </w:rPr>
-        <w:t>ệ</w:t>
-      </w:r>
-      <w:r>
-        <w:rPr>
-          <w:rFonts w:ascii="Times New Roman" w:hAnsi="Times New Roman" w:cs="Times New Roman"/>
-          <w:color w:val="000000" w:themeColor="text1"/>
-        </w:rPr>
-        <w:t>m b</w:t>
-      </w:r>
-      <w:r>
-        <w:rPr>
-          <w:rFonts w:ascii="Times New Roman" w:hAnsi="Times New Roman" w:cs="Times New Roman"/>
-          <w:color w:val="000000" w:themeColor="text1"/>
-        </w:rPr>
-        <w:t>ả</w:t>
-      </w:r>
-      <w:r>
-        <w:rPr>
-          <w:rFonts w:ascii="Times New Roman" w:hAnsi="Times New Roman" w:cs="Times New Roman"/>
-          <w:color w:val="000000" w:themeColor="text1"/>
-        </w:rPr>
-        <w:t>o m</w:t>
-      </w:r>
-      <w:r>
-        <w:rPr>
-          <w:rFonts w:ascii="Times New Roman" w:hAnsi="Times New Roman" w:cs="Times New Roman"/>
-          <w:color w:val="000000" w:themeColor="text1"/>
-        </w:rPr>
-        <w:t>ậ</w:t>
-      </w:r>
-      <w:r>
-        <w:rPr>
-          <w:rFonts w:ascii="Times New Roman" w:hAnsi="Times New Roman" w:cs="Times New Roman"/>
-          <w:color w:val="000000" w:themeColor="text1"/>
-        </w:rPr>
-        <w:t>t đư</w:t>
-      </w:r>
-      <w:r>
-        <w:rPr>
-          <w:rFonts w:ascii="Times New Roman" w:hAnsi="Times New Roman" w:cs="Times New Roman"/>
-          <w:color w:val="000000" w:themeColor="text1"/>
-        </w:rPr>
-        <w:t>ợ</w:t>
-      </w:r>
-      <w:r>
-        <w:rPr>
-          <w:rFonts w:ascii="Times New Roman" w:hAnsi="Times New Roman" w:cs="Times New Roman"/>
-          <w:color w:val="000000" w:themeColor="text1"/>
-        </w:rPr>
-        <w:t>c s</w:t>
-      </w:r>
-      <w:r>
-        <w:rPr>
-          <w:rFonts w:ascii="Times New Roman" w:hAnsi="Times New Roman" w:cs="Times New Roman"/>
-          <w:color w:val="000000" w:themeColor="text1"/>
-        </w:rPr>
-        <w:t>ử</w:t>
-      </w:r>
-      <w:r>
-        <w:rPr>
-          <w:rFonts w:ascii="Times New Roman" w:hAnsi="Times New Roman" w:cs="Times New Roman"/>
-          <w:color w:val="000000" w:themeColor="text1"/>
-        </w:rPr>
-        <w:t xml:space="preserve"> d</w:t>
-      </w:r>
-      <w:r>
-        <w:rPr>
-          <w:rFonts w:ascii="Times New Roman" w:hAnsi="Times New Roman" w:cs="Times New Roman"/>
-          <w:color w:val="000000" w:themeColor="text1"/>
-        </w:rPr>
-        <w:t>ụ</w:t>
-      </w:r>
-      <w:r>
-        <w:rPr>
-          <w:rFonts w:ascii="Times New Roman" w:hAnsi="Times New Roman" w:cs="Times New Roman"/>
-          <w:color w:val="000000" w:themeColor="text1"/>
-        </w:rPr>
-        <w:t>ng</w:t>
+        <w:t>2.2. Các khái niệm bảo mật được sử dụng</w:t>
       </w:r>
       <w:bookmarkEnd w:id="15"/>
     </w:p>
@@ -9130,84 +8392,14 @@
           <w:color w:val="000000" w:themeColor="text1"/>
         </w:rPr>
       </w:pPr>
-      <w:bookmarkStart w:id="16" w:name="_Toc236067684"/>
+      <w:bookmarkStart w:id="16" w:name="_Toc236069950"/>
       <w:r>
         <w:rPr>
           <w:rFonts w:ascii="Times New Roman" w:hAnsi="Times New Roman" w:cs="Times New Roman"/>
           <w:color w:val="000000" w:themeColor="text1"/>
         </w:rPr>
         <w:lastRenderedPageBreak/>
-        <w:t>2.3. Chu</w:t>
-      </w:r>
-      <w:r>
-        <w:rPr>
-          <w:rFonts w:ascii="Times New Roman" w:hAnsi="Times New Roman" w:cs="Times New Roman"/>
-          <w:color w:val="000000" w:themeColor="text1"/>
-        </w:rPr>
-        <w:t>ỗ</w:t>
-      </w:r>
-      <w:r>
-        <w:rPr>
-          <w:rFonts w:ascii="Times New Roman" w:hAnsi="Times New Roman" w:cs="Times New Roman"/>
-          <w:color w:val="000000" w:themeColor="text1"/>
-        </w:rPr>
-        <w:t>i boot/update, ph</w:t>
-      </w:r>
-      <w:r>
-        <w:rPr>
-          <w:rFonts w:ascii="Times New Roman" w:hAnsi="Times New Roman" w:cs="Times New Roman"/>
-          <w:color w:val="000000" w:themeColor="text1"/>
-        </w:rPr>
-        <w:t>ầ</w:t>
-      </w:r>
-      <w:r>
-        <w:rPr>
-          <w:rFonts w:ascii="Times New Roman" w:hAnsi="Times New Roman" w:cs="Times New Roman"/>
-          <w:color w:val="000000" w:themeColor="text1"/>
-        </w:rPr>
-        <w:t>n c</w:t>
-      </w:r>
-      <w:r>
-        <w:rPr>
-          <w:rFonts w:ascii="Times New Roman" w:hAnsi="Times New Roman" w:cs="Times New Roman"/>
-          <w:color w:val="000000" w:themeColor="text1"/>
-        </w:rPr>
-        <w:t>ứ</w:t>
-      </w:r>
-      <w:r>
-        <w:rPr>
-          <w:rFonts w:ascii="Times New Roman" w:hAnsi="Times New Roman" w:cs="Times New Roman"/>
-          <w:color w:val="000000" w:themeColor="text1"/>
-        </w:rPr>
-        <w:t>ng và b</w:t>
-      </w:r>
-      <w:r>
-        <w:rPr>
-          <w:rFonts w:ascii="Times New Roman" w:hAnsi="Times New Roman" w:cs="Times New Roman"/>
-          <w:color w:val="000000" w:themeColor="text1"/>
-        </w:rPr>
-        <w:t>ả</w:t>
-      </w:r>
-      <w:r>
-        <w:rPr>
-          <w:rFonts w:ascii="Times New Roman" w:hAnsi="Times New Roman" w:cs="Times New Roman"/>
-          <w:color w:val="000000" w:themeColor="text1"/>
-        </w:rPr>
-        <w:t>o v</w:t>
-      </w:r>
-      <w:r>
-        <w:rPr>
-          <w:rFonts w:ascii="Times New Roman" w:hAnsi="Times New Roman" w:cs="Times New Roman"/>
-          <w:color w:val="000000" w:themeColor="text1"/>
-        </w:rPr>
-        <w:t>ệ</w:t>
-      </w:r>
-      <w:r>
-        <w:rPr>
-          <w:rFonts w:ascii="Times New Roman" w:hAnsi="Times New Roman" w:cs="Times New Roman"/>
-          <w:color w:val="000000" w:themeColor="text1"/>
-        </w:rPr>
-        <w:t xml:space="preserve"> khóa</w:t>
+        <w:t>2.3. Chuỗi boot/update, phần cứng và bảo vệ khóa</w:t>
       </w:r>
       <w:bookmarkEnd w:id="16"/>
     </w:p>
@@ -9892,55 +9084,13 @@
           <w:color w:val="000000" w:themeColor="text1"/>
         </w:rPr>
       </w:pPr>
-      <w:bookmarkStart w:id="17" w:name="_Toc236067685"/>
+      <w:bookmarkStart w:id="17" w:name="_Toc236069951"/>
       <w:r>
         <w:rPr>
           <w:rFonts w:ascii="Times New Roman" w:hAnsi="Times New Roman" w:cs="Times New Roman"/>
           <w:color w:val="000000" w:themeColor="text1"/>
         </w:rPr>
-        <w:t>2.4. Chu</w:t>
-      </w:r>
-      <w:r>
-        <w:rPr>
-          <w:rFonts w:ascii="Times New Roman" w:hAnsi="Times New Roman" w:cs="Times New Roman"/>
-          <w:color w:val="000000" w:themeColor="text1"/>
-        </w:rPr>
-        <w:t>ẩ</w:t>
-      </w:r>
-      <w:r>
-        <w:rPr>
-          <w:rFonts w:ascii="Times New Roman" w:hAnsi="Times New Roman" w:cs="Times New Roman"/>
-          <w:color w:val="000000" w:themeColor="text1"/>
-        </w:rPr>
-        <w:t>n, công c</w:t>
-      </w:r>
-      <w:r>
-        <w:rPr>
-          <w:rFonts w:ascii="Times New Roman" w:hAnsi="Times New Roman" w:cs="Times New Roman"/>
-          <w:color w:val="000000" w:themeColor="text1"/>
-        </w:rPr>
-        <w:t>ụ</w:t>
-      </w:r>
-      <w:r>
-        <w:rPr>
-          <w:rFonts w:ascii="Times New Roman" w:hAnsi="Times New Roman" w:cs="Times New Roman"/>
-          <w:color w:val="000000" w:themeColor="text1"/>
-        </w:rPr>
-        <w:t xml:space="preserve"> và repository tham chi</w:t>
-      </w:r>
-      <w:r>
-        <w:rPr>
-          <w:rFonts w:ascii="Times New Roman" w:hAnsi="Times New Roman" w:cs="Times New Roman"/>
-          <w:color w:val="000000" w:themeColor="text1"/>
-        </w:rPr>
-        <w:t>ế</w:t>
-      </w:r>
-      <w:r>
-        <w:rPr>
-          <w:rFonts w:ascii="Times New Roman" w:hAnsi="Times New Roman" w:cs="Times New Roman"/>
-          <w:color w:val="000000" w:themeColor="text1"/>
-        </w:rPr>
-        <w:t>u</w:t>
+        <w:t>2.4. Chuẩn, công cụ và repository tham chiếu</w:t>
       </w:r>
       <w:bookmarkEnd w:id="17"/>
     </w:p>
@@ -11130,55 +10280,13 @@
           <w:color w:val="000000" w:themeColor="text1"/>
         </w:rPr>
       </w:pPr>
-      <w:bookmarkStart w:id="18" w:name="_Toc236067686"/>
+      <w:bookmarkStart w:id="18" w:name="_Toc236069952"/>
       <w:r>
         <w:rPr>
           <w:rFonts w:ascii="Times New Roman" w:hAnsi="Times New Roman" w:cs="Times New Roman"/>
           <w:color w:val="000000" w:themeColor="text1"/>
         </w:rPr>
-        <w:t>2.5. So sánh các gi</w:t>
-      </w:r>
-      <w:r>
-        <w:rPr>
-          <w:rFonts w:ascii="Times New Roman" w:hAnsi="Times New Roman" w:cs="Times New Roman"/>
-          <w:color w:val="000000" w:themeColor="text1"/>
-        </w:rPr>
-        <w:t>ả</w:t>
-      </w:r>
-      <w:r>
-        <w:rPr>
-          <w:rFonts w:ascii="Times New Roman" w:hAnsi="Times New Roman" w:cs="Times New Roman"/>
-          <w:color w:val="000000" w:themeColor="text1"/>
-        </w:rPr>
-        <w:t>i pháp g</w:t>
-      </w:r>
-      <w:r>
-        <w:rPr>
-          <w:rFonts w:ascii="Times New Roman" w:hAnsi="Times New Roman" w:cs="Times New Roman"/>
-          <w:color w:val="000000" w:themeColor="text1"/>
-        </w:rPr>
-        <w:t>ầ</w:t>
-      </w:r>
-      <w:r>
-        <w:rPr>
-          <w:rFonts w:ascii="Times New Roman" w:hAnsi="Times New Roman" w:cs="Times New Roman"/>
-          <w:color w:val="000000" w:themeColor="text1"/>
-        </w:rPr>
-        <w:t>n nh</w:t>
-      </w:r>
-      <w:r>
-        <w:rPr>
-          <w:rFonts w:ascii="Times New Roman" w:hAnsi="Times New Roman" w:cs="Times New Roman"/>
-          <w:color w:val="000000" w:themeColor="text1"/>
-        </w:rPr>
-        <w:t>ấ</w:t>
-      </w:r>
-      <w:r>
-        <w:rPr>
-          <w:rFonts w:ascii="Times New Roman" w:hAnsi="Times New Roman" w:cs="Times New Roman"/>
-          <w:color w:val="000000" w:themeColor="text1"/>
-        </w:rPr>
-        <w:t>t</w:t>
+        <w:t>2.5. So sánh các giải pháp gần nhất</w:t>
       </w:r>
       <w:bookmarkEnd w:id="18"/>
     </w:p>
@@ -11632,41 +10740,13 @@
           <w:color w:val="000000" w:themeColor="text1"/>
         </w:rPr>
       </w:pPr>
-      <w:bookmarkStart w:id="19" w:name="_Toc236067687"/>
+      <w:bookmarkStart w:id="19" w:name="_Toc236069953"/>
       <w:r>
         <w:rPr>
           <w:rFonts w:ascii="Times New Roman" w:hAnsi="Times New Roman" w:cs="Times New Roman"/>
           <w:color w:val="000000" w:themeColor="text1"/>
         </w:rPr>
-        <w:t>2.6. Ti</w:t>
-      </w:r>
-      <w:r>
-        <w:rPr>
-          <w:rFonts w:ascii="Times New Roman" w:hAnsi="Times New Roman" w:cs="Times New Roman"/>
-          <w:color w:val="000000" w:themeColor="text1"/>
-        </w:rPr>
-        <w:t>ể</w:t>
-      </w:r>
-      <w:r>
-        <w:rPr>
-          <w:rFonts w:ascii="Times New Roman" w:hAnsi="Times New Roman" w:cs="Times New Roman"/>
-          <w:color w:val="000000" w:themeColor="text1"/>
-        </w:rPr>
-        <w:t>u k</w:t>
-      </w:r>
-      <w:r>
-        <w:rPr>
-          <w:rFonts w:ascii="Times New Roman" w:hAnsi="Times New Roman" w:cs="Times New Roman"/>
-          <w:color w:val="000000" w:themeColor="text1"/>
-        </w:rPr>
-        <w:t>ế</w:t>
-      </w:r>
-      <w:r>
-        <w:rPr>
-          <w:rFonts w:ascii="Times New Roman" w:hAnsi="Times New Roman" w:cs="Times New Roman"/>
-          <w:color w:val="000000" w:themeColor="text1"/>
-        </w:rPr>
-        <w:t>t Chương 2</w:t>
+        <w:t>2.6. Tiểu kết Chương 2</w:t>
       </w:r>
       <w:bookmarkEnd w:id="19"/>
     </w:p>
@@ -11723,7 +10803,7 @@
           <w:szCs w:val="26"/>
         </w:rPr>
       </w:pPr>
-      <w:bookmarkStart w:id="20" w:name="_Toc236067688"/>
+      <w:bookmarkStart w:id="20" w:name="_Toc236069954"/>
       <w:r>
         <w:rPr>
           <w:rFonts w:ascii="Times New Roman" w:hAnsi="Times New Roman" w:cs="Times New Roman"/>
@@ -11732,34 +10812,7 @@
           <w:szCs w:val="26"/>
         </w:rPr>
         <w:lastRenderedPageBreak/>
-        <w:t>CHƯƠNG 3. PHƯƠNG PHÁP VÀ THI</w:t>
-      </w:r>
-      <w:r>
-        <w:rPr>
-          <w:rFonts w:ascii="Times New Roman" w:hAnsi="Times New Roman" w:cs="Times New Roman"/>
-          <w:color w:val="000000" w:themeColor="text1"/>
-          <w:sz w:val="26"/>
-          <w:szCs w:val="26"/>
-        </w:rPr>
-        <w:t>Ế</w:t>
-      </w:r>
-      <w:r>
-        <w:rPr>
-          <w:rFonts w:ascii="Times New Roman" w:hAnsi="Times New Roman" w:cs="Times New Roman"/>
-          <w:color w:val="000000" w:themeColor="text1"/>
-          <w:sz w:val="26"/>
-          <w:szCs w:val="26"/>
-        </w:rPr>
-        <w:t>T K</w:t>
-      </w:r>
-      <w:r>
-        <w:rPr>
-          <w:rFonts w:ascii="Times New Roman" w:hAnsi="Times New Roman" w:cs="Times New Roman"/>
-          <w:color w:val="000000" w:themeColor="text1"/>
-          <w:sz w:val="26"/>
-          <w:szCs w:val="26"/>
-        </w:rPr>
-        <w:t>Ế</w:t>
+        <w:t>CHƯƠNG 3. PHƯƠNG PHÁP VÀ THIẾT KẾ</w:t>
       </w:r>
       <w:bookmarkEnd w:id="20"/>
     </w:p>
@@ -11772,41 +10825,13 @@
           <w:color w:val="000000" w:themeColor="text1"/>
         </w:rPr>
       </w:pPr>
-      <w:bookmarkStart w:id="21" w:name="_Toc236067689"/>
+      <w:bookmarkStart w:id="21" w:name="_Toc236069955"/>
       <w:r>
         <w:rPr>
           <w:rFonts w:ascii="Times New Roman" w:hAnsi="Times New Roman" w:cs="Times New Roman"/>
           <w:color w:val="000000" w:themeColor="text1"/>
         </w:rPr>
-        <w:t>3.1. Phương pháp th</w:t>
-      </w:r>
-      <w:r>
-        <w:rPr>
-          <w:rFonts w:ascii="Times New Roman" w:hAnsi="Times New Roman" w:cs="Times New Roman"/>
-          <w:color w:val="000000" w:themeColor="text1"/>
-        </w:rPr>
-        <w:t>ự</w:t>
-      </w:r>
-      <w:r>
-        <w:rPr>
-          <w:rFonts w:ascii="Times New Roman" w:hAnsi="Times New Roman" w:cs="Times New Roman"/>
-          <w:color w:val="000000" w:themeColor="text1"/>
-        </w:rPr>
-        <w:t>c hi</w:t>
-      </w:r>
-      <w:r>
-        <w:rPr>
-          <w:rFonts w:ascii="Times New Roman" w:hAnsi="Times New Roman" w:cs="Times New Roman"/>
-          <w:color w:val="000000" w:themeColor="text1"/>
-        </w:rPr>
-        <w:t>ệ</w:t>
-      </w:r>
-      <w:r>
-        <w:rPr>
-          <w:rFonts w:ascii="Times New Roman" w:hAnsi="Times New Roman" w:cs="Times New Roman"/>
-          <w:color w:val="000000" w:themeColor="text1"/>
-        </w:rPr>
-        <w:t>n</w:t>
+        <w:t>3.1. Phương pháp thực hiện</w:t>
       </w:r>
       <w:bookmarkEnd w:id="21"/>
     </w:p>
@@ -11964,41 +10989,13 @@
           <w:color w:val="000000" w:themeColor="text1"/>
         </w:rPr>
       </w:pPr>
-      <w:bookmarkStart w:id="22" w:name="_Toc236067690"/>
+      <w:bookmarkStart w:id="22" w:name="_Toc236069956"/>
       <w:r>
         <w:rPr>
           <w:rFonts w:ascii="Times New Roman" w:hAnsi="Times New Roman" w:cs="Times New Roman"/>
           <w:color w:val="000000" w:themeColor="text1"/>
         </w:rPr>
-        <w:t>3.2. Mô hình đ</w:t>
-      </w:r>
-      <w:r>
-        <w:rPr>
-          <w:rFonts w:ascii="Times New Roman" w:hAnsi="Times New Roman" w:cs="Times New Roman"/>
-          <w:color w:val="000000" w:themeColor="text1"/>
-        </w:rPr>
-        <w:t>ề</w:t>
-      </w:r>
-      <w:r>
-        <w:rPr>
-          <w:rFonts w:ascii="Times New Roman" w:hAnsi="Times New Roman" w:cs="Times New Roman"/>
-          <w:color w:val="000000" w:themeColor="text1"/>
-        </w:rPr>
-        <w:t xml:space="preserve"> xu</w:t>
-      </w:r>
-      <w:r>
-        <w:rPr>
-          <w:rFonts w:ascii="Times New Roman" w:hAnsi="Times New Roman" w:cs="Times New Roman"/>
-          <w:color w:val="000000" w:themeColor="text1"/>
-        </w:rPr>
-        <w:t>ấ</w:t>
-      </w:r>
-      <w:r>
-        <w:rPr>
-          <w:rFonts w:ascii="Times New Roman" w:hAnsi="Times New Roman" w:cs="Times New Roman"/>
-          <w:color w:val="000000" w:themeColor="text1"/>
-        </w:rPr>
-        <w:t>t</w:t>
+        <w:t>3.2. Mô hình đề xuất</w:t>
       </w:r>
       <w:bookmarkEnd w:id="22"/>
     </w:p>
@@ -12138,70 +11135,14 @@
           <w:color w:val="000000" w:themeColor="text1"/>
         </w:rPr>
       </w:pPr>
-      <w:bookmarkStart w:id="23" w:name="_Toc236067691"/>
+      <w:bookmarkStart w:id="23" w:name="_Toc236069957"/>
       <w:r>
         <w:rPr>
           <w:rFonts w:ascii="Times New Roman" w:hAnsi="Times New Roman" w:cs="Times New Roman"/>
           <w:color w:val="000000" w:themeColor="text1"/>
         </w:rPr>
         <w:lastRenderedPageBreak/>
-        <w:t>3.3. Môi trư</w:t>
-      </w:r>
-      <w:r>
-        <w:rPr>
-          <w:rFonts w:ascii="Times New Roman" w:hAnsi="Times New Roman" w:cs="Times New Roman"/>
-          <w:color w:val="000000" w:themeColor="text1"/>
-        </w:rPr>
-        <w:t>ờ</w:t>
-      </w:r>
-      <w:r>
-        <w:rPr>
-          <w:rFonts w:ascii="Times New Roman" w:hAnsi="Times New Roman" w:cs="Times New Roman"/>
-          <w:color w:val="000000" w:themeColor="text1"/>
-        </w:rPr>
-        <w:t>ng, công c</w:t>
-      </w:r>
-      <w:r>
-        <w:rPr>
-          <w:rFonts w:ascii="Times New Roman" w:hAnsi="Times New Roman" w:cs="Times New Roman"/>
-          <w:color w:val="000000" w:themeColor="text1"/>
-        </w:rPr>
-        <w:t>ụ</w:t>
-      </w:r>
-      <w:r>
-        <w:rPr>
-          <w:rFonts w:ascii="Times New Roman" w:hAnsi="Times New Roman" w:cs="Times New Roman"/>
-          <w:color w:val="000000" w:themeColor="text1"/>
-        </w:rPr>
-        <w:t xml:space="preserve"> và d</w:t>
-      </w:r>
-      <w:r>
-        <w:rPr>
-          <w:rFonts w:ascii="Times New Roman" w:hAnsi="Times New Roman" w:cs="Times New Roman"/>
-          <w:color w:val="000000" w:themeColor="text1"/>
-        </w:rPr>
-        <w:t>ữ</w:t>
-      </w:r>
-      <w:r>
-        <w:rPr>
-          <w:rFonts w:ascii="Times New Roman" w:hAnsi="Times New Roman" w:cs="Times New Roman"/>
-          <w:color w:val="000000" w:themeColor="text1"/>
-        </w:rPr>
-        <w:t xml:space="preserve"> li</w:t>
-      </w:r>
-      <w:r>
-        <w:rPr>
-          <w:rFonts w:ascii="Times New Roman" w:hAnsi="Times New Roman" w:cs="Times New Roman"/>
-          <w:color w:val="000000" w:themeColor="text1"/>
-        </w:rPr>
-        <w:t>ệ</w:t>
-      </w:r>
-      <w:r>
-        <w:rPr>
-          <w:rFonts w:ascii="Times New Roman" w:hAnsi="Times New Roman" w:cs="Times New Roman"/>
-          <w:color w:val="000000" w:themeColor="text1"/>
-        </w:rPr>
-        <w:t>u</w:t>
+        <w:t>3.3. Môi trường, công cụ và dữ liệu</w:t>
       </w:r>
       <w:bookmarkEnd w:id="23"/>
     </w:p>
@@ -12958,55 +11899,13 @@
           <w:color w:val="000000" w:themeColor="text1"/>
         </w:rPr>
       </w:pPr>
-      <w:bookmarkStart w:id="24" w:name="_Toc236067692"/>
+      <w:bookmarkStart w:id="24" w:name="_Toc236069958"/>
       <w:r>
         <w:rPr>
           <w:rFonts w:ascii="Times New Roman" w:hAnsi="Times New Roman" w:cs="Times New Roman"/>
           <w:color w:val="000000" w:themeColor="text1"/>
         </w:rPr>
-        <w:t>3.4. Quy trình và m</w:t>
-      </w:r>
-      <w:r>
-        <w:rPr>
-          <w:rFonts w:ascii="Times New Roman" w:hAnsi="Times New Roman" w:cs="Times New Roman"/>
-          <w:color w:val="000000" w:themeColor="text1"/>
-        </w:rPr>
-        <w:t>ố</w:t>
-      </w:r>
-      <w:r>
-        <w:rPr>
-          <w:rFonts w:ascii="Times New Roman" w:hAnsi="Times New Roman" w:cs="Times New Roman"/>
-          <w:color w:val="000000" w:themeColor="text1"/>
-        </w:rPr>
-        <w:t>c th</w:t>
-      </w:r>
-      <w:r>
-        <w:rPr>
-          <w:rFonts w:ascii="Times New Roman" w:hAnsi="Times New Roman" w:cs="Times New Roman"/>
-          <w:color w:val="000000" w:themeColor="text1"/>
-        </w:rPr>
-        <w:t>ự</w:t>
-      </w:r>
-      <w:r>
-        <w:rPr>
-          <w:rFonts w:ascii="Times New Roman" w:hAnsi="Times New Roman" w:cs="Times New Roman"/>
-          <w:color w:val="000000" w:themeColor="text1"/>
-        </w:rPr>
-        <w:t>c hi</w:t>
-      </w:r>
-      <w:r>
-        <w:rPr>
-          <w:rFonts w:ascii="Times New Roman" w:hAnsi="Times New Roman" w:cs="Times New Roman"/>
-          <w:color w:val="000000" w:themeColor="text1"/>
-        </w:rPr>
-        <w:t>ệ</w:t>
-      </w:r>
-      <w:r>
-        <w:rPr>
-          <w:rFonts w:ascii="Times New Roman" w:hAnsi="Times New Roman" w:cs="Times New Roman"/>
-          <w:color w:val="000000" w:themeColor="text1"/>
-        </w:rPr>
-        <w:t>n</w:t>
+        <w:t>3.4. Quy trình và mốc thực hiện</w:t>
       </w:r>
       <w:bookmarkEnd w:id="24"/>
     </w:p>
@@ -13670,28 +12569,14 @@
           <w:color w:val="000000" w:themeColor="text1"/>
         </w:rPr>
       </w:pPr>
-      <w:bookmarkStart w:id="25" w:name="_Toc236067693"/>
+      <w:bookmarkStart w:id="25" w:name="_Toc236069959"/>
       <w:r>
         <w:rPr>
           <w:rFonts w:ascii="Times New Roman" w:hAnsi="Times New Roman" w:cs="Times New Roman"/>
           <w:color w:val="000000" w:themeColor="text1"/>
         </w:rPr>
         <w:lastRenderedPageBreak/>
-        <w:t>3.5. Tiêu chí đánh giá và ngư</w:t>
-      </w:r>
-      <w:r>
-        <w:rPr>
-          <w:rFonts w:ascii="Times New Roman" w:hAnsi="Times New Roman" w:cs="Times New Roman"/>
-          <w:color w:val="000000" w:themeColor="text1"/>
-        </w:rPr>
-        <w:t>ỡ</w:t>
-      </w:r>
-      <w:r>
-        <w:rPr>
-          <w:rFonts w:ascii="Times New Roman" w:hAnsi="Times New Roman" w:cs="Times New Roman"/>
-          <w:color w:val="000000" w:themeColor="text1"/>
-        </w:rPr>
-        <w:t>ng PASS</w:t>
+        <w:t>3.5. Tiêu chí đánh giá và ngưỡng PASS</w:t>
       </w:r>
       <w:bookmarkEnd w:id="25"/>
     </w:p>
@@ -14219,7 +13104,7 @@
           <w:szCs w:val="26"/>
         </w:rPr>
       </w:pPr>
-      <w:bookmarkStart w:id="26" w:name="_Toc236067694"/>
+      <w:bookmarkStart w:id="26" w:name="_Toc236069960"/>
       <w:r>
         <w:rPr>
           <w:rFonts w:ascii="Times New Roman" w:hAnsi="Times New Roman" w:cs="Times New Roman"/>
@@ -14228,52 +13113,7 @@
           <w:szCs w:val="26"/>
         </w:rPr>
         <w:lastRenderedPageBreak/>
-        <w:t>CHƯƠNG 4. TRI</w:t>
-      </w:r>
-      <w:r>
-        <w:rPr>
-          <w:rFonts w:ascii="Times New Roman" w:hAnsi="Times New Roman" w:cs="Times New Roman"/>
-          <w:color w:val="000000" w:themeColor="text1"/>
-          <w:sz w:val="26"/>
-          <w:szCs w:val="26"/>
-        </w:rPr>
-        <w:t>Ể</w:t>
-      </w:r>
-      <w:r>
-        <w:rPr>
-          <w:rFonts w:ascii="Times New Roman" w:hAnsi="Times New Roman" w:cs="Times New Roman"/>
-          <w:color w:val="000000" w:themeColor="text1"/>
-          <w:sz w:val="26"/>
-          <w:szCs w:val="26"/>
-        </w:rPr>
-        <w:t>N KHAI VÀ K</w:t>
-      </w:r>
-      <w:r>
-        <w:rPr>
-          <w:rFonts w:ascii="Times New Roman" w:hAnsi="Times New Roman" w:cs="Times New Roman"/>
-          <w:color w:val="000000" w:themeColor="text1"/>
-          <w:sz w:val="26"/>
-          <w:szCs w:val="26"/>
-        </w:rPr>
-        <w:t>Ế</w:t>
-      </w:r>
-      <w:r>
-        <w:rPr>
-          <w:rFonts w:ascii="Times New Roman" w:hAnsi="Times New Roman" w:cs="Times New Roman"/>
-          <w:color w:val="000000" w:themeColor="text1"/>
-          <w:sz w:val="26"/>
-          <w:szCs w:val="26"/>
-        </w:rPr>
-        <w:t>T QU</w:t>
-      </w:r>
-      <w:r>
-        <w:rPr>
-          <w:rFonts w:ascii="Times New Roman" w:hAnsi="Times New Roman" w:cs="Times New Roman"/>
-          <w:color w:val="000000" w:themeColor="text1"/>
-          <w:sz w:val="26"/>
-          <w:szCs w:val="26"/>
-        </w:rPr>
-        <w:t>Ả</w:t>
+        <w:t>CHƯƠNG 4. TRIỂN KHAI VÀ KẾT QUẢ</w:t>
       </w:r>
       <w:bookmarkEnd w:id="26"/>
     </w:p>
@@ -14286,83 +13126,13 @@
           <w:color w:val="000000" w:themeColor="text1"/>
         </w:rPr>
       </w:pPr>
-      <w:bookmarkStart w:id="27" w:name="_Toc236067695"/>
+      <w:bookmarkStart w:id="27" w:name="_Toc236069961"/>
       <w:r>
         <w:rPr>
           <w:rFonts w:ascii="Times New Roman" w:hAnsi="Times New Roman" w:cs="Times New Roman"/>
           <w:color w:val="000000" w:themeColor="text1"/>
         </w:rPr>
-        <w:t>4.1. Chu</w:t>
-      </w:r>
-      <w:r>
-        <w:rPr>
-          <w:rFonts w:ascii="Times New Roman" w:hAnsi="Times New Roman" w:cs="Times New Roman"/>
-          <w:color w:val="000000" w:themeColor="text1"/>
-        </w:rPr>
-        <w:t>ẩ</w:t>
-      </w:r>
-      <w:r>
-        <w:rPr>
-          <w:rFonts w:ascii="Times New Roman" w:hAnsi="Times New Roman" w:cs="Times New Roman"/>
-          <w:color w:val="000000" w:themeColor="text1"/>
-        </w:rPr>
-        <w:t>n b</w:t>
-      </w:r>
-      <w:r>
-        <w:rPr>
-          <w:rFonts w:ascii="Times New Roman" w:hAnsi="Times New Roman" w:cs="Times New Roman"/>
-          <w:color w:val="000000" w:themeColor="text1"/>
-        </w:rPr>
-        <w:t>ị</w:t>
-      </w:r>
-      <w:r>
-        <w:rPr>
-          <w:rFonts w:ascii="Times New Roman" w:hAnsi="Times New Roman" w:cs="Times New Roman"/>
-          <w:color w:val="000000" w:themeColor="text1"/>
-        </w:rPr>
-        <w:t xml:space="preserve"> môi trư</w:t>
-      </w:r>
-      <w:r>
-        <w:rPr>
-          <w:rFonts w:ascii="Times New Roman" w:hAnsi="Times New Roman" w:cs="Times New Roman"/>
-          <w:color w:val="000000" w:themeColor="text1"/>
-        </w:rPr>
-        <w:t>ờ</w:t>
-      </w:r>
-      <w:r>
-        <w:rPr>
-          <w:rFonts w:ascii="Times New Roman" w:hAnsi="Times New Roman" w:cs="Times New Roman"/>
-          <w:color w:val="000000" w:themeColor="text1"/>
-        </w:rPr>
-        <w:t>ng và ch</w:t>
-      </w:r>
-      <w:r>
-        <w:rPr>
-          <w:rFonts w:ascii="Times New Roman" w:hAnsi="Times New Roman" w:cs="Times New Roman"/>
-          <w:color w:val="000000" w:themeColor="text1"/>
-        </w:rPr>
-        <w:t>ạ</w:t>
-      </w:r>
-      <w:r>
-        <w:rPr>
-          <w:rFonts w:ascii="Times New Roman" w:hAnsi="Times New Roman" w:cs="Times New Roman"/>
-          <w:color w:val="000000" w:themeColor="text1"/>
-        </w:rPr>
-        <w:t>y mô ph</w:t>
-      </w:r>
-      <w:r>
-        <w:rPr>
-          <w:rFonts w:ascii="Times New Roman" w:hAnsi="Times New Roman" w:cs="Times New Roman"/>
-          <w:color w:val="000000" w:themeColor="text1"/>
-        </w:rPr>
-        <w:t>ỏ</w:t>
-      </w:r>
-      <w:r>
-        <w:rPr>
-          <w:rFonts w:ascii="Times New Roman" w:hAnsi="Times New Roman" w:cs="Times New Roman"/>
-          <w:color w:val="000000" w:themeColor="text1"/>
-        </w:rPr>
-        <w:t>ng</w:t>
+        <w:t>4.1. Chuẩn bị môi trường và chạy mô phỏng</w:t>
       </w:r>
       <w:bookmarkEnd w:id="27"/>
     </w:p>
@@ -14596,69 +13366,13 @@
           <w:color w:val="000000" w:themeColor="text1"/>
         </w:rPr>
       </w:pPr>
-      <w:bookmarkStart w:id="28" w:name="_Toc236067696"/>
+      <w:bookmarkStart w:id="28" w:name="_Toc236069962"/>
       <w:r>
         <w:rPr>
           <w:rFonts w:ascii="Times New Roman" w:hAnsi="Times New Roman" w:cs="Times New Roman"/>
           <w:color w:val="000000" w:themeColor="text1"/>
         </w:rPr>
-        <w:t>4.2. Thành ph</w:t>
-      </w:r>
-      <w:r>
-        <w:rPr>
-          <w:rFonts w:ascii="Times New Roman" w:hAnsi="Times New Roman" w:cs="Times New Roman"/>
-          <w:color w:val="000000" w:themeColor="text1"/>
-        </w:rPr>
-        <w:t>ầ</w:t>
-      </w:r>
-      <w:r>
-        <w:rPr>
-          <w:rFonts w:ascii="Times New Roman" w:hAnsi="Times New Roman" w:cs="Times New Roman"/>
-          <w:color w:val="000000" w:themeColor="text1"/>
-        </w:rPr>
-        <w:t>n s</w:t>
-      </w:r>
-      <w:r>
-        <w:rPr>
-          <w:rFonts w:ascii="Times New Roman" w:hAnsi="Times New Roman" w:cs="Times New Roman"/>
-          <w:color w:val="000000" w:themeColor="text1"/>
-        </w:rPr>
-        <w:t>ả</w:t>
-      </w:r>
-      <w:r>
-        <w:rPr>
-          <w:rFonts w:ascii="Times New Roman" w:hAnsi="Times New Roman" w:cs="Times New Roman"/>
-          <w:color w:val="000000" w:themeColor="text1"/>
-        </w:rPr>
-        <w:t>n ph</w:t>
-      </w:r>
-      <w:r>
-        <w:rPr>
-          <w:rFonts w:ascii="Times New Roman" w:hAnsi="Times New Roman" w:cs="Times New Roman"/>
-          <w:color w:val="000000" w:themeColor="text1"/>
-        </w:rPr>
-        <w:t>ẩ</w:t>
-      </w:r>
-      <w:r>
-        <w:rPr>
-          <w:rFonts w:ascii="Times New Roman" w:hAnsi="Times New Roman" w:cs="Times New Roman"/>
-          <w:color w:val="000000" w:themeColor="text1"/>
-        </w:rPr>
-        <w:t>m và c</w:t>
-      </w:r>
-      <w:r>
-        <w:rPr>
-          <w:rFonts w:ascii="Times New Roman" w:hAnsi="Times New Roman" w:cs="Times New Roman"/>
-          <w:color w:val="000000" w:themeColor="text1"/>
-        </w:rPr>
-        <w:t>ấ</w:t>
-      </w:r>
-      <w:r>
-        <w:rPr>
-          <w:rFonts w:ascii="Times New Roman" w:hAnsi="Times New Roman" w:cs="Times New Roman"/>
-          <w:color w:val="000000" w:themeColor="text1"/>
-        </w:rPr>
-        <w:t>u trúc repository</w:t>
+        <w:t>4.2. Thành phần sản phẩm và cấu trúc repository</w:t>
       </w:r>
       <w:bookmarkEnd w:id="28"/>
     </w:p>
@@ -15409,62 +14123,13 @@
           <w:color w:val="000000" w:themeColor="text1"/>
         </w:rPr>
       </w:pPr>
-      <w:bookmarkStart w:id="29" w:name="_Toc236067697"/>
+      <w:bookmarkStart w:id="29" w:name="_Toc236069963"/>
       <w:r>
         <w:rPr>
           <w:rFonts w:ascii="Times New Roman" w:hAnsi="Times New Roman" w:cs="Times New Roman"/>
           <w:color w:val="000000" w:themeColor="text1"/>
         </w:rPr>
-        <w:t>4.3. K</w:t>
-      </w:r>
-      <w:r>
-        <w:rPr>
-          <w:rFonts w:ascii="Times New Roman" w:hAnsi="Times New Roman" w:cs="Times New Roman"/>
-          <w:color w:val="000000" w:themeColor="text1"/>
-        </w:rPr>
-        <w:t>ị</w:t>
-      </w:r>
-      <w:r>
-        <w:rPr>
-          <w:rFonts w:ascii="Times New Roman" w:hAnsi="Times New Roman" w:cs="Times New Roman"/>
-          <w:color w:val="000000" w:themeColor="text1"/>
-        </w:rPr>
-        <w:t>ch b</w:t>
-      </w:r>
-      <w:r>
-        <w:rPr>
-          <w:rFonts w:ascii="Times New Roman" w:hAnsi="Times New Roman" w:cs="Times New Roman"/>
-          <w:color w:val="000000" w:themeColor="text1"/>
-        </w:rPr>
-        <w:t>ả</w:t>
-      </w:r>
-      <w:r>
-        <w:rPr>
-          <w:rFonts w:ascii="Times New Roman" w:hAnsi="Times New Roman" w:cs="Times New Roman"/>
-          <w:color w:val="000000" w:themeColor="text1"/>
-        </w:rPr>
-        <w:t>n ki</w:t>
-      </w:r>
-      <w:r>
-        <w:rPr>
-          <w:rFonts w:ascii="Times New Roman" w:hAnsi="Times New Roman" w:cs="Times New Roman"/>
-          <w:color w:val="000000" w:themeColor="text1"/>
-        </w:rPr>
-        <w:t>ể</w:t>
-      </w:r>
-      <w:r>
-        <w:rPr>
-          <w:rFonts w:ascii="Times New Roman" w:hAnsi="Times New Roman" w:cs="Times New Roman"/>
-          <w:color w:val="000000" w:themeColor="text1"/>
-        </w:rPr>
-        <w:t>m th</w:t>
-      </w:r>
-      <w:r>
-        <w:rPr>
-          <w:rFonts w:ascii="Times New Roman" w:hAnsi="Times New Roman" w:cs="Times New Roman"/>
-          <w:color w:val="000000" w:themeColor="text1"/>
-        </w:rPr>
-        <w:t>ử</w:t>
+        <w:t>4.3. Kịch bản kiểm thử</w:t>
       </w:r>
       <w:bookmarkEnd w:id="29"/>
     </w:p>
@@ -16268,69 +14933,13 @@
           <w:color w:val="000000" w:themeColor="text1"/>
         </w:rPr>
       </w:pPr>
-      <w:bookmarkStart w:id="30" w:name="_Toc236067698"/>
+      <w:bookmarkStart w:id="30" w:name="_Toc236069964"/>
       <w:r>
         <w:rPr>
           <w:rFonts w:ascii="Times New Roman" w:hAnsi="Times New Roman" w:cs="Times New Roman"/>
           <w:color w:val="000000" w:themeColor="text1"/>
         </w:rPr>
-        <w:t>4.4. K</w:t>
-      </w:r>
-      <w:r>
-        <w:rPr>
-          <w:rFonts w:ascii="Times New Roman" w:hAnsi="Times New Roman" w:cs="Times New Roman"/>
-          <w:color w:val="000000" w:themeColor="text1"/>
-        </w:rPr>
-        <w:t>ế</w:t>
-      </w:r>
-      <w:r>
-        <w:rPr>
-          <w:rFonts w:ascii="Times New Roman" w:hAnsi="Times New Roman" w:cs="Times New Roman"/>
-          <w:color w:val="000000" w:themeColor="text1"/>
-        </w:rPr>
-        <w:t>t qu</w:t>
-      </w:r>
-      <w:r>
-        <w:rPr>
-          <w:rFonts w:ascii="Times New Roman" w:hAnsi="Times New Roman" w:cs="Times New Roman"/>
-          <w:color w:val="000000" w:themeColor="text1"/>
-        </w:rPr>
-        <w:t>ả</w:t>
-      </w:r>
-      <w:r>
-        <w:rPr>
-          <w:rFonts w:ascii="Times New Roman" w:hAnsi="Times New Roman" w:cs="Times New Roman"/>
-          <w:color w:val="000000" w:themeColor="text1"/>
-        </w:rPr>
-        <w:t xml:space="preserve"> và đ</w:t>
-      </w:r>
-      <w:r>
-        <w:rPr>
-          <w:rFonts w:ascii="Times New Roman" w:hAnsi="Times New Roman" w:cs="Times New Roman"/>
-          <w:color w:val="000000" w:themeColor="text1"/>
-        </w:rPr>
-        <w:t>ố</w:t>
-      </w:r>
-      <w:r>
-        <w:rPr>
-          <w:rFonts w:ascii="Times New Roman" w:hAnsi="Times New Roman" w:cs="Times New Roman"/>
-          <w:color w:val="000000" w:themeColor="text1"/>
-        </w:rPr>
-        <w:t>i chi</w:t>
-      </w:r>
-      <w:r>
-        <w:rPr>
-          <w:rFonts w:ascii="Times New Roman" w:hAnsi="Times New Roman" w:cs="Times New Roman"/>
-          <w:color w:val="000000" w:themeColor="text1"/>
-        </w:rPr>
-        <w:t>ế</w:t>
-      </w:r>
-      <w:r>
-        <w:rPr>
-          <w:rFonts w:ascii="Times New Roman" w:hAnsi="Times New Roman" w:cs="Times New Roman"/>
-          <w:color w:val="000000" w:themeColor="text1"/>
-        </w:rPr>
-        <w:t>u tiêu chí</w:t>
+        <w:t>4.4. Kết quả và đối chiếu tiêu chí</w:t>
       </w:r>
       <w:bookmarkEnd w:id="30"/>
     </w:p>
@@ -17163,62 +15772,13 @@
           <w:color w:val="000000" w:themeColor="text1"/>
         </w:rPr>
       </w:pPr>
-      <w:bookmarkStart w:id="31" w:name="_Toc236067699"/>
+      <w:bookmarkStart w:id="31" w:name="_Toc236069965"/>
       <w:r>
         <w:rPr>
           <w:rFonts w:ascii="Times New Roman" w:hAnsi="Times New Roman" w:cs="Times New Roman"/>
           <w:color w:val="000000" w:themeColor="text1"/>
         </w:rPr>
-        <w:t>4.5. Script t</w:t>
-      </w:r>
-      <w:r>
-        <w:rPr>
-          <w:rFonts w:ascii="Times New Roman" w:hAnsi="Times New Roman" w:cs="Times New Roman"/>
-          <w:color w:val="000000" w:themeColor="text1"/>
-        </w:rPr>
-        <w:t>ổ</w:t>
-      </w:r>
-      <w:r>
-        <w:rPr>
-          <w:rFonts w:ascii="Times New Roman" w:hAnsi="Times New Roman" w:cs="Times New Roman"/>
-          <w:color w:val="000000" w:themeColor="text1"/>
-        </w:rPr>
-        <w:t>ng h</w:t>
-      </w:r>
-      <w:r>
-        <w:rPr>
-          <w:rFonts w:ascii="Times New Roman" w:hAnsi="Times New Roman" w:cs="Times New Roman"/>
-          <w:color w:val="000000" w:themeColor="text1"/>
-        </w:rPr>
-        <w:t>ợ</w:t>
-      </w:r>
-      <w:r>
-        <w:rPr>
-          <w:rFonts w:ascii="Times New Roman" w:hAnsi="Times New Roman" w:cs="Times New Roman"/>
-          <w:color w:val="000000" w:themeColor="text1"/>
-        </w:rPr>
-        <w:t>p k</w:t>
-      </w:r>
-      <w:r>
-        <w:rPr>
-          <w:rFonts w:ascii="Times New Roman" w:hAnsi="Times New Roman" w:cs="Times New Roman"/>
-          <w:color w:val="000000" w:themeColor="text1"/>
-        </w:rPr>
-        <w:t>ế</w:t>
-      </w:r>
-      <w:r>
-        <w:rPr>
-          <w:rFonts w:ascii="Times New Roman" w:hAnsi="Times New Roman" w:cs="Times New Roman"/>
-          <w:color w:val="000000" w:themeColor="text1"/>
-        </w:rPr>
-        <w:t>t qu</w:t>
-      </w:r>
-      <w:r>
-        <w:rPr>
-          <w:rFonts w:ascii="Times New Roman" w:hAnsi="Times New Roman" w:cs="Times New Roman"/>
-          <w:color w:val="000000" w:themeColor="text1"/>
-        </w:rPr>
-        <w:t>ả</w:t>
+        <w:t>4.5. Script tổng hợp kết quả</w:t>
       </w:r>
       <w:bookmarkEnd w:id="31"/>
     </w:p>
@@ -17399,69 +15959,13 @@
           <w:color w:val="000000" w:themeColor="text1"/>
         </w:rPr>
       </w:pPr>
-      <w:bookmarkStart w:id="32" w:name="_Toc236067700"/>
+      <w:bookmarkStart w:id="32" w:name="_Toc236069966"/>
       <w:r>
         <w:rPr>
           <w:rFonts w:ascii="Times New Roman" w:hAnsi="Times New Roman" w:cs="Times New Roman"/>
           <w:color w:val="000000" w:themeColor="text1"/>
         </w:rPr>
-        <w:t>4.6. Th</w:t>
-      </w:r>
-      <w:r>
-        <w:rPr>
-          <w:rFonts w:ascii="Times New Roman" w:hAnsi="Times New Roman" w:cs="Times New Roman"/>
-          <w:color w:val="000000" w:themeColor="text1"/>
-        </w:rPr>
-        <w:t>ả</w:t>
-      </w:r>
-      <w:r>
-        <w:rPr>
-          <w:rFonts w:ascii="Times New Roman" w:hAnsi="Times New Roman" w:cs="Times New Roman"/>
-          <w:color w:val="000000" w:themeColor="text1"/>
-        </w:rPr>
-        <w:t>o lu</w:t>
-      </w:r>
-      <w:r>
-        <w:rPr>
-          <w:rFonts w:ascii="Times New Roman" w:hAnsi="Times New Roman" w:cs="Times New Roman"/>
-          <w:color w:val="000000" w:themeColor="text1"/>
-        </w:rPr>
-        <w:t>ậ</w:t>
-      </w:r>
-      <w:r>
-        <w:rPr>
-          <w:rFonts w:ascii="Times New Roman" w:hAnsi="Times New Roman" w:cs="Times New Roman"/>
-          <w:color w:val="000000" w:themeColor="text1"/>
-        </w:rPr>
-        <w:t>n và gi</w:t>
-      </w:r>
-      <w:r>
-        <w:rPr>
-          <w:rFonts w:ascii="Times New Roman" w:hAnsi="Times New Roman" w:cs="Times New Roman"/>
-          <w:color w:val="000000" w:themeColor="text1"/>
-        </w:rPr>
-        <w:t>ớ</w:t>
-      </w:r>
-      <w:r>
-        <w:rPr>
-          <w:rFonts w:ascii="Times New Roman" w:hAnsi="Times New Roman" w:cs="Times New Roman"/>
-          <w:color w:val="000000" w:themeColor="text1"/>
-        </w:rPr>
-        <w:t>i h</w:t>
-      </w:r>
-      <w:r>
-        <w:rPr>
-          <w:rFonts w:ascii="Times New Roman" w:hAnsi="Times New Roman" w:cs="Times New Roman"/>
-          <w:color w:val="000000" w:themeColor="text1"/>
-        </w:rPr>
-        <w:t>ạ</w:t>
-      </w:r>
-      <w:r>
-        <w:rPr>
-          <w:rFonts w:ascii="Times New Roman" w:hAnsi="Times New Roman" w:cs="Times New Roman"/>
-          <w:color w:val="000000" w:themeColor="text1"/>
-        </w:rPr>
-        <w:t>n</w:t>
+        <w:t>4.6. Thảo luận và giới hạn</w:t>
       </w:r>
       <w:bookmarkEnd w:id="32"/>
     </w:p>
@@ -17542,7 +16046,7 @@
           <w:szCs w:val="26"/>
         </w:rPr>
       </w:pPr>
-      <w:bookmarkStart w:id="33" w:name="_Toc236067701"/>
+      <w:bookmarkStart w:id="33" w:name="_Toc236069967"/>
       <w:r>
         <w:rPr>
           <w:rFonts w:ascii="Times New Roman" w:hAnsi="Times New Roman" w:cs="Times New Roman"/>
@@ -17551,43 +16055,7 @@
           <w:szCs w:val="26"/>
         </w:rPr>
         <w:lastRenderedPageBreak/>
-        <w:t>CHƯƠNG 5. ĐÁNH GIÁ B</w:t>
-      </w:r>
-      <w:r>
-        <w:rPr>
-          <w:rFonts w:ascii="Times New Roman" w:hAnsi="Times New Roman" w:cs="Times New Roman"/>
-          <w:color w:val="000000" w:themeColor="text1"/>
-          <w:sz w:val="26"/>
-          <w:szCs w:val="26"/>
-        </w:rPr>
-        <w:t>Ả</w:t>
-      </w:r>
-      <w:r>
-        <w:rPr>
-          <w:rFonts w:ascii="Times New Roman" w:hAnsi="Times New Roman" w:cs="Times New Roman"/>
-          <w:color w:val="000000" w:themeColor="text1"/>
-          <w:sz w:val="26"/>
-          <w:szCs w:val="26"/>
-        </w:rPr>
-        <w:t>O M</w:t>
-      </w:r>
-      <w:r>
-        <w:rPr>
-          <w:rFonts w:ascii="Times New Roman" w:hAnsi="Times New Roman" w:cs="Times New Roman"/>
-          <w:color w:val="000000" w:themeColor="text1"/>
-          <w:sz w:val="26"/>
-          <w:szCs w:val="26"/>
-        </w:rPr>
-        <w:t>Ậ</w:t>
-      </w:r>
-      <w:r>
-        <w:rPr>
-          <w:rFonts w:ascii="Times New Roman" w:hAnsi="Times New Roman" w:cs="Times New Roman"/>
-          <w:color w:val="000000" w:themeColor="text1"/>
-          <w:sz w:val="26"/>
-          <w:szCs w:val="26"/>
-        </w:rPr>
-        <w:t>T</w:t>
+        <w:t>CHƯƠNG 5. ĐÁNH GIÁ BẢO MẬT</w:t>
       </w:r>
       <w:bookmarkEnd w:id="33"/>
     </w:p>
@@ -17600,41 +16068,13 @@
           <w:color w:val="000000" w:themeColor="text1"/>
         </w:rPr>
       </w:pPr>
-      <w:bookmarkStart w:id="34" w:name="_Toc236067702"/>
+      <w:bookmarkStart w:id="34" w:name="_Toc236069968"/>
       <w:r>
         <w:rPr>
           <w:rFonts w:ascii="Times New Roman" w:hAnsi="Times New Roman" w:cs="Times New Roman"/>
           <w:color w:val="000000" w:themeColor="text1"/>
         </w:rPr>
-        <w:t>5.1. Tài s</w:t>
-      </w:r>
-      <w:r>
-        <w:rPr>
-          <w:rFonts w:ascii="Times New Roman" w:hAnsi="Times New Roman" w:cs="Times New Roman"/>
-          <w:color w:val="000000" w:themeColor="text1"/>
-        </w:rPr>
-        <w:t>ả</w:t>
-      </w:r>
-      <w:r>
-        <w:rPr>
-          <w:rFonts w:ascii="Times New Roman" w:hAnsi="Times New Roman" w:cs="Times New Roman"/>
-          <w:color w:val="000000" w:themeColor="text1"/>
-        </w:rPr>
-        <w:t>n và yêu c</w:t>
-      </w:r>
-      <w:r>
-        <w:rPr>
-          <w:rFonts w:ascii="Times New Roman" w:hAnsi="Times New Roman" w:cs="Times New Roman"/>
-          <w:color w:val="000000" w:themeColor="text1"/>
-        </w:rPr>
-        <w:t>ầ</w:t>
-      </w:r>
-      <w:r>
-        <w:rPr>
-          <w:rFonts w:ascii="Times New Roman" w:hAnsi="Times New Roman" w:cs="Times New Roman"/>
-          <w:color w:val="000000" w:themeColor="text1"/>
-        </w:rPr>
-        <w:t>u CIA</w:t>
+        <w:t>5.1. Tài sản và yêu cầu CIA</w:t>
       </w:r>
       <w:bookmarkEnd w:id="34"/>
     </w:p>
@@ -18735,69 +17175,13 @@
           <w:color w:val="000000" w:themeColor="text1"/>
         </w:rPr>
       </w:pPr>
-      <w:bookmarkStart w:id="35" w:name="_Toc236067703"/>
+      <w:bookmarkStart w:id="35" w:name="_Toc236069969"/>
       <w:r>
         <w:rPr>
           <w:rFonts w:ascii="Times New Roman" w:hAnsi="Times New Roman" w:cs="Times New Roman"/>
           <w:color w:val="000000" w:themeColor="text1"/>
         </w:rPr>
-        <w:t>5.2. Phân tích STRIDE g</w:t>
-      </w:r>
-      <w:r>
-        <w:rPr>
-          <w:rFonts w:ascii="Times New Roman" w:hAnsi="Times New Roman" w:cs="Times New Roman"/>
-          <w:color w:val="000000" w:themeColor="text1"/>
-        </w:rPr>
-        <w:t>ắ</w:t>
-      </w:r>
-      <w:r>
-        <w:rPr>
-          <w:rFonts w:ascii="Times New Roman" w:hAnsi="Times New Roman" w:cs="Times New Roman"/>
-          <w:color w:val="000000" w:themeColor="text1"/>
-        </w:rPr>
-        <w:t>n v</w:t>
-      </w:r>
-      <w:r>
-        <w:rPr>
-          <w:rFonts w:ascii="Times New Roman" w:hAnsi="Times New Roman" w:cs="Times New Roman"/>
-          <w:color w:val="000000" w:themeColor="text1"/>
-        </w:rPr>
-        <w:t>ớ</w:t>
-      </w:r>
-      <w:r>
-        <w:rPr>
-          <w:rFonts w:ascii="Times New Roman" w:hAnsi="Times New Roman" w:cs="Times New Roman"/>
-          <w:color w:val="000000" w:themeColor="text1"/>
-        </w:rPr>
-        <w:t>i h</w:t>
-      </w:r>
-      <w:r>
-        <w:rPr>
-          <w:rFonts w:ascii="Times New Roman" w:hAnsi="Times New Roman" w:cs="Times New Roman"/>
-          <w:color w:val="000000" w:themeColor="text1"/>
-        </w:rPr>
-        <w:t>ệ</w:t>
-      </w:r>
-      <w:r>
-        <w:rPr>
-          <w:rFonts w:ascii="Times New Roman" w:hAnsi="Times New Roman" w:cs="Times New Roman"/>
-          <w:color w:val="000000" w:themeColor="text1"/>
-        </w:rPr>
-        <w:t xml:space="preserve"> th</w:t>
-      </w:r>
-      <w:r>
-        <w:rPr>
-          <w:rFonts w:ascii="Times New Roman" w:hAnsi="Times New Roman" w:cs="Times New Roman"/>
-          <w:color w:val="000000" w:themeColor="text1"/>
-        </w:rPr>
-        <w:t>ố</w:t>
-      </w:r>
-      <w:r>
-        <w:rPr>
-          <w:rFonts w:ascii="Times New Roman" w:hAnsi="Times New Roman" w:cs="Times New Roman"/>
-          <w:color w:val="000000" w:themeColor="text1"/>
-        </w:rPr>
-        <w:t>ng</w:t>
+        <w:t>5.2. Phân tích STRIDE gắn với hệ thống</w:t>
       </w:r>
       <w:bookmarkEnd w:id="35"/>
     </w:p>
@@ -19561,42 +17945,14 @@
           <w:color w:val="000000" w:themeColor="text1"/>
         </w:rPr>
       </w:pPr>
-      <w:bookmarkStart w:id="36" w:name="_Toc236067704"/>
+      <w:bookmarkStart w:id="36" w:name="_Toc236069970"/>
       <w:r>
         <w:rPr>
           <w:rFonts w:ascii="Times New Roman" w:hAnsi="Times New Roman" w:cs="Times New Roman"/>
           <w:color w:val="000000" w:themeColor="text1"/>
         </w:rPr>
         <w:lastRenderedPageBreak/>
-        <w:t>5.3. Ma tr</w:t>
-      </w:r>
-      <w:r>
-        <w:rPr>
-          <w:rFonts w:ascii="Times New Roman" w:hAnsi="Times New Roman" w:cs="Times New Roman"/>
-          <w:color w:val="000000" w:themeColor="text1"/>
-        </w:rPr>
-        <w:t>ậ</w:t>
-      </w:r>
-      <w:r>
-        <w:rPr>
-          <w:rFonts w:ascii="Times New Roman" w:hAnsi="Times New Roman" w:cs="Times New Roman"/>
-          <w:color w:val="000000" w:themeColor="text1"/>
-        </w:rPr>
-        <w:t>n r</w:t>
-      </w:r>
-      <w:r>
-        <w:rPr>
-          <w:rFonts w:ascii="Times New Roman" w:hAnsi="Times New Roman" w:cs="Times New Roman"/>
-          <w:color w:val="000000" w:themeColor="text1"/>
-        </w:rPr>
-        <w:t>ủ</w:t>
-      </w:r>
-      <w:r>
-        <w:rPr>
-          <w:rFonts w:ascii="Times New Roman" w:hAnsi="Times New Roman" w:cs="Times New Roman"/>
-          <w:color w:val="000000" w:themeColor="text1"/>
-        </w:rPr>
-        <w:t>i ro 5×5 và ưu tiên</w:t>
+        <w:t>5.3. Ma trận rủi ro 5×5 và ưu tiên</w:t>
       </w:r>
       <w:bookmarkEnd w:id="36"/>
     </w:p>
@@ -21488,41 +19844,13 @@
           <w:color w:val="000000" w:themeColor="text1"/>
         </w:rPr>
       </w:pPr>
-      <w:bookmarkStart w:id="37" w:name="_Toc236067705"/>
+      <w:bookmarkStart w:id="37" w:name="_Toc236069971"/>
       <w:r>
         <w:rPr>
           <w:rFonts w:ascii="Times New Roman" w:hAnsi="Times New Roman" w:cs="Times New Roman"/>
           <w:color w:val="000000" w:themeColor="text1"/>
         </w:rPr>
-        <w:t>5.4. Ki</w:t>
-      </w:r>
-      <w:r>
-        <w:rPr>
-          <w:rFonts w:ascii="Times New Roman" w:hAnsi="Times New Roman" w:cs="Times New Roman"/>
-          <w:color w:val="000000" w:themeColor="text1"/>
-        </w:rPr>
-        <w:t>ể</w:t>
-      </w:r>
-      <w:r>
-        <w:rPr>
-          <w:rFonts w:ascii="Times New Roman" w:hAnsi="Times New Roman" w:cs="Times New Roman"/>
-          <w:color w:val="000000" w:themeColor="text1"/>
-        </w:rPr>
-        <w:t>m soát theo r</w:t>
-      </w:r>
-      <w:r>
-        <w:rPr>
-          <w:rFonts w:ascii="Times New Roman" w:hAnsi="Times New Roman" w:cs="Times New Roman"/>
-          <w:color w:val="000000" w:themeColor="text1"/>
-        </w:rPr>
-        <w:t>ủ</w:t>
-      </w:r>
-      <w:r>
-        <w:rPr>
-          <w:rFonts w:ascii="Times New Roman" w:hAnsi="Times New Roman" w:cs="Times New Roman"/>
-          <w:color w:val="000000" w:themeColor="text1"/>
-        </w:rPr>
-        <w:t>i ro ưu tiên</w:t>
+        <w:t>5.4. Kiểm soát theo rủi ro ưu tiên</w:t>
       </w:r>
       <w:bookmarkEnd w:id="37"/>
     </w:p>
@@ -22208,84 +20536,14 @@
           <w:color w:val="000000" w:themeColor="text1"/>
         </w:rPr>
       </w:pPr>
-      <w:bookmarkStart w:id="38" w:name="_Toc236067706"/>
+      <w:bookmarkStart w:id="38" w:name="_Toc236069972"/>
       <w:r>
         <w:rPr>
           <w:rFonts w:ascii="Times New Roman" w:hAnsi="Times New Roman" w:cs="Times New Roman"/>
           <w:color w:val="000000" w:themeColor="text1"/>
         </w:rPr>
         <w:lastRenderedPageBreak/>
-        <w:t>5.5. R</w:t>
-      </w:r>
-      <w:r>
-        <w:rPr>
-          <w:rFonts w:ascii="Times New Roman" w:hAnsi="Times New Roman" w:cs="Times New Roman"/>
-          <w:color w:val="000000" w:themeColor="text1"/>
-        </w:rPr>
-        <w:t>ủ</w:t>
-      </w:r>
-      <w:r>
-        <w:rPr>
-          <w:rFonts w:ascii="Times New Roman" w:hAnsi="Times New Roman" w:cs="Times New Roman"/>
-          <w:color w:val="000000" w:themeColor="text1"/>
-        </w:rPr>
-        <w:t>i ro còn l</w:t>
-      </w:r>
-      <w:r>
-        <w:rPr>
-          <w:rFonts w:ascii="Times New Roman" w:hAnsi="Times New Roman" w:cs="Times New Roman"/>
-          <w:color w:val="000000" w:themeColor="text1"/>
-        </w:rPr>
-        <w:t>ạ</w:t>
-      </w:r>
-      <w:r>
-        <w:rPr>
-          <w:rFonts w:ascii="Times New Roman" w:hAnsi="Times New Roman" w:cs="Times New Roman"/>
-          <w:color w:val="000000" w:themeColor="text1"/>
-        </w:rPr>
-        <w:t>i và đi</w:t>
-      </w:r>
-      <w:r>
-        <w:rPr>
-          <w:rFonts w:ascii="Times New Roman" w:hAnsi="Times New Roman" w:cs="Times New Roman"/>
-          <w:color w:val="000000" w:themeColor="text1"/>
-        </w:rPr>
-        <w:t>ề</w:t>
-      </w:r>
-      <w:r>
-        <w:rPr>
-          <w:rFonts w:ascii="Times New Roman" w:hAnsi="Times New Roman" w:cs="Times New Roman"/>
-          <w:color w:val="000000" w:themeColor="text1"/>
-        </w:rPr>
-        <w:t>u ki</w:t>
-      </w:r>
-      <w:r>
-        <w:rPr>
-          <w:rFonts w:ascii="Times New Roman" w:hAnsi="Times New Roman" w:cs="Times New Roman"/>
-          <w:color w:val="000000" w:themeColor="text1"/>
-        </w:rPr>
-        <w:t>ệ</w:t>
-      </w:r>
-      <w:r>
-        <w:rPr>
-          <w:rFonts w:ascii="Times New Roman" w:hAnsi="Times New Roman" w:cs="Times New Roman"/>
-          <w:color w:val="000000" w:themeColor="text1"/>
-        </w:rPr>
-        <w:t>n xem xét l</w:t>
-      </w:r>
-      <w:r>
-        <w:rPr>
-          <w:rFonts w:ascii="Times New Roman" w:hAnsi="Times New Roman" w:cs="Times New Roman"/>
-          <w:color w:val="000000" w:themeColor="text1"/>
-        </w:rPr>
-        <w:t>ạ</w:t>
-      </w:r>
-      <w:r>
-        <w:rPr>
-          <w:rFonts w:ascii="Times New Roman" w:hAnsi="Times New Roman" w:cs="Times New Roman"/>
-          <w:color w:val="000000" w:themeColor="text1"/>
-        </w:rPr>
-        <w:t>i</w:t>
+        <w:t>5.5. Rủi ro còn lại và điều kiện xem xét lại</w:t>
       </w:r>
       <w:bookmarkEnd w:id="38"/>
     </w:p>
@@ -22347,7 +20605,7 @@
           <w:szCs w:val="26"/>
         </w:rPr>
       </w:pPr>
-      <w:bookmarkStart w:id="39" w:name="_Toc236067707"/>
+      <w:bookmarkStart w:id="39" w:name="_Toc236069973"/>
       <w:r>
         <w:rPr>
           <w:rFonts w:ascii="Times New Roman" w:hAnsi="Times New Roman" w:cs="Times New Roman"/>
@@ -22356,79 +20614,7 @@
           <w:szCs w:val="26"/>
         </w:rPr>
         <w:lastRenderedPageBreak/>
-        <w:t>CHƯƠNG 6. K</w:t>
-      </w:r>
-      <w:r>
-        <w:rPr>
-          <w:rFonts w:ascii="Times New Roman" w:hAnsi="Times New Roman" w:cs="Times New Roman"/>
-          <w:color w:val="000000" w:themeColor="text1"/>
-          <w:sz w:val="26"/>
-          <w:szCs w:val="26"/>
-        </w:rPr>
-        <w:t>Ế</w:t>
-      </w:r>
-      <w:r>
-        <w:rPr>
-          <w:rFonts w:ascii="Times New Roman" w:hAnsi="Times New Roman" w:cs="Times New Roman"/>
-          <w:color w:val="000000" w:themeColor="text1"/>
-          <w:sz w:val="26"/>
-          <w:szCs w:val="26"/>
-        </w:rPr>
-        <w:t>T LU</w:t>
-      </w:r>
-      <w:r>
-        <w:rPr>
-          <w:rFonts w:ascii="Times New Roman" w:hAnsi="Times New Roman" w:cs="Times New Roman"/>
-          <w:color w:val="000000" w:themeColor="text1"/>
-          <w:sz w:val="26"/>
-          <w:szCs w:val="26"/>
-        </w:rPr>
-        <w:t>Ậ</w:t>
-      </w:r>
-      <w:r>
-        <w:rPr>
-          <w:rFonts w:ascii="Times New Roman" w:hAnsi="Times New Roman" w:cs="Times New Roman"/>
-          <w:color w:val="000000" w:themeColor="text1"/>
-          <w:sz w:val="26"/>
-          <w:szCs w:val="26"/>
-        </w:rPr>
-        <w:t>N VÀ HƯ</w:t>
-      </w:r>
-      <w:r>
-        <w:rPr>
-          <w:rFonts w:ascii="Times New Roman" w:hAnsi="Times New Roman" w:cs="Times New Roman"/>
-          <w:color w:val="000000" w:themeColor="text1"/>
-          <w:sz w:val="26"/>
-          <w:szCs w:val="26"/>
-        </w:rPr>
-        <w:t>Ớ</w:t>
-      </w:r>
-      <w:r>
-        <w:rPr>
-          <w:rFonts w:ascii="Times New Roman" w:hAnsi="Times New Roman" w:cs="Times New Roman"/>
-          <w:color w:val="000000" w:themeColor="text1"/>
-          <w:sz w:val="26"/>
-          <w:szCs w:val="26"/>
-        </w:rPr>
-        <w:t>NG PHÁT TRI</w:t>
-      </w:r>
-      <w:r>
-        <w:rPr>
-          <w:rFonts w:ascii="Times New Roman" w:hAnsi="Times New Roman" w:cs="Times New Roman"/>
-          <w:color w:val="000000" w:themeColor="text1"/>
-          <w:sz w:val="26"/>
-          <w:szCs w:val="26"/>
-        </w:rPr>
-        <w:t>Ể</w:t>
-      </w:r>
-      <w:r>
-        <w:rPr>
-          <w:rFonts w:ascii="Times New Roman" w:hAnsi="Times New Roman" w:cs="Times New Roman"/>
-          <w:color w:val="000000" w:themeColor="text1"/>
-          <w:sz w:val="26"/>
-          <w:szCs w:val="26"/>
-        </w:rPr>
-        <w:t>N</w:t>
+        <w:t>CHƯƠNG 6. KẾT LUẬN VÀ HƯỚNG PHÁT TRIỂN</w:t>
       </w:r>
       <w:bookmarkEnd w:id="39"/>
     </w:p>
@@ -22441,55 +20627,13 @@
           <w:color w:val="000000" w:themeColor="text1"/>
         </w:rPr>
       </w:pPr>
-      <w:bookmarkStart w:id="40" w:name="_Toc236067708"/>
+      <w:bookmarkStart w:id="40" w:name="_Toc236069974"/>
       <w:r>
         <w:rPr>
           <w:rFonts w:ascii="Times New Roman" w:hAnsi="Times New Roman" w:cs="Times New Roman"/>
           <w:color w:val="000000" w:themeColor="text1"/>
         </w:rPr>
-        <w:t>6.1. K</w:t>
-      </w:r>
-      <w:r>
-        <w:rPr>
-          <w:rFonts w:ascii="Times New Roman" w:hAnsi="Times New Roman" w:cs="Times New Roman"/>
-          <w:color w:val="000000" w:themeColor="text1"/>
-        </w:rPr>
-        <w:t>ế</w:t>
-      </w:r>
-      <w:r>
-        <w:rPr>
-          <w:rFonts w:ascii="Times New Roman" w:hAnsi="Times New Roman" w:cs="Times New Roman"/>
-          <w:color w:val="000000" w:themeColor="text1"/>
-        </w:rPr>
-        <w:t>t lu</w:t>
-      </w:r>
-      <w:r>
-        <w:rPr>
-          <w:rFonts w:ascii="Times New Roman" w:hAnsi="Times New Roman" w:cs="Times New Roman"/>
-          <w:color w:val="000000" w:themeColor="text1"/>
-        </w:rPr>
-        <w:t>ậ</w:t>
-      </w:r>
-      <w:r>
-        <w:rPr>
-          <w:rFonts w:ascii="Times New Roman" w:hAnsi="Times New Roman" w:cs="Times New Roman"/>
-          <w:color w:val="000000" w:themeColor="text1"/>
-        </w:rPr>
-        <w:t>n theo m</w:t>
-      </w:r>
-      <w:r>
-        <w:rPr>
-          <w:rFonts w:ascii="Times New Roman" w:hAnsi="Times New Roman" w:cs="Times New Roman"/>
-          <w:color w:val="000000" w:themeColor="text1"/>
-        </w:rPr>
-        <w:t>ụ</w:t>
-      </w:r>
-      <w:r>
-        <w:rPr>
-          <w:rFonts w:ascii="Times New Roman" w:hAnsi="Times New Roman" w:cs="Times New Roman"/>
-          <w:color w:val="000000" w:themeColor="text1"/>
-        </w:rPr>
-        <w:t>c tiêu</w:t>
+        <w:t>6.1. Kết luận theo mục tiêu</w:t>
       </w:r>
       <w:bookmarkEnd w:id="40"/>
     </w:p>
@@ -23064,34 +21208,13 @@
           <w:color w:val="000000" w:themeColor="text1"/>
         </w:rPr>
       </w:pPr>
-      <w:bookmarkStart w:id="41" w:name="_Toc236067709"/>
+      <w:bookmarkStart w:id="41" w:name="_Toc236069975"/>
       <w:r>
         <w:rPr>
           <w:rFonts w:ascii="Times New Roman" w:hAnsi="Times New Roman" w:cs="Times New Roman"/>
           <w:color w:val="000000" w:themeColor="text1"/>
         </w:rPr>
-        <w:t>6.2. H</w:t>
-      </w:r>
-      <w:r>
-        <w:rPr>
-          <w:rFonts w:ascii="Times New Roman" w:hAnsi="Times New Roman" w:cs="Times New Roman"/>
-          <w:color w:val="000000" w:themeColor="text1"/>
-        </w:rPr>
-        <w:t>ạ</w:t>
-      </w:r>
-      <w:r>
-        <w:rPr>
-          <w:rFonts w:ascii="Times New Roman" w:hAnsi="Times New Roman" w:cs="Times New Roman"/>
-          <w:color w:val="000000" w:themeColor="text1"/>
-        </w:rPr>
-        <w:t>n ch</w:t>
-      </w:r>
-      <w:r>
-        <w:rPr>
-          <w:rFonts w:ascii="Times New Roman" w:hAnsi="Times New Roman" w:cs="Times New Roman"/>
-          <w:color w:val="000000" w:themeColor="text1"/>
-        </w:rPr>
-        <w:t>ế</w:t>
+        <w:t>6.2. Hạn chế</w:t>
       </w:r>
       <w:bookmarkEnd w:id="41"/>
     </w:p>
@@ -23126,41 +21249,13 @@
           <w:color w:val="000000" w:themeColor="text1"/>
         </w:rPr>
       </w:pPr>
-      <w:bookmarkStart w:id="42" w:name="_Toc236067710"/>
+      <w:bookmarkStart w:id="42" w:name="_Toc236069976"/>
       <w:r>
         <w:rPr>
           <w:rFonts w:ascii="Times New Roman" w:hAnsi="Times New Roman" w:cs="Times New Roman"/>
           <w:color w:val="000000" w:themeColor="text1"/>
         </w:rPr>
-        <w:t>6.3. Hư</w:t>
-      </w:r>
-      <w:r>
-        <w:rPr>
-          <w:rFonts w:ascii="Times New Roman" w:hAnsi="Times New Roman" w:cs="Times New Roman"/>
-          <w:color w:val="000000" w:themeColor="text1"/>
-        </w:rPr>
-        <w:t>ớ</w:t>
-      </w:r>
-      <w:r>
-        <w:rPr>
-          <w:rFonts w:ascii="Times New Roman" w:hAnsi="Times New Roman" w:cs="Times New Roman"/>
-          <w:color w:val="000000" w:themeColor="text1"/>
-        </w:rPr>
-        <w:t>ng phát tri</w:t>
-      </w:r>
-      <w:r>
-        <w:rPr>
-          <w:rFonts w:ascii="Times New Roman" w:hAnsi="Times New Roman" w:cs="Times New Roman"/>
-          <w:color w:val="000000" w:themeColor="text1"/>
-        </w:rPr>
-        <w:t>ể</w:t>
-      </w:r>
-      <w:r>
-        <w:rPr>
-          <w:rFonts w:ascii="Times New Roman" w:hAnsi="Times New Roman" w:cs="Times New Roman"/>
-          <w:color w:val="000000" w:themeColor="text1"/>
-        </w:rPr>
-        <w:t>n</w:t>
+        <w:t>6.3. Hướng phát triển</w:t>
       </w:r>
       <w:bookmarkEnd w:id="42"/>
     </w:p>
@@ -23334,7 +21429,7 @@
           <w:szCs w:val="26"/>
         </w:rPr>
       </w:pPr>
-      <w:bookmarkStart w:id="43" w:name="_Toc236067711"/>
+      <w:bookmarkStart w:id="43" w:name="_Toc236069977"/>
       <w:r>
         <w:rPr>
           <w:rFonts w:ascii="Times New Roman" w:hAnsi="Times New Roman" w:cs="Times New Roman"/>
@@ -23343,43 +21438,7 @@
           <w:szCs w:val="26"/>
         </w:rPr>
         <w:lastRenderedPageBreak/>
-        <w:t>TÀI LI</w:t>
-      </w:r>
-      <w:r>
-        <w:rPr>
-          <w:rFonts w:ascii="Times New Roman" w:hAnsi="Times New Roman" w:cs="Times New Roman"/>
-          <w:color w:val="000000" w:themeColor="text1"/>
-          <w:sz w:val="26"/>
-          <w:szCs w:val="26"/>
-        </w:rPr>
-        <w:t>Ệ</w:t>
-      </w:r>
-      <w:r>
-        <w:rPr>
-          <w:rFonts w:ascii="Times New Roman" w:hAnsi="Times New Roman" w:cs="Times New Roman"/>
-          <w:color w:val="000000" w:themeColor="text1"/>
-          <w:sz w:val="26"/>
-          <w:szCs w:val="26"/>
-        </w:rPr>
-        <w:t>U THAM KH</w:t>
-      </w:r>
-      <w:r>
-        <w:rPr>
-          <w:rFonts w:ascii="Times New Roman" w:hAnsi="Times New Roman" w:cs="Times New Roman"/>
-          <w:color w:val="000000" w:themeColor="text1"/>
-          <w:sz w:val="26"/>
-          <w:szCs w:val="26"/>
-        </w:rPr>
-        <w:t>Ả</w:t>
-      </w:r>
-      <w:r>
-        <w:rPr>
-          <w:rFonts w:ascii="Times New Roman" w:hAnsi="Times New Roman" w:cs="Times New Roman"/>
-          <w:color w:val="000000" w:themeColor="text1"/>
-          <w:sz w:val="26"/>
-          <w:szCs w:val="26"/>
-        </w:rPr>
-        <w:t>O</w:t>
+        <w:t>TÀI LIỆU THAM KHẢO</w:t>
       </w:r>
       <w:bookmarkEnd w:id="43"/>
     </w:p>
@@ -23560,7 +21619,7 @@
           <w:sz w:val="26"/>
           <w:szCs w:val="26"/>
         </w:rPr>
-        <w:t>[9] Trần Thị Hà Vy, “n20-secure-firmware-update-iot,” commit eda9be5fd821368b54bcffa67e2507124a7f123b, https://github.com/hv6z/n20-secure-firmware-update-iot. Truy cập 25/07/2026. Dùng cho toàn bộ code, cấu hình và minh chứng thực nghiệm.</w:t>
+        <w:t>[9] Trần Thị Hà Vy, “n20-secure-firmware-update-iot,” commit a8febb243aca96388c1981e141e823b8f397af8b, https://github.com/hv6z/n20-secure-firmware-update-iot. Truy cập 25/07/2026. Dùng cho toàn bộ code, cấu hình và minh chứng thực nghiệm.</w:t>
       </w:r>
     </w:p>
     <w:p>
@@ -23592,7 +21651,7 @@
           <w:szCs w:val="26"/>
         </w:rPr>
       </w:pPr>
-      <w:bookmarkStart w:id="44" w:name="_Toc236067712"/>
+      <w:bookmarkStart w:id="44" w:name="_Toc236069978"/>
       <w:r>
         <w:rPr>
           <w:rFonts w:ascii="Times New Roman" w:hAnsi="Times New Roman" w:cs="Times New Roman"/>
@@ -23601,106 +21660,7 @@
           <w:szCs w:val="26"/>
         </w:rPr>
         <w:lastRenderedPageBreak/>
-        <w:t>PH</w:t>
-      </w:r>
-      <w:r>
-        <w:rPr>
-          <w:rFonts w:ascii="Times New Roman" w:hAnsi="Times New Roman" w:cs="Times New Roman"/>
-          <w:color w:val="000000" w:themeColor="text1"/>
-          <w:sz w:val="26"/>
-          <w:szCs w:val="26"/>
-        </w:rPr>
-        <w:t>Ụ</w:t>
-      </w:r>
-      <w:r>
-        <w:rPr>
-          <w:rFonts w:ascii="Times New Roman" w:hAnsi="Times New Roman" w:cs="Times New Roman"/>
-          <w:color w:val="000000" w:themeColor="text1"/>
-          <w:sz w:val="26"/>
-          <w:szCs w:val="26"/>
-        </w:rPr>
-        <w:t xml:space="preserve"> L</w:t>
-      </w:r>
-      <w:r>
-        <w:rPr>
-          <w:rFonts w:ascii="Times New Roman" w:hAnsi="Times New Roman" w:cs="Times New Roman"/>
-          <w:color w:val="000000" w:themeColor="text1"/>
-          <w:sz w:val="26"/>
-          <w:szCs w:val="26"/>
-        </w:rPr>
-        <w:t>Ụ</w:t>
-      </w:r>
-      <w:r>
-        <w:rPr>
-          <w:rFonts w:ascii="Times New Roman" w:hAnsi="Times New Roman" w:cs="Times New Roman"/>
-          <w:color w:val="000000" w:themeColor="text1"/>
-          <w:sz w:val="26"/>
-          <w:szCs w:val="26"/>
-        </w:rPr>
-        <w:t>C A. PH</w:t>
-      </w:r>
-      <w:r>
-        <w:rPr>
-          <w:rFonts w:ascii="Times New Roman" w:hAnsi="Times New Roman" w:cs="Times New Roman"/>
-          <w:color w:val="000000" w:themeColor="text1"/>
-          <w:sz w:val="26"/>
-          <w:szCs w:val="26"/>
-        </w:rPr>
-        <w:t>Ầ</w:t>
-      </w:r>
-      <w:r>
-        <w:rPr>
-          <w:rFonts w:ascii="Times New Roman" w:hAnsi="Times New Roman" w:cs="Times New Roman"/>
-          <w:color w:val="000000" w:themeColor="text1"/>
-          <w:sz w:val="26"/>
-          <w:szCs w:val="26"/>
-        </w:rPr>
-        <w:t>N A – CHECKLIST VÀ PHI</w:t>
-      </w:r>
-      <w:r>
-        <w:rPr>
-          <w:rFonts w:ascii="Times New Roman" w:hAnsi="Times New Roman" w:cs="Times New Roman"/>
-          <w:color w:val="000000" w:themeColor="text1"/>
-          <w:sz w:val="26"/>
-          <w:szCs w:val="26"/>
-        </w:rPr>
-        <w:t>Ế</w:t>
-      </w:r>
-      <w:r>
-        <w:rPr>
-          <w:rFonts w:ascii="Times New Roman" w:hAnsi="Times New Roman" w:cs="Times New Roman"/>
-          <w:color w:val="000000" w:themeColor="text1"/>
-          <w:sz w:val="26"/>
-          <w:szCs w:val="26"/>
-        </w:rPr>
-        <w:t>U TI</w:t>
-      </w:r>
-      <w:r>
-        <w:rPr>
-          <w:rFonts w:ascii="Times New Roman" w:hAnsi="Times New Roman" w:cs="Times New Roman"/>
-          <w:color w:val="000000" w:themeColor="text1"/>
-          <w:sz w:val="26"/>
-          <w:szCs w:val="26"/>
-        </w:rPr>
-        <w:t>Ế</w:t>
-      </w:r>
-      <w:r>
-        <w:rPr>
-          <w:rFonts w:ascii="Times New Roman" w:hAnsi="Times New Roman" w:cs="Times New Roman"/>
-          <w:color w:val="000000" w:themeColor="text1"/>
-          <w:sz w:val="26"/>
-          <w:szCs w:val="26"/>
-        </w:rPr>
-        <w:t>N Đ</w:t>
-      </w:r>
-      <w:r>
-        <w:rPr>
-          <w:rFonts w:ascii="Times New Roman" w:hAnsi="Times New Roman" w:cs="Times New Roman"/>
-          <w:color w:val="000000" w:themeColor="text1"/>
-          <w:sz w:val="26"/>
-          <w:szCs w:val="26"/>
-        </w:rPr>
-        <w:t>Ộ</w:t>
+        <w:t>PHỤ LỤC A. PHẦN A – CHECKLIST VÀ PHIẾU TIẾN ĐỘ</w:t>
       </w:r>
       <w:bookmarkEnd w:id="44"/>
     </w:p>
@@ -23735,55 +21695,13 @@
           <w:color w:val="000000" w:themeColor="text1"/>
         </w:rPr>
       </w:pPr>
-      <w:bookmarkStart w:id="45" w:name="_Toc236067713"/>
+      <w:bookmarkStart w:id="45" w:name="_Toc236069979"/>
       <w:r>
         <w:rPr>
           <w:rFonts w:ascii="Times New Roman" w:hAnsi="Times New Roman" w:cs="Times New Roman"/>
           <w:color w:val="000000" w:themeColor="text1"/>
         </w:rPr>
-        <w:t>A.1. Checklist nhanh trư</w:t>
-      </w:r>
-      <w:r>
-        <w:rPr>
-          <w:rFonts w:ascii="Times New Roman" w:hAnsi="Times New Roman" w:cs="Times New Roman"/>
-          <w:color w:val="000000" w:themeColor="text1"/>
-        </w:rPr>
-        <w:t>ớ</w:t>
-      </w:r>
-      <w:r>
-        <w:rPr>
-          <w:rFonts w:ascii="Times New Roman" w:hAnsi="Times New Roman" w:cs="Times New Roman"/>
-          <w:color w:val="000000" w:themeColor="text1"/>
-        </w:rPr>
-        <w:t>c khi vi</w:t>
-      </w:r>
-      <w:r>
-        <w:rPr>
-          <w:rFonts w:ascii="Times New Roman" w:hAnsi="Times New Roman" w:cs="Times New Roman"/>
-          <w:color w:val="000000" w:themeColor="text1"/>
-        </w:rPr>
-        <w:t>ế</w:t>
-      </w:r>
-      <w:r>
-        <w:rPr>
-          <w:rFonts w:ascii="Times New Roman" w:hAnsi="Times New Roman" w:cs="Times New Roman"/>
-          <w:color w:val="000000" w:themeColor="text1"/>
-        </w:rPr>
-        <w:t>t – Tu</w:t>
-      </w:r>
-      <w:r>
-        <w:rPr>
-          <w:rFonts w:ascii="Times New Roman" w:hAnsi="Times New Roman" w:cs="Times New Roman"/>
-          <w:color w:val="000000" w:themeColor="text1"/>
-        </w:rPr>
-        <w:t>ầ</w:t>
-      </w:r>
-      <w:r>
-        <w:rPr>
-          <w:rFonts w:ascii="Times New Roman" w:hAnsi="Times New Roman" w:cs="Times New Roman"/>
-          <w:color w:val="000000" w:themeColor="text1"/>
-        </w:rPr>
-        <w:t>n 02</w:t>
+        <w:t>A.1. Checklist nhanh trước khi viết – Tuần 02</w:t>
       </w:r>
       <w:bookmarkEnd w:id="45"/>
     </w:p>
@@ -24718,41 +22636,13 @@
           <w:color w:val="000000" w:themeColor="text1"/>
         </w:rPr>
       </w:pPr>
-      <w:bookmarkStart w:id="46" w:name="_Toc236067714"/>
+      <w:bookmarkStart w:id="46" w:name="_Toc236069980"/>
       <w:r>
         <w:rPr>
           <w:rFonts w:ascii="Times New Roman" w:hAnsi="Times New Roman" w:cs="Times New Roman"/>
           <w:color w:val="000000" w:themeColor="text1"/>
         </w:rPr>
-        <w:t>A.2. Góp ý và cách x</w:t>
-      </w:r>
-      <w:r>
-        <w:rPr>
-          <w:rFonts w:ascii="Times New Roman" w:hAnsi="Times New Roman" w:cs="Times New Roman"/>
-          <w:color w:val="000000" w:themeColor="text1"/>
-        </w:rPr>
-        <w:t>ử</w:t>
-      </w:r>
-      <w:r>
-        <w:rPr>
-          <w:rFonts w:ascii="Times New Roman" w:hAnsi="Times New Roman" w:cs="Times New Roman"/>
-          <w:color w:val="000000" w:themeColor="text1"/>
-        </w:rPr>
-        <w:t xml:space="preserve"> lý – Tu</w:t>
-      </w:r>
-      <w:r>
-        <w:rPr>
-          <w:rFonts w:ascii="Times New Roman" w:hAnsi="Times New Roman" w:cs="Times New Roman"/>
-          <w:color w:val="000000" w:themeColor="text1"/>
-        </w:rPr>
-        <w:t>ầ</w:t>
-      </w:r>
-      <w:r>
-        <w:rPr>
-          <w:rFonts w:ascii="Times New Roman" w:hAnsi="Times New Roman" w:cs="Times New Roman"/>
-          <w:color w:val="000000" w:themeColor="text1"/>
-        </w:rPr>
-        <w:t>n 02</w:t>
+        <w:t>A.2. Góp ý và cách xử lý – Tuần 02</w:t>
       </w:r>
       <w:bookmarkEnd w:id="46"/>
     </w:p>
@@ -25431,41 +23321,13 @@
           <w:color w:val="000000" w:themeColor="text1"/>
         </w:rPr>
       </w:pPr>
-      <w:bookmarkStart w:id="47" w:name="_Toc236067715"/>
+      <w:bookmarkStart w:id="47" w:name="_Toc236069981"/>
       <w:r>
         <w:rPr>
           <w:rFonts w:ascii="Times New Roman" w:hAnsi="Times New Roman" w:cs="Times New Roman"/>
           <w:color w:val="000000" w:themeColor="text1"/>
         </w:rPr>
-        <w:t>A.3. Minh ch</w:t>
-      </w:r>
-      <w:r>
-        <w:rPr>
-          <w:rFonts w:ascii="Times New Roman" w:hAnsi="Times New Roman" w:cs="Times New Roman"/>
-          <w:color w:val="000000" w:themeColor="text1"/>
-        </w:rPr>
-        <w:t>ứ</w:t>
-      </w:r>
-      <w:r>
-        <w:rPr>
-          <w:rFonts w:ascii="Times New Roman" w:hAnsi="Times New Roman" w:cs="Times New Roman"/>
-          <w:color w:val="000000" w:themeColor="text1"/>
-        </w:rPr>
-        <w:t>ng đã khai báo – Tu</w:t>
-      </w:r>
-      <w:r>
-        <w:rPr>
-          <w:rFonts w:ascii="Times New Roman" w:hAnsi="Times New Roman" w:cs="Times New Roman"/>
-          <w:color w:val="000000" w:themeColor="text1"/>
-        </w:rPr>
-        <w:t>ầ</w:t>
-      </w:r>
-      <w:r>
-        <w:rPr>
-          <w:rFonts w:ascii="Times New Roman" w:hAnsi="Times New Roman" w:cs="Times New Roman"/>
-          <w:color w:val="000000" w:themeColor="text1"/>
-        </w:rPr>
-        <w:t>n 02</w:t>
+        <w:t>A.3. Minh chứng đã khai báo – Tuần 02</w:t>
       </w:r>
       <w:bookmarkEnd w:id="47"/>
     </w:p>
@@ -26469,62 +24331,13 @@
           <w:color w:val="000000" w:themeColor="text1"/>
         </w:rPr>
       </w:pPr>
-      <w:bookmarkStart w:id="48" w:name="_Toc236067716"/>
+      <w:bookmarkStart w:id="48" w:name="_Toc236069982"/>
       <w:r>
         <w:rPr>
           <w:rFonts w:ascii="Times New Roman" w:hAnsi="Times New Roman" w:cs="Times New Roman"/>
           <w:color w:val="000000" w:themeColor="text1"/>
         </w:rPr>
-        <w:t>A.4. Thông tin chung c</w:t>
-      </w:r>
-      <w:r>
-        <w:rPr>
-          <w:rFonts w:ascii="Times New Roman" w:hAnsi="Times New Roman" w:cs="Times New Roman"/>
-          <w:color w:val="000000" w:themeColor="text1"/>
-        </w:rPr>
-        <w:t>ủ</w:t>
-      </w:r>
-      <w:r>
-        <w:rPr>
-          <w:rFonts w:ascii="Times New Roman" w:hAnsi="Times New Roman" w:cs="Times New Roman"/>
-          <w:color w:val="000000" w:themeColor="text1"/>
-        </w:rPr>
-        <w:t>a phi</w:t>
-      </w:r>
-      <w:r>
-        <w:rPr>
-          <w:rFonts w:ascii="Times New Roman" w:hAnsi="Times New Roman" w:cs="Times New Roman"/>
-          <w:color w:val="000000" w:themeColor="text1"/>
-        </w:rPr>
-        <w:t>ế</w:t>
-      </w:r>
-      <w:r>
-        <w:rPr>
-          <w:rFonts w:ascii="Times New Roman" w:hAnsi="Times New Roman" w:cs="Times New Roman"/>
-          <w:color w:val="000000" w:themeColor="text1"/>
-        </w:rPr>
-        <w:t>u ti</w:t>
-      </w:r>
-      <w:r>
-        <w:rPr>
-          <w:rFonts w:ascii="Times New Roman" w:hAnsi="Times New Roman" w:cs="Times New Roman"/>
-          <w:color w:val="000000" w:themeColor="text1"/>
-        </w:rPr>
-        <w:t>ế</w:t>
-      </w:r>
-      <w:r>
-        <w:rPr>
-          <w:rFonts w:ascii="Times New Roman" w:hAnsi="Times New Roman" w:cs="Times New Roman"/>
-          <w:color w:val="000000" w:themeColor="text1"/>
-        </w:rPr>
-        <w:t>n đ</w:t>
-      </w:r>
-      <w:r>
-        <w:rPr>
-          <w:rFonts w:ascii="Times New Roman" w:hAnsi="Times New Roman" w:cs="Times New Roman"/>
-          <w:color w:val="000000" w:themeColor="text1"/>
-        </w:rPr>
-        <w:t>ộ</w:t>
+        <w:t>A.4. Thông tin chung của phiếu tiến độ</w:t>
       </w:r>
       <w:bookmarkEnd w:id="48"/>
     </w:p>
@@ -27202,55 +25015,13 @@
           <w:color w:val="000000" w:themeColor="text1"/>
         </w:rPr>
       </w:pPr>
-      <w:bookmarkStart w:id="49" w:name="_Toc236067717"/>
+      <w:bookmarkStart w:id="49" w:name="_Toc236069983"/>
       <w:r>
         <w:rPr>
           <w:rFonts w:ascii="Times New Roman" w:hAnsi="Times New Roman" w:cs="Times New Roman"/>
           <w:color w:val="000000" w:themeColor="text1"/>
         </w:rPr>
-        <w:t>A.5. Checklist ti</w:t>
-      </w:r>
-      <w:r>
-        <w:rPr>
-          <w:rFonts w:ascii="Times New Roman" w:hAnsi="Times New Roman" w:cs="Times New Roman"/>
-          <w:color w:val="000000" w:themeColor="text1"/>
-        </w:rPr>
-        <w:t>ế</w:t>
-      </w:r>
-      <w:r>
-        <w:rPr>
-          <w:rFonts w:ascii="Times New Roman" w:hAnsi="Times New Roman" w:cs="Times New Roman"/>
-          <w:color w:val="000000" w:themeColor="text1"/>
-        </w:rPr>
-        <w:t>n đ</w:t>
-      </w:r>
-      <w:r>
-        <w:rPr>
-          <w:rFonts w:ascii="Times New Roman" w:hAnsi="Times New Roman" w:cs="Times New Roman"/>
-          <w:color w:val="000000" w:themeColor="text1"/>
-        </w:rPr>
-        <w:t>ộ</w:t>
-      </w:r>
-      <w:r>
-        <w:rPr>
-          <w:rFonts w:ascii="Times New Roman" w:hAnsi="Times New Roman" w:cs="Times New Roman"/>
-          <w:color w:val="000000" w:themeColor="text1"/>
-        </w:rPr>
-        <w:t xml:space="preserve"> Tu</w:t>
-      </w:r>
-      <w:r>
-        <w:rPr>
-          <w:rFonts w:ascii="Times New Roman" w:hAnsi="Times New Roman" w:cs="Times New Roman"/>
-          <w:color w:val="000000" w:themeColor="text1"/>
-        </w:rPr>
-        <w:t>ầ</w:t>
-      </w:r>
-      <w:r>
-        <w:rPr>
-          <w:rFonts w:ascii="Times New Roman" w:hAnsi="Times New Roman" w:cs="Times New Roman"/>
-          <w:color w:val="000000" w:themeColor="text1"/>
-        </w:rPr>
-        <w:t>n 02</w:t>
+        <w:t>A.5. Checklist tiến độ Tuần 02</w:t>
       </w:r>
       <w:bookmarkEnd w:id="49"/>
     </w:p>
@@ -27918,70 +25689,14 @@
           <w:color w:val="000000" w:themeColor="text1"/>
         </w:rPr>
       </w:pPr>
-      <w:bookmarkStart w:id="50" w:name="_Toc236067718"/>
+      <w:bookmarkStart w:id="50" w:name="_Toc236069984"/>
       <w:r>
         <w:rPr>
           <w:rFonts w:ascii="Times New Roman" w:hAnsi="Times New Roman" w:cs="Times New Roman"/>
           <w:color w:val="000000" w:themeColor="text1"/>
         </w:rPr>
         <w:lastRenderedPageBreak/>
-        <w:t>A.6. N</w:t>
-      </w:r>
-      <w:r>
-        <w:rPr>
-          <w:rFonts w:ascii="Times New Roman" w:hAnsi="Times New Roman" w:cs="Times New Roman"/>
-          <w:color w:val="000000" w:themeColor="text1"/>
-        </w:rPr>
-        <w:t>ộ</w:t>
-      </w:r>
-      <w:r>
-        <w:rPr>
-          <w:rFonts w:ascii="Times New Roman" w:hAnsi="Times New Roman" w:cs="Times New Roman"/>
-          <w:color w:val="000000" w:themeColor="text1"/>
-        </w:rPr>
-        <w:t>i dung đã th</w:t>
-      </w:r>
-      <w:r>
-        <w:rPr>
-          <w:rFonts w:ascii="Times New Roman" w:hAnsi="Times New Roman" w:cs="Times New Roman"/>
-          <w:color w:val="000000" w:themeColor="text1"/>
-        </w:rPr>
-        <w:t>ự</w:t>
-      </w:r>
-      <w:r>
-        <w:rPr>
-          <w:rFonts w:ascii="Times New Roman" w:hAnsi="Times New Roman" w:cs="Times New Roman"/>
-          <w:color w:val="000000" w:themeColor="text1"/>
-        </w:rPr>
-        <w:t>c hi</w:t>
-      </w:r>
-      <w:r>
-        <w:rPr>
-          <w:rFonts w:ascii="Times New Roman" w:hAnsi="Times New Roman" w:cs="Times New Roman"/>
-          <w:color w:val="000000" w:themeColor="text1"/>
-        </w:rPr>
-        <w:t>ệ</w:t>
-      </w:r>
-      <w:r>
-        <w:rPr>
-          <w:rFonts w:ascii="Times New Roman" w:hAnsi="Times New Roman" w:cs="Times New Roman"/>
-          <w:color w:val="000000" w:themeColor="text1"/>
-        </w:rPr>
-        <w:t>n trong tu</w:t>
-      </w:r>
-      <w:r>
-        <w:rPr>
-          <w:rFonts w:ascii="Times New Roman" w:hAnsi="Times New Roman" w:cs="Times New Roman"/>
-          <w:color w:val="000000" w:themeColor="text1"/>
-        </w:rPr>
-        <w:t>ầ</w:t>
-      </w:r>
-      <w:r>
-        <w:rPr>
-          <w:rFonts w:ascii="Times New Roman" w:hAnsi="Times New Roman" w:cs="Times New Roman"/>
-          <w:color w:val="000000" w:themeColor="text1"/>
-        </w:rPr>
-        <w:t>n</w:t>
+        <w:t>A.6. Nội dung đã thực hiện trong tuần</w:t>
       </w:r>
       <w:bookmarkEnd w:id="50"/>
     </w:p>
@@ -28785,42 +26500,14 @@
           <w:color w:val="000000" w:themeColor="text1"/>
         </w:rPr>
       </w:pPr>
-      <w:bookmarkStart w:id="51" w:name="_Toc236067719"/>
+      <w:bookmarkStart w:id="51" w:name="_Toc236069985"/>
       <w:r>
         <w:rPr>
           <w:rFonts w:ascii="Times New Roman" w:hAnsi="Times New Roman" w:cs="Times New Roman"/>
           <w:color w:val="000000" w:themeColor="text1"/>
         </w:rPr>
         <w:lastRenderedPageBreak/>
-        <w:t>A.7. Khó khăn/r</w:t>
-      </w:r>
-      <w:r>
-        <w:rPr>
-          <w:rFonts w:ascii="Times New Roman" w:hAnsi="Times New Roman" w:cs="Times New Roman"/>
-          <w:color w:val="000000" w:themeColor="text1"/>
-        </w:rPr>
-        <w:t>ủ</w:t>
-      </w:r>
-      <w:r>
-        <w:rPr>
-          <w:rFonts w:ascii="Times New Roman" w:hAnsi="Times New Roman" w:cs="Times New Roman"/>
-          <w:color w:val="000000" w:themeColor="text1"/>
-        </w:rPr>
-        <w:t>i ro đang g</w:t>
-      </w:r>
-      <w:r>
-        <w:rPr>
-          <w:rFonts w:ascii="Times New Roman" w:hAnsi="Times New Roman" w:cs="Times New Roman"/>
-          <w:color w:val="000000" w:themeColor="text1"/>
-        </w:rPr>
-        <w:t>ặ</w:t>
-      </w:r>
-      <w:r>
-        <w:rPr>
-          <w:rFonts w:ascii="Times New Roman" w:hAnsi="Times New Roman" w:cs="Times New Roman"/>
-          <w:color w:val="000000" w:themeColor="text1"/>
-        </w:rPr>
-        <w:t>p</w:t>
+        <w:t>A.7. Khó khăn/rủi ro đang gặp</w:t>
       </w:r>
       <w:bookmarkEnd w:id="51"/>
     </w:p>
@@ -29173,55 +26860,13 @@
           <w:color w:val="000000" w:themeColor="text1"/>
         </w:rPr>
       </w:pPr>
-      <w:bookmarkStart w:id="52" w:name="_Toc236067720"/>
+      <w:bookmarkStart w:id="52" w:name="_Toc236069986"/>
       <w:r>
         <w:rPr>
           <w:rFonts w:ascii="Times New Roman" w:hAnsi="Times New Roman" w:cs="Times New Roman"/>
           <w:color w:val="000000" w:themeColor="text1"/>
         </w:rPr>
-        <w:t>A.8. K</w:t>
-      </w:r>
-      <w:r>
-        <w:rPr>
-          <w:rFonts w:ascii="Times New Roman" w:hAnsi="Times New Roman" w:cs="Times New Roman"/>
-          <w:color w:val="000000" w:themeColor="text1"/>
-        </w:rPr>
-        <w:t>ế</w:t>
-      </w:r>
-      <w:r>
-        <w:rPr>
-          <w:rFonts w:ascii="Times New Roman" w:hAnsi="Times New Roman" w:cs="Times New Roman"/>
-          <w:color w:val="000000" w:themeColor="text1"/>
-        </w:rPr>
-        <w:t xml:space="preserve"> ho</w:t>
-      </w:r>
-      <w:r>
-        <w:rPr>
-          <w:rFonts w:ascii="Times New Roman" w:hAnsi="Times New Roman" w:cs="Times New Roman"/>
-          <w:color w:val="000000" w:themeColor="text1"/>
-        </w:rPr>
-        <w:t>ạ</w:t>
-      </w:r>
-      <w:r>
-        <w:rPr>
-          <w:rFonts w:ascii="Times New Roman" w:hAnsi="Times New Roman" w:cs="Times New Roman"/>
-          <w:color w:val="000000" w:themeColor="text1"/>
-        </w:rPr>
-        <w:t>ch Tu</w:t>
-      </w:r>
-      <w:r>
-        <w:rPr>
-          <w:rFonts w:ascii="Times New Roman" w:hAnsi="Times New Roman" w:cs="Times New Roman"/>
-          <w:color w:val="000000" w:themeColor="text1"/>
-        </w:rPr>
-        <w:t>ầ</w:t>
-      </w:r>
-      <w:r>
-        <w:rPr>
-          <w:rFonts w:ascii="Times New Roman" w:hAnsi="Times New Roman" w:cs="Times New Roman"/>
-          <w:color w:val="000000" w:themeColor="text1"/>
-        </w:rPr>
-        <w:t>n 03</w:t>
+        <w:t>A.8. Kế hoạch Tuần 03</w:t>
       </w:r>
       <w:bookmarkEnd w:id="52"/>
     </w:p>
@@ -29239,10 +26884,10 @@
         <w:tblLook w:val="04A0" w:firstRow="1" w:lastRow="0" w:firstColumn="1" w:lastColumn="0" w:noHBand="0" w:noVBand="1"/>
       </w:tblPr>
       <w:tblGrid>
-        <w:gridCol w:w="1415"/>
-        <w:gridCol w:w="1897"/>
+        <w:gridCol w:w="1408"/>
+        <w:gridCol w:w="1890"/>
         <w:gridCol w:w="1401"/>
-        <w:gridCol w:w="5141"/>
+        <w:gridCol w:w="5155"/>
       </w:tblGrid>
       <w:tr>
         <w:trPr>
@@ -29748,7 +27393,7 @@
                 <w:sz w:val="26"/>
                 <w:szCs w:val="26"/>
               </w:rPr>
-              <w:t>eda9be5fd821368b54bcffa67e2507124a7f123b</w:t>
+              <w:t>a8febb243aca96388c1981e141e823b8f397af8b</w:t>
             </w:r>
           </w:p>
         </w:tc>
@@ -29763,42 +27408,14 @@
           <w:color w:val="000000" w:themeColor="text1"/>
         </w:rPr>
       </w:pPr>
-      <w:bookmarkStart w:id="53" w:name="_Toc236067721"/>
+      <w:bookmarkStart w:id="53" w:name="_Toc236069987"/>
       <w:r>
         <w:rPr>
           <w:rFonts w:ascii="Times New Roman" w:hAnsi="Times New Roman" w:cs="Times New Roman"/>
           <w:color w:val="000000" w:themeColor="text1"/>
         </w:rPr>
         <w:lastRenderedPageBreak/>
-        <w:t>A.9. T</w:t>
-      </w:r>
-      <w:r>
-        <w:rPr>
-          <w:rFonts w:ascii="Times New Roman" w:hAnsi="Times New Roman" w:cs="Times New Roman"/>
-          <w:color w:val="000000" w:themeColor="text1"/>
-        </w:rPr>
-        <w:t>ự</w:t>
-      </w:r>
-      <w:r>
-        <w:rPr>
-          <w:rFonts w:ascii="Times New Roman" w:hAnsi="Times New Roman" w:cs="Times New Roman"/>
-          <w:color w:val="000000" w:themeColor="text1"/>
-        </w:rPr>
-        <w:t xml:space="preserve"> đánh giá c</w:t>
-      </w:r>
-      <w:r>
-        <w:rPr>
-          <w:rFonts w:ascii="Times New Roman" w:hAnsi="Times New Roman" w:cs="Times New Roman"/>
-          <w:color w:val="000000" w:themeColor="text1"/>
-        </w:rPr>
-        <w:t>ủ</w:t>
-      </w:r>
-      <w:r>
-        <w:rPr>
-          <w:rFonts w:ascii="Times New Roman" w:hAnsi="Times New Roman" w:cs="Times New Roman"/>
-          <w:color w:val="000000" w:themeColor="text1"/>
-        </w:rPr>
-        <w:t>a sinh viên</w:t>
+        <w:t>A.9. Tự đánh giá của sinh viên</w:t>
       </w:r>
       <w:bookmarkEnd w:id="53"/>
     </w:p>
@@ -30109,7 +27726,7 @@
           <w:szCs w:val="26"/>
         </w:rPr>
       </w:pPr>
-      <w:bookmarkStart w:id="54" w:name="_Toc236067722"/>
+      <w:bookmarkStart w:id="54" w:name="_Toc236069988"/>
       <w:r>
         <w:rPr>
           <w:rFonts w:ascii="Times New Roman" w:hAnsi="Times New Roman" w:cs="Times New Roman"/>
@@ -30118,61 +27735,7 @@
           <w:szCs w:val="26"/>
         </w:rPr>
         <w:lastRenderedPageBreak/>
-        <w:t>PH</w:t>
-      </w:r>
-      <w:r>
-        <w:rPr>
-          <w:rFonts w:ascii="Times New Roman" w:hAnsi="Times New Roman" w:cs="Times New Roman"/>
-          <w:color w:val="000000" w:themeColor="text1"/>
-          <w:sz w:val="26"/>
-          <w:szCs w:val="26"/>
-        </w:rPr>
-        <w:t>Ụ</w:t>
-      </w:r>
-      <w:r>
-        <w:rPr>
-          <w:rFonts w:ascii="Times New Roman" w:hAnsi="Times New Roman" w:cs="Times New Roman"/>
-          <w:color w:val="000000" w:themeColor="text1"/>
-          <w:sz w:val="26"/>
-          <w:szCs w:val="26"/>
-        </w:rPr>
-        <w:t xml:space="preserve"> L</w:t>
-      </w:r>
-      <w:r>
-        <w:rPr>
-          <w:rFonts w:ascii="Times New Roman" w:hAnsi="Times New Roman" w:cs="Times New Roman"/>
-          <w:color w:val="000000" w:themeColor="text1"/>
-          <w:sz w:val="26"/>
-          <w:szCs w:val="26"/>
-        </w:rPr>
-        <w:t>Ụ</w:t>
-      </w:r>
-      <w:r>
-        <w:rPr>
-          <w:rFonts w:ascii="Times New Roman" w:hAnsi="Times New Roman" w:cs="Times New Roman"/>
-          <w:color w:val="000000" w:themeColor="text1"/>
-          <w:sz w:val="26"/>
-          <w:szCs w:val="26"/>
-        </w:rPr>
-        <w:t>C B. REPOSITORY, COMMIT VÀ GÓI N</w:t>
-      </w:r>
-      <w:r>
-        <w:rPr>
-          <w:rFonts w:ascii="Times New Roman" w:hAnsi="Times New Roman" w:cs="Times New Roman"/>
-          <w:color w:val="000000" w:themeColor="text1"/>
-          <w:sz w:val="26"/>
-          <w:szCs w:val="26"/>
-        </w:rPr>
-        <w:t>Ộ</w:t>
-      </w:r>
-      <w:r>
-        <w:rPr>
-          <w:rFonts w:ascii="Times New Roman" w:hAnsi="Times New Roman" w:cs="Times New Roman"/>
-          <w:color w:val="000000" w:themeColor="text1"/>
-          <w:sz w:val="26"/>
-          <w:szCs w:val="26"/>
-        </w:rPr>
-        <w:t>P</w:t>
+        <w:t>PHỤ LỤC B. REPOSITORY, COMMIT VÀ GÓI NỘP</w:t>
       </w:r>
       <w:bookmarkEnd w:id="54"/>
     </w:p>
@@ -30208,21 +27771,7 @@
         </w:rPr>
       </w:pPr>
       <w:r>
-        <w:rPr>
-          <w:rFonts w:cs="Times New Roman"/>
-          <w:color w:val="000000" w:themeColor="text1"/>
-          <w:sz w:val="26"/>
-          <w:szCs w:val="26"/>
-        </w:rPr>
-        <w:t>Commit main kiểm tra lần cuối: eda9be5fd821368b54bcffa67e25071</w:t>
-      </w:r>
-      <w:r>
-        <w:rPr>
-          <w:rFonts w:cs="Times New Roman"/>
-          <w:sz w:val="26"/>
-          <w:szCs w:val="26"/>
-        </w:rPr>
-        <w:t>24a7f123b (18/07/2026).</w:t>
+        <w:t>Commit main kiểm tra lần cuối: a8febb243aca96388c1981e141e823b8f397af8b (27/07/2026).</w:t>
       </w:r>
     </w:p>
     <w:tbl>
@@ -30233,9 +27782,9 @@
         <w:tblLook w:val="04A0" w:firstRow="1" w:lastRow="0" w:firstColumn="1" w:lastColumn="0" w:noHBand="0" w:noVBand="1"/>
       </w:tblPr>
       <w:tblGrid>
-        <w:gridCol w:w="5141"/>
-        <w:gridCol w:w="1401"/>
-        <w:gridCol w:w="3312"/>
+        <w:gridCol w:w="5155"/>
+        <w:gridCol w:w="1219"/>
+        <w:gridCol w:w="3480"/>
       </w:tblGrid>
       <w:tr>
         <w:trPr>
@@ -30348,31 +27897,18 @@
                 <w:sz w:val="26"/>
                 <w:szCs w:val="26"/>
               </w:rPr>
-              <w:t>eda9be5fd821368b54bcffa67e2507124a7f123b</w:t>
-            </w:r>
-          </w:p>
-        </w:tc>
-        <w:tc>
-          <w:tcPr>
-            <w:tcW w:w="0" w:type="auto"/>
-            <w:vAlign w:val="center"/>
-          </w:tcPr>
-          <w:p>
-            <w:pPr>
-              <w:spacing w:after="0" w:line="312" w:lineRule="auto"/>
-              <w:rPr>
-                <w:rFonts w:cs="Times New Roman"/>
-                <w:sz w:val="26"/>
-                <w:szCs w:val="26"/>
-              </w:rPr>
-            </w:pPr>
-            <w:r>
-              <w:rPr>
-                <w:rFonts w:cs="Times New Roman"/>
-                <w:sz w:val="26"/>
-                <w:szCs w:val="26"/>
-              </w:rPr>
-              <w:t>18/07/2026</w:t>
+              <w:t>a8febb243aca96388c1981e141e823b8f397af8b</w:t>
+            </w:r>
+          </w:p>
+        </w:tc>
+        <w:tc>
+          <w:tcPr>
+            <w:tcW w:w="0" w:type="auto"/>
+            <w:vAlign w:val="center"/>
+          </w:tcPr>
+          <w:p>
+            <w:r>
+              <w:t>27/07/2026</w:t>
             </w:r>
           </w:p>
         </w:tc>
@@ -30441,7 +27977,7 @@
           <w:szCs w:val="26"/>
         </w:rPr>
       </w:pPr>
-      <w:bookmarkStart w:id="55" w:name="_Toc236067723"/>
+      <w:bookmarkStart w:id="55" w:name="_Toc236069989"/>
       <w:r>
         <w:rPr>
           <w:rFonts w:ascii="Times New Roman" w:hAnsi="Times New Roman" w:cs="Times New Roman"/>
@@ -30450,79 +27986,7 @@
           <w:szCs w:val="26"/>
         </w:rPr>
         <w:lastRenderedPageBreak/>
-        <w:t>PH</w:t>
-      </w:r>
-      <w:r>
-        <w:rPr>
-          <w:rFonts w:ascii="Times New Roman" w:hAnsi="Times New Roman" w:cs="Times New Roman"/>
-          <w:color w:val="000000" w:themeColor="text1"/>
-          <w:sz w:val="26"/>
-          <w:szCs w:val="26"/>
-        </w:rPr>
-        <w:t>Ụ</w:t>
-      </w:r>
-      <w:r>
-        <w:rPr>
-          <w:rFonts w:ascii="Times New Roman" w:hAnsi="Times New Roman" w:cs="Times New Roman"/>
-          <w:color w:val="000000" w:themeColor="text1"/>
-          <w:sz w:val="26"/>
-          <w:szCs w:val="26"/>
-        </w:rPr>
-        <w:t xml:space="preserve"> L</w:t>
-      </w:r>
-      <w:r>
-        <w:rPr>
-          <w:rFonts w:ascii="Times New Roman" w:hAnsi="Times New Roman" w:cs="Times New Roman"/>
-          <w:color w:val="000000" w:themeColor="text1"/>
-          <w:sz w:val="26"/>
-          <w:szCs w:val="26"/>
-        </w:rPr>
-        <w:t>Ụ</w:t>
-      </w:r>
-      <w:r>
-        <w:rPr>
-          <w:rFonts w:ascii="Times New Roman" w:hAnsi="Times New Roman" w:cs="Times New Roman"/>
-          <w:color w:val="000000" w:themeColor="text1"/>
-          <w:sz w:val="26"/>
-          <w:szCs w:val="26"/>
-        </w:rPr>
-        <w:t>C C. CHECKLIST TRƯ</w:t>
-      </w:r>
-      <w:r>
-        <w:rPr>
-          <w:rFonts w:ascii="Times New Roman" w:hAnsi="Times New Roman" w:cs="Times New Roman"/>
-          <w:color w:val="000000" w:themeColor="text1"/>
-          <w:sz w:val="26"/>
-          <w:szCs w:val="26"/>
-        </w:rPr>
-        <w:t>Ớ</w:t>
-      </w:r>
-      <w:r>
-        <w:rPr>
-          <w:rFonts w:ascii="Times New Roman" w:hAnsi="Times New Roman" w:cs="Times New Roman"/>
-          <w:color w:val="000000" w:themeColor="text1"/>
-          <w:sz w:val="26"/>
-          <w:szCs w:val="26"/>
-        </w:rPr>
-        <w:t>C KHI IN VÀ N</w:t>
-      </w:r>
-      <w:r>
-        <w:rPr>
-          <w:rFonts w:ascii="Times New Roman" w:hAnsi="Times New Roman" w:cs="Times New Roman"/>
-          <w:color w:val="000000" w:themeColor="text1"/>
-          <w:sz w:val="26"/>
-          <w:szCs w:val="26"/>
-        </w:rPr>
-        <w:t>Ộ</w:t>
-      </w:r>
-      <w:r>
-        <w:rPr>
-          <w:rFonts w:ascii="Times New Roman" w:hAnsi="Times New Roman" w:cs="Times New Roman"/>
-          <w:color w:val="000000" w:themeColor="text1"/>
-          <w:sz w:val="26"/>
-          <w:szCs w:val="26"/>
-        </w:rPr>
-        <w:t>P</w:t>
+        <w:t>PHỤ LỤC C. CHECKLIST TRƯỚC KHI IN VÀ NỘP</w:t>
       </w:r>
       <w:bookmarkEnd w:id="55"/>
     </w:p>
@@ -31512,7 +28976,7 @@
           <w:szCs w:val="26"/>
         </w:rPr>
       </w:pPr>
-      <w:bookmarkStart w:id="56" w:name="_Toc236067724"/>
+      <w:bookmarkStart w:id="56" w:name="_Toc236069990"/>
       <w:r>
         <w:rPr>
           <w:rFonts w:ascii="Times New Roman" w:hAnsi="Times New Roman" w:cs="Times New Roman"/>
@@ -31521,124 +28985,7 @@
           <w:szCs w:val="26"/>
         </w:rPr>
         <w:lastRenderedPageBreak/>
-        <w:t>PH</w:t>
-      </w:r>
-      <w:r>
-        <w:rPr>
-          <w:rFonts w:ascii="Times New Roman" w:hAnsi="Times New Roman" w:cs="Times New Roman"/>
-          <w:color w:val="000000" w:themeColor="text1"/>
-          <w:sz w:val="26"/>
-          <w:szCs w:val="26"/>
-        </w:rPr>
-        <w:t>Ụ</w:t>
-      </w:r>
-      <w:r>
-        <w:rPr>
-          <w:rFonts w:ascii="Times New Roman" w:hAnsi="Times New Roman" w:cs="Times New Roman"/>
-          <w:color w:val="000000" w:themeColor="text1"/>
-          <w:sz w:val="26"/>
-          <w:szCs w:val="26"/>
-        </w:rPr>
-        <w:t xml:space="preserve"> L</w:t>
-      </w:r>
-      <w:r>
-        <w:rPr>
-          <w:rFonts w:ascii="Times New Roman" w:hAnsi="Times New Roman" w:cs="Times New Roman"/>
-          <w:color w:val="000000" w:themeColor="text1"/>
-          <w:sz w:val="26"/>
-          <w:szCs w:val="26"/>
-        </w:rPr>
-        <w:t>Ụ</w:t>
-      </w:r>
-      <w:r>
-        <w:rPr>
-          <w:rFonts w:ascii="Times New Roman" w:hAnsi="Times New Roman" w:cs="Times New Roman"/>
-          <w:color w:val="000000" w:themeColor="text1"/>
-          <w:sz w:val="26"/>
-          <w:szCs w:val="26"/>
-        </w:rPr>
-        <w:t>C D. CÂU H</w:t>
-      </w:r>
-      <w:r>
-        <w:rPr>
-          <w:rFonts w:ascii="Times New Roman" w:hAnsi="Times New Roman" w:cs="Times New Roman"/>
-          <w:color w:val="000000" w:themeColor="text1"/>
-          <w:sz w:val="26"/>
-          <w:szCs w:val="26"/>
-        </w:rPr>
-        <w:t>Ỏ</w:t>
-      </w:r>
-      <w:r>
-        <w:rPr>
-          <w:rFonts w:ascii="Times New Roman" w:hAnsi="Times New Roman" w:cs="Times New Roman"/>
-          <w:color w:val="000000" w:themeColor="text1"/>
-          <w:sz w:val="26"/>
-          <w:szCs w:val="26"/>
-        </w:rPr>
-        <w:t>I CHU</w:t>
-      </w:r>
-      <w:r>
-        <w:rPr>
-          <w:rFonts w:ascii="Times New Roman" w:hAnsi="Times New Roman" w:cs="Times New Roman"/>
-          <w:color w:val="000000" w:themeColor="text1"/>
-          <w:sz w:val="26"/>
-          <w:szCs w:val="26"/>
-        </w:rPr>
-        <w:t>Ẩ</w:t>
-      </w:r>
-      <w:r>
-        <w:rPr>
-          <w:rFonts w:ascii="Times New Roman" w:hAnsi="Times New Roman" w:cs="Times New Roman"/>
-          <w:color w:val="000000" w:themeColor="text1"/>
-          <w:sz w:val="26"/>
-          <w:szCs w:val="26"/>
-        </w:rPr>
-        <w:t>N B</w:t>
-      </w:r>
-      <w:r>
-        <w:rPr>
-          <w:rFonts w:ascii="Times New Roman" w:hAnsi="Times New Roman" w:cs="Times New Roman"/>
-          <w:color w:val="000000" w:themeColor="text1"/>
-          <w:sz w:val="26"/>
-          <w:szCs w:val="26"/>
-        </w:rPr>
-        <w:t>Ị</w:t>
-      </w:r>
-      <w:r>
-        <w:rPr>
-          <w:rFonts w:ascii="Times New Roman" w:hAnsi="Times New Roman" w:cs="Times New Roman"/>
-          <w:color w:val="000000" w:themeColor="text1"/>
-          <w:sz w:val="26"/>
-          <w:szCs w:val="26"/>
-        </w:rPr>
-        <w:t xml:space="preserve"> B</w:t>
-      </w:r>
-      <w:r>
-        <w:rPr>
-          <w:rFonts w:ascii="Times New Roman" w:hAnsi="Times New Roman" w:cs="Times New Roman"/>
-          <w:color w:val="000000" w:themeColor="text1"/>
-          <w:sz w:val="26"/>
-          <w:szCs w:val="26"/>
-        </w:rPr>
-        <w:t>Ả</w:t>
-      </w:r>
-      <w:r>
-        <w:rPr>
-          <w:rFonts w:ascii="Times New Roman" w:hAnsi="Times New Roman" w:cs="Times New Roman"/>
-          <w:color w:val="000000" w:themeColor="text1"/>
-          <w:sz w:val="26"/>
-          <w:szCs w:val="26"/>
-        </w:rPr>
-        <w:t>O V</w:t>
-      </w:r>
-      <w:r>
-        <w:rPr>
-          <w:rFonts w:ascii="Times New Roman" w:hAnsi="Times New Roman" w:cs="Times New Roman"/>
-          <w:color w:val="000000" w:themeColor="text1"/>
-          <w:sz w:val="26"/>
-          <w:szCs w:val="26"/>
-        </w:rPr>
-        <w:t>Ệ</w:t>
+        <w:t>PHỤ LỤC D. CÂU HỎI CHUẨN BỊ BẢO VỆ</w:t>
       </w:r>
       <w:bookmarkEnd w:id="56"/>
     </w:p>

</xml_diff>